<commit_message>
Update TOR Proposal Word document to use 100% verbatim TalentLibrary course titles and ObjectIDs
</commit_message>
<xml_diff>
--- a/TOR_Courseware_Proposal_TalentLibrary_TH.docx
+++ b/TOR_Courseware_Proposal_TalentLibrary_TH.docx
@@ -50,6 +50,8 @@
           <w:sz w:val="26"/>
         </w:rPr>
         <w:t>ตามข้อกำหนดขอบเขตของงาน (TOR) ข้อ 4.2 และ 4.2.1</w:t>
+        <w:br/>
+        <w:t>(ชื่อหลักสูตรตรงกับคลัง TalentLibrary 100%)</w:t>
       </w:r>
     </w:p>
     <w:p>
@@ -106,7 +108,7 @@
           <w:color w:val="334155"/>
           <w:sz w:val="22"/>
         </w:rPr>
-        <w:t>ข้อเสนอนี้จัดทำขึ้นเพื่อตอบสนองข้อกำหนดขอบเขตของงาน (TOR) ข้อ 4.2 และ 4.2.1 ในการส่งมอบสื่อการเรียนรู้ออนไลน์ภาษาไทยคุณภาพสูง (พร้อมเสียงบรรยายภาษาไทยแบบสตูดิโอ 🇹🇭) ครอบคลุมทักษะแห่งอนาคต (Future Skills) ทั้ง 4 ด้านหลัก โดยแบ่งออกเป็น 2 กลุ่มระดับผู้เรียน ได้แก่ ระดับปฏิบัติการ (C4 - C9) และระดับบริหาร (C10 - C13) โดยทุกวิชามีระยะเวลาการเรียนรู้ออกแบบเป็นชุดวิชาไม่ต่ำกว่า 1 ชั่วโมงต่อวิชา และรองรับการเชื่อมต่อกับระบบ LMS เดิมขององค์กรตามมาตรฐาน SCORM / xAPI</w:t>
+        <w:t>ข้อเสนอนี้จัดทำขึ้นเพื่อตอบสนองข้อกำหนดขอบเขตของงาน (TOR) ข้อ 4.2 และ 4.2.1 ในการส่งมอบสื่อการเรียนรู้ออนไลน์ภาษาไทยคุณภาพสูง (พร้อมเสียงบรรยายภาษาไทยแบบสตูดิโอ 🇹🇭) ครอบคลุมทักษะแห่งอนาคต (Future Skills) ทั้ง 4 ด้านหลัก โดยระบุชื่อหลักสูตรตรงตามชื่อในฐานข้อมูลคลังหลักสูตร TalentLibrary เพื่อให้ค้นหา ตรวจสอบ และเชื่อมโยงข้อมูลได้อย่างแม่นยำ 100%</w:t>
       </w:r>
     </w:p>
     <w:p>
@@ -167,7 +169,7 @@
                 <w:color w:val="FFFFFF"/>
                 <w:sz w:val="20"/>
               </w:rPr>
-              <w:t>ข้อกำหนด TOR (Section)</w:t>
+              <w:t>ข้อกำหนด TOR</w:t>
             </w:r>
           </w:p>
         </w:tc>
@@ -367,7 +369,7 @@
                 <w:color w:val="334155"/>
                 <w:sz w:val="19"/>
               </w:rPr>
-              <w:t>สื่อเรียนรู้ออนไลน์พร้อมเสียงบรรยายภาษาไทย (* 🇹🇭) พร้อมซับไทย</w:t>
+              <w:t>สื่อเรียนรู้ออนไลน์พร้อมเสียงบรรยายภาษาไทย (* 🇹🇭) ตรงตามคลังข้อมูล</w:t>
             </w:r>
           </w:p>
         </w:tc>
@@ -501,7 +503,7 @@
                 <w:color w:val="334155"/>
                 <w:sz w:val="19"/>
               </w:rPr>
-              <w:t>ครอบคลุม 4 ทักษะอนาคตครบทุกมิติ พร้อมกรณีศึกษาจริงในองค์กร</w:t>
+              <w:t>ครอบคลุม 4 ทักษะอนาคตตรงตามคลัง TalentLibrary 100%</w:t>
             </w:r>
           </w:p>
         </w:tc>
@@ -635,7 +637,7 @@
                 <w:color w:val="334155"/>
                 <w:sz w:val="19"/>
               </w:rPr>
-              <w:t>เสนอ 5 - 7 วิชาหลัก (วิชาละ 1 ชั่วโมงเต็ม พร้อมชุดบทเรียนย่อย)</w:t>
+              <w:t>เสนอ 5 วิชาหลัก (ชื่อตรงกับคลัง TalentLibrary วิชาละ 1 ชม.)</w:t>
             </w:r>
           </w:p>
         </w:tc>
@@ -668,7 +670,7 @@
                 <w:color w:val="047857"/>
                 <w:sz w:val="19"/>
               </w:rPr>
-              <w:t>✅ เกินมาตรฐาน TOR</w:t>
+              <w:t>✅ ครบถ้วน 100%</w:t>
             </w:r>
           </w:p>
         </w:tc>
@@ -769,7 +771,7 @@
                 <w:color w:val="334155"/>
                 <w:sz w:val="19"/>
               </w:rPr>
-              <w:t>เสนอ 5 - 7 วิชาหลัก (วิชาละ 1 ชั่วโมงเต็ม เน้นกลยุทธ์ผู้บริหาร)</w:t>
+              <w:t>เสนอ 5 วิชาหลัก (ชื่อตรงกับคลัง TalentLibrary วิชาละ 1 ชม.)</w:t>
             </w:r>
           </w:p>
         </w:tc>
@@ -802,7 +804,7 @@
                 <w:color w:val="047857"/>
                 <w:sz w:val="19"/>
               </w:rPr>
-              <w:t>✅ เกินมาตรฐาน TOR</w:t>
+              <w:t>✅ ครบถ้วน 100%</w:t>
             </w:r>
           </w:p>
         </w:tc>
@@ -944,11 +946,6 @@
     </w:tbl>
     <w:p>
       <w:pPr>
-        <w:spacing w:after="240"/>
-      </w:pPr>
-    </w:p>
-    <w:p>
-      <w:pPr>
         <w:spacing w:before="360" w:after="160" w:line="276" w:lineRule="auto"/>
         <w:jc w:val="left"/>
       </w:pPr>
@@ -960,23 +957,7 @@
           <w:color w:val="0284C5"/>
           <w:sz w:val="32"/>
         </w:rPr>
-        <w:t>บทที่ 2: ข้อเสนอสื่อการเรียนรู้สำหรับกลุ่มผู้เรียนระดับปฏิบัติการ (C4 - C9)</w:t>
-      </w:r>
-    </w:p>
-    <w:p>
-      <w:pPr>
-        <w:spacing w:before="0" w:after="80" w:line="276" w:lineRule="auto"/>
-        <w:jc w:val="left"/>
-      </w:pPr>
-      <w:r>
-        <w:rPr>
-          <w:rFonts w:ascii="Prompt" w:hAnsi="Prompt"/>
-          <w:b w:val="0"/>
-          <w:i/>
-          <w:color w:val="64748B"/>
-          <w:sz w:val="21"/>
-        </w:rPr>
-        <w:t>กลุ่มเป้าหมายผู้เรียน: พนักงานระดับ C4 - C9 (เจ้าหน้าที่ระดับต้นถึงกลาง, ผู้ปฏิบัติงานชำนาญงาน, ผู้ปฏิบัติงานอาวุโส, หัวหน้างานระดับต้น, ผู้เชี่ยวชาญ และผู้บริหารระดับต้นถึงสูง) มุ่งเน้นพัฒนาทักษะการปฏิบัติงาน การใช้เครื่องมือดิจิทัล AI และการวิเคราะห์แก้ปัญหาเฉพาะหน้า</w:t>
+        <w:t>บทที่ 2: รายชื่อสื่อการเรียนรู้ระดับปฏิบัติการ (C4 - C9) [ชื่อตรงคลัง 100%]</w:t>
       </w:r>
     </w:p>
     <w:p>
@@ -992,7 +973,7 @@
           <w:color w:val="0369A1"/>
           <w:sz w:val="24"/>
         </w:rPr>
-        <w:t>2.1 [OP-FS-01] การคิดวิเคราะห์เชิงวิพากษ์และแก้ไขปัญหาในยุค AI (Critical Thinking &amp; Problem Solving in AI Era)</w:t>
+        <w:t>2.1 [post#14201] การคิดเชิงวิพากษ์ในยุค AI * (Critical Thinking in the Age of AI)</w:t>
       </w:r>
     </w:p>
     <w:p>
@@ -1026,87 +1007,10 @@
           <w:color w:val="334155"/>
           <w:sz w:val="20"/>
         </w:rPr>
-        <w:t>วัตถุประสงค์: เพื่อให้ผู้ปฏิบัติงานสามารถคิดวิเคราะห์ข้อมูลอย่างมีตั้งข้อสังเกต ไม่หลงเชื่อข้อมูลเท็จจาก AI และตัดสินใจแก้ปัญหาได้อย่างแม่นยำรอบคอบ</w:t>
-      </w:r>
-    </w:p>
-    <w:p>
-      <w:pPr>
-        <w:spacing w:before="40" w:after="40" w:line="276" w:lineRule="auto"/>
-        <w:jc w:val="left"/>
-      </w:pPr>
-      <w:r>
-        <w:rPr>
-          <w:rFonts w:ascii="Prompt" w:hAnsi="Prompt"/>
-          <w:b/>
-          <w:i w:val="0"/>
-          <w:color w:val="334155"/>
-          <w:sz w:val="20"/>
-        </w:rPr>
-        <w:t>โครงสร้างเนื้อหาบทเรียน (1 ชั่วโมง):</w:t>
-      </w:r>
-    </w:p>
-    <w:p>
-      <w:pPr>
-        <w:spacing w:before="0" w:after="40" w:line="276" w:lineRule="auto"/>
-        <w:jc w:val="left"/>
-      </w:pPr>
-      <w:r>
-        <w:rPr>
-          <w:rFonts w:ascii="Prompt" w:hAnsi="Prompt"/>
-          <w:b w:val="0"/>
-          <w:i w:val="0"/>
-          <w:color w:val="334155"/>
-          <w:sz w:val="19"/>
-        </w:rPr>
-        <w:t xml:space="preserve">   - 1. ความสำคัญของการคิดเชิงวิพากษ์ในยุคปัญญาประดิษฐ์ (15 นาที)</w:t>
-      </w:r>
-    </w:p>
-    <w:p>
-      <w:pPr>
-        <w:spacing w:before="0" w:after="40" w:line="276" w:lineRule="auto"/>
-        <w:jc w:val="left"/>
-      </w:pPr>
-      <w:r>
-        <w:rPr>
-          <w:rFonts w:ascii="Prompt" w:hAnsi="Prompt"/>
-          <w:b w:val="0"/>
-          <w:i w:val="0"/>
-          <w:color w:val="334155"/>
-          <w:sz w:val="19"/>
-        </w:rPr>
-        <w:t xml:space="preserve">   - 2. การตั้งคำถามและการตรวจสอบความถูกต้องของข้อมูล Data Verification (15 นาที)</w:t>
-      </w:r>
-    </w:p>
-    <w:p>
-      <w:pPr>
-        <w:spacing w:before="0" w:after="40" w:line="276" w:lineRule="auto"/>
-        <w:jc w:val="left"/>
-      </w:pPr>
-      <w:r>
-        <w:rPr>
-          <w:rFonts w:ascii="Prompt" w:hAnsi="Prompt"/>
-          <w:b w:val="0"/>
-          <w:i w:val="0"/>
-          <w:color w:val="334155"/>
-          <w:sz w:val="19"/>
-        </w:rPr>
-        <w:t xml:space="preserve">   - 3. เทคนิคการแก้ปัญหาซับซ้อนในกระบวนการทำงานประจำวัน (15 นาที)</w:t>
-      </w:r>
-    </w:p>
-    <w:p>
-      <w:pPr>
-        <w:spacing w:before="0" w:after="40" w:line="276" w:lineRule="auto"/>
-        <w:jc w:val="left"/>
-      </w:pPr>
-      <w:r>
-        <w:rPr>
-          <w:rFonts w:ascii="Prompt" w:hAnsi="Prompt"/>
-          <w:b w:val="0"/>
-          <w:i w:val="0"/>
-          <w:color w:val="334155"/>
-          <w:sz w:val="19"/>
-        </w:rPr>
-        <w:t xml:space="preserve">   - 4. กรณีศึกษาการตัดสินใจอย่างรอบคอบและการประเมินผลลัพธ์ (15 นาที)</w:t>
+        <w:t>ภาพรวมเนื้อหา: เครื่องมือ AI สามารถช่วยเพิ่มประสิทธิภาพในการทำงานและจัดการงานที่ซ้ำซากจำเจได้อย่างมีนัยสำคัญ ช่วยให้พนักงานมีเวลาไปโฟกัสกับงานที่ต้องใช้ความคิดสร้างสรรค์มากขึ้น อย่างไรก็ตาม การปล่อยให้ AI ทำงานโดยปราศจากการควบคุมดูแลของมนุษย์อาจนำไปสู่ข้อมูลที่ไม่ถูกต้องและการตัดสินใจที่ผิดพลาดได้</w:t>
+        <w:br/>
+        <w:br/>
+        <w:t>เพื่อใช้ประโยชน์จากเครื่องมือ AI ให้ได้สูงสุด พนักงานจำเป็นต้องประเมินเนื้อหาที่สร้างด้วย AI อย่างมีวิจารณญาณ เนื่องจาก AI อาจประมวลผลจากข้อมูลที่มีคุณภาพต่ำ ซึ่งส่งผลให้เนื้อหาคลาดเคลื่อน มีอคติ หรือสร้างทัศนคติแบบเหมารวมที่เป็นอันตราย หลักสูตรนี้จะฝึกอบรมทีมงานเกี่ยวกับเทคนิคการตั้งคำถามเชิงวิเคราะห์ เช่น การตรวจสอบแหล่งที่มาของข้อมูล และส่งเสริมให้พนักงานใช้ดุลยพินิจของตนเองเพื่อตัดสินใจนำ AI มาประยุกต์ใช้ในองค์กรได้อย่างชาญฉลาดและปลอดภัยยิ่งขึ้น</w:t>
       </w:r>
     </w:p>
     <w:p>
@@ -1122,7 +1026,7 @@
           <w:color w:val="0369A1"/>
           <w:sz w:val="24"/>
         </w:rPr>
-        <w:t>2.2 [OP-FS-02] การวิเคราะห์ข้อมูลเชิงคุณภาพและเชิงปริมาณเพื่อการปฏิบัติงาน (Qualitative &amp; Quantitative Data Analysis)</w:t>
+        <w:t>2.2 [post#9044] การวิเคราะห์ข้อมูลเชิงคุณภาพและเชิงปริมาณ * (Qualitative &amp; Quantitative Data Analysis)</w:t>
       </w:r>
     </w:p>
     <w:p>
@@ -1156,87 +1060,10 @@
           <w:color w:val="334155"/>
           <w:sz w:val="20"/>
         </w:rPr>
-        <w:t>วัตถุประสงค์: เสริมสร้างทักษะการรวบรวม จำแนก และวิเคราะห์ข้อมูลทั้งที่เป็นตัวเลขและข้อความ เพื่อนำมาปรับปรุงกระบวนการทำงานและสรุปรายงานให้มีประสิทธิภาพ</w:t>
-      </w:r>
-    </w:p>
-    <w:p>
-      <w:pPr>
-        <w:spacing w:before="40" w:after="40" w:line="276" w:lineRule="auto"/>
-        <w:jc w:val="left"/>
-      </w:pPr>
-      <w:r>
-        <w:rPr>
-          <w:rFonts w:ascii="Prompt" w:hAnsi="Prompt"/>
-          <w:b/>
-          <w:i w:val="0"/>
-          <w:color w:val="334155"/>
-          <w:sz w:val="20"/>
-        </w:rPr>
-        <w:t>โครงสร้างเนื้อหาบทเรียน (1 ชั่วโมง):</w:t>
-      </w:r>
-    </w:p>
-    <w:p>
-      <w:pPr>
-        <w:spacing w:before="0" w:after="40" w:line="276" w:lineRule="auto"/>
-        <w:jc w:val="left"/>
-      </w:pPr>
-      <w:r>
-        <w:rPr>
-          <w:rFonts w:ascii="Prompt" w:hAnsi="Prompt"/>
-          <w:b w:val="0"/>
-          <w:i w:val="0"/>
-          <w:color w:val="334155"/>
-          <w:sz w:val="19"/>
-        </w:rPr>
-        <w:t xml:space="preserve">   - 1. ความแตกต่างและการประยุกต์ใช้ข้อมูลเชิงคุณภาพและเชิงปริมาณ (15 นาที)</w:t>
-      </w:r>
-    </w:p>
-    <w:p>
-      <w:pPr>
-        <w:spacing w:before="0" w:after="40" w:line="276" w:lineRule="auto"/>
-        <w:jc w:val="left"/>
-      </w:pPr>
-      <w:r>
-        <w:rPr>
-          <w:rFonts w:ascii="Prompt" w:hAnsi="Prompt"/>
-          <w:b w:val="0"/>
-          <w:i w:val="0"/>
-          <w:color w:val="334155"/>
-          <w:sz w:val="19"/>
-        </w:rPr>
-        <w:t xml:space="preserve">   - 2. เครื่องมือการจัดเก็บและสรุปผลข้อมูลสำหรับการปฏิบัติงาน (15 นาที)</w:t>
-      </w:r>
-    </w:p>
-    <w:p>
-      <w:pPr>
-        <w:spacing w:before="0" w:after="40" w:line="276" w:lineRule="auto"/>
-        <w:jc w:val="left"/>
-      </w:pPr>
-      <w:r>
-        <w:rPr>
-          <w:rFonts w:ascii="Prompt" w:hAnsi="Prompt"/>
-          <w:b w:val="0"/>
-          <w:i w:val="0"/>
-          <w:color w:val="334155"/>
-          <w:sz w:val="19"/>
-        </w:rPr>
-        <w:t xml:space="preserve">   - 3. การแปลงข้อมูลเป็นข้อสรุปเพื่อการรายงานและการตัดสินใจ (15 นาที)</w:t>
-      </w:r>
-    </w:p>
-    <w:p>
-      <w:pPr>
-        <w:spacing w:before="0" w:after="40" w:line="276" w:lineRule="auto"/>
-        <w:jc w:val="left"/>
-      </w:pPr>
-      <w:r>
-        <w:rPr>
-          <w:rFonts w:ascii="Prompt" w:hAnsi="Prompt"/>
-          <w:b w:val="0"/>
-          <w:i w:val="0"/>
-          <w:color w:val="334155"/>
-          <w:sz w:val="19"/>
-        </w:rPr>
-        <w:t xml:space="preserve">   - 4. การนำเสนอข้อมูล (Data Storytelling) สำหรับระดับปฏิบัติการ (15 นาที)</w:t>
+        <w:t>ภาพรวมเนื้อหา: ข้อมูลเป็นสิ่งสำคัญและเป็นรากฐานของเกือบทุกสิ่ง ตั้งแต่วิทยาศาสตร์ เทคโนโลยี ไปจนถึงการดำเนินธุรกิจ ข้อมูลมีอยู่ทุกหนทุกแห่ง แต่การวิเคราะห์ข้อมูลอาจดูเป็นเรื่องยากหากคุณไม่รู้ว่าจะเริ่มต้นจากตรงไหน ทว่าการวิเคราะห์ข้อมูลนั้นมีความสำคัญไม่แพ้การมีข้อมูลอยู่กับตัว เพราะจะมีประโยชน์อะไรหากเรามีข้อมูลแต่กลับไม่รู้ว่าจะนำไปใช้ทำอะไรต่อ?</w:t>
+        <w:br/>
+        <w:br/>
+        <w:t>เมื่อต้องทำงานกับข้อมูล สิ่งสำคัญคือการรู้ว่าคุณสามารถวิเคราะห์ข้อมูลในรูปแบบใดได้บ้าง และวิธีใดที่จะช่วยให้คุณได้คำตอบที่ต้องการอย่างแท้จริง การเข้าใจความแตกต่างระหว่างข้อมูลเชิงคุณภาพและเชิงปริมาณจึงเป็นจุดเริ่มต้นที่ดี เนื่องจากข้อมูลทั้งสองประเภทต่างมีประโยชน์และแนวทางการใช้งานที่เฉพาะตัว หลักสูตรนี้จะช่วยให้ทีมงานของคุณเข้าใจภาพรวมของความแตกต่างระหว่างการวิเคราะห์ข้อมูลเชิงคุณภาพและเชิงปริมาณ รวมถึงเข้าใจว่าควรเลือกใช้ข้อมูลแต่ละประเภทในสถานการณ์ใดจึงจะเกิดประโยชน์สูงสุด</w:t>
       </w:r>
     </w:p>
     <w:p>
@@ -1252,7 +1079,7 @@
           <w:color w:val="0369A1"/>
           <w:sz w:val="24"/>
         </w:rPr>
-        <w:t>2.3 [OP-FS-03] การประยุกต์ใช้ AI &amp; ChatGPT เพื่อเพิ่มประสิทธิภาพการทำงาน (ChatGPT &amp; Generative AI Integration)</w:t>
+        <w:t>2.3 [post#12159] ChatGPT: การพัฒนาตนเองและการเติบโตในสายอาชีพ * (ChatGPT: Personal Development and Growing Your Career)</w:t>
       </w:r>
     </w:p>
     <w:p>
@@ -1286,87 +1113,7 @@
           <w:color w:val="334155"/>
           <w:sz w:val="20"/>
         </w:rPr>
-        <w:t>วัตถุประสงค์: เพื่อให้ผู้ปฏิบัติงานสามารถนำเครื่องมือ Generative AI เช่น ChatGPT มาช่วยลดเวลาการทำงาน ร่างเอกสาร สรุปรายงาน และสร้างสรรค์งานอย่างมีจริยธรรม</w:t>
-      </w:r>
-    </w:p>
-    <w:p>
-      <w:pPr>
-        <w:spacing w:before="40" w:after="40" w:line="276" w:lineRule="auto"/>
-        <w:jc w:val="left"/>
-      </w:pPr>
-      <w:r>
-        <w:rPr>
-          <w:rFonts w:ascii="Prompt" w:hAnsi="Prompt"/>
-          <w:b/>
-          <w:i w:val="0"/>
-          <w:color w:val="334155"/>
-          <w:sz w:val="20"/>
-        </w:rPr>
-        <w:t>โครงสร้างเนื้อหาบทเรียน (1 ชั่วโมง):</w:t>
-      </w:r>
-    </w:p>
-    <w:p>
-      <w:pPr>
-        <w:spacing w:before="0" w:after="40" w:line="276" w:lineRule="auto"/>
-        <w:jc w:val="left"/>
-      </w:pPr>
-      <w:r>
-        <w:rPr>
-          <w:rFonts w:ascii="Prompt" w:hAnsi="Prompt"/>
-          <w:b w:val="0"/>
-          <w:i w:val="0"/>
-          <w:color w:val="334155"/>
-          <w:sz w:val="19"/>
-        </w:rPr>
-        <w:t xml:space="preserve">   - 1. พื้นฐานและการเขียนคำสั่ง Prompt Engineering อย่างมีประสิทธิภาพ (15 นาที)</w:t>
-      </w:r>
-    </w:p>
-    <w:p>
-      <w:pPr>
-        <w:spacing w:before="0" w:after="40" w:line="276" w:lineRule="auto"/>
-        <w:jc w:val="left"/>
-      </w:pPr>
-      <w:r>
-        <w:rPr>
-          <w:rFonts w:ascii="Prompt" w:hAnsi="Prompt"/>
-          <w:b w:val="0"/>
-          <w:i w:val="0"/>
-          <w:color w:val="334155"/>
-          <w:sz w:val="19"/>
-        </w:rPr>
-        <w:t xml:space="preserve">   - 2. การใช้ ChatGPT ช่วยร่างเอกสาร วิเคราะห์สรุปรายงาน และวางแผนงาน (15 นาที)</w:t>
-      </w:r>
-    </w:p>
-    <w:p>
-      <w:pPr>
-        <w:spacing w:before="0" w:after="40" w:line="276" w:lineRule="auto"/>
-        <w:jc w:val="left"/>
-      </w:pPr>
-      <w:r>
-        <w:rPr>
-          <w:rFonts w:ascii="Prompt" w:hAnsi="Prompt"/>
-          <w:b w:val="0"/>
-          <w:i w:val="0"/>
-          <w:color w:val="334155"/>
-          <w:sz w:val="19"/>
-        </w:rPr>
-        <w:t xml:space="preserve">   - 3. จริยธรรมและความปลอดภัยในการใช้งาน AI ในองค์กร (15 นาที)</w:t>
-      </w:r>
-    </w:p>
-    <w:p>
-      <w:pPr>
-        <w:spacing w:before="0" w:after="40" w:line="276" w:lineRule="auto"/>
-        <w:jc w:val="left"/>
-      </w:pPr>
-      <w:r>
-        <w:rPr>
-          <w:rFonts w:ascii="Prompt" w:hAnsi="Prompt"/>
-          <w:b w:val="0"/>
-          <w:i w:val="0"/>
-          <w:color w:val="334155"/>
-          <w:sz w:val="19"/>
-        </w:rPr>
-        <w:t xml:space="preserve">   - 4. เวิร์กโฟลว์การทำงานร่วมกับ AI เพื่อผลลัพธ์ที่รวดเร็วขึ้น 3 เท่า (15 นาที)</w:t>
+        <w:t>ภาพรวมเนื้อหา: การส่งเสริมให้พนักงานดึงศักยภาพสูงสุดของตนเองออกมา ทั้งในด้านการทำงานและชีวิตส่วนตัวนั้นต้องอาศัยความพยายามอย่างมาก แต่นั่นไม่ได้หมายความว่าพวกเขาจะไม่สามารถใช้เทคโนโลยีเพื่อช่วยให้การพัฒนาตนเองในบางด้านง่ายขึ้นได้ ChatGPT เป็นเครื่องมือที่ยอดเยี่ยมที่จะช่วยให้พวกเขาอยู่ในจุดที่ได้เปรียบยิ่งขึ้นเมื่อมองหาโอกาสทางอาชีพใหม่ๆ รวมถึงช่วยสนับสนุนการพัฒนาตนเองในด้านต่างๆ หลักสูตรนี้จะช่วยให้พนักงานของคุณสามารถใช้ ChatGPT เพื่ออัปเดตเรซูเมและโปรไฟล์ LinkedIn รวมถึงสร้างจดหมายนำสมัครงาน (Cover Letter) ได้อย่างมีประสิทธิภาพ นอกจากนี้ ยังช่วยให้พวกเขาใช้ ChatGPT ในการเตรียมตัวสัมภาษณ์งานและพัฒนาทักษะส่วนบุคคล ซึ่งครอบคลุมถึงการตั้งเป้าหมายและการติดตามผล ความฉลาดทางอารมณ์ และการบริหารเวลา โดยวิดีโอแต่ละตอนจะเน้นเฉพาะเจาะจงในแต่ละหัวข้อ เพื่อให้พนักงานสามารถเลือกเรียนรู้สิ่งที่ต้องการได้ตามความเร็วและจังหวะที่ตนเองสะดวก</w:t>
       </w:r>
     </w:p>
     <w:p>
@@ -1382,7 +1129,7 @@
           <w:color w:val="0369A1"/>
           <w:sz w:val="24"/>
         </w:rPr>
-        <w:t>2.4 [OP-FS-04] การใช้ข้อมูลเพื่อพัฒนาการให้บริการและการตัดสินใจ (Data-Driven Customer Experience &amp; Operations)</w:t>
+        <w:t>2.4 [post#10895] การใช้ข้อมูลในการบริการลูกค้า * (Using Data in Customer Service)</w:t>
       </w:r>
     </w:p>
     <w:p>
@@ -1416,87 +1163,10 @@
           <w:color w:val="334155"/>
           <w:sz w:val="20"/>
         </w:rPr>
-        <w:t>วัตถุประสงค์: มุ่งเน้นการนำข้อมูลพฤติกรรมผู้รับบริการ/ลูกค้ามาใช้ในการปรับปรุงขั้นตอนการทำงาน วิเคราะห์ข้อผิดพลาด และตัดสินใจแก้ปัญหาเฉพาะหน้าได้อย่างตรงจุด</w:t>
-      </w:r>
-    </w:p>
-    <w:p>
-      <w:pPr>
-        <w:spacing w:before="40" w:after="40" w:line="276" w:lineRule="auto"/>
-        <w:jc w:val="left"/>
-      </w:pPr>
-      <w:r>
-        <w:rPr>
-          <w:rFonts w:ascii="Prompt" w:hAnsi="Prompt"/>
-          <w:b/>
-          <w:i w:val="0"/>
-          <w:color w:val="334155"/>
-          <w:sz w:val="20"/>
-        </w:rPr>
-        <w:t>โครงสร้างเนื้อหาบทเรียน (1 ชั่วโมง):</w:t>
-      </w:r>
-    </w:p>
-    <w:p>
-      <w:pPr>
-        <w:spacing w:before="0" w:after="40" w:line="276" w:lineRule="auto"/>
-        <w:jc w:val="left"/>
-      </w:pPr>
-      <w:r>
-        <w:rPr>
-          <w:rFonts w:ascii="Prompt" w:hAnsi="Prompt"/>
-          <w:b w:val="0"/>
-          <w:i w:val="0"/>
-          <w:color w:val="334155"/>
-          <w:sz w:val="19"/>
-        </w:rPr>
-        <w:t xml:space="preserve">   - 1. การเก็บรวบรวมข้อมูลป้อนกลับ (Feedback Data) จากผู้ใช้บริการ (15 นาที)</w:t>
-      </w:r>
-    </w:p>
-    <w:p>
-      <w:pPr>
-        <w:spacing w:before="0" w:after="40" w:line="276" w:lineRule="auto"/>
-        <w:jc w:val="left"/>
-      </w:pPr>
-      <w:r>
-        <w:rPr>
-          <w:rFonts w:ascii="Prompt" w:hAnsi="Prompt"/>
-          <w:b w:val="0"/>
-          <w:i w:val="0"/>
-          <w:color w:val="334155"/>
-          <w:sz w:val="19"/>
-        </w:rPr>
-        <w:t xml:space="preserve">   - 2. การวิเคราะห์จุดคอขวดและโอกาสในการปรับปรุงบริการด้วยข้อมูล (15 นาที)</w:t>
-      </w:r>
-    </w:p>
-    <w:p>
-      <w:pPr>
-        <w:spacing w:before="0" w:after="40" w:line="276" w:lineRule="auto"/>
-        <w:jc w:val="left"/>
-      </w:pPr>
-      <w:r>
-        <w:rPr>
-          <w:rFonts w:ascii="Prompt" w:hAnsi="Prompt"/>
-          <w:b w:val="0"/>
-          <w:i w:val="0"/>
-          <w:color w:val="334155"/>
-          <w:sz w:val="19"/>
-        </w:rPr>
-        <w:t xml:space="preserve">   - 3. การตั้งเป้าหมายและการติดตามผลการทำงานด้วย KPI ตัวเลข (15 นาที)</w:t>
-      </w:r>
-    </w:p>
-    <w:p>
-      <w:pPr>
-        <w:spacing w:before="0" w:after="40" w:line="276" w:lineRule="auto"/>
-        <w:jc w:val="left"/>
-      </w:pPr>
-      <w:r>
-        <w:rPr>
-          <w:rFonts w:ascii="Prompt" w:hAnsi="Prompt"/>
-          <w:b w:val="0"/>
-          <w:i w:val="0"/>
-          <w:color w:val="334155"/>
-          <w:sz w:val="19"/>
-        </w:rPr>
-        <w:t xml:space="preserve">   - 4. การตัดสินใจแก้ปัญหาเฉพาะหน้าโดยอิงฐานข้อมูลจริง (15 นาที)</w:t>
+        <w:t>ภาพรวมเนื้อหา: การเก็บรวบรวมข้อมูลลูกค้าถือเป็นเรื่องปกติทั่วไปในปัจจุบัน ข้อมูลเหล่านี้มีประโยชน์ในการช่วยให้ผู้จัดการฝ่ายบริการลูกค้าเข้าใจกลุ่มลูกค้า ความต้องการของพวกเขา และแนวทางในการปรับปรุงพัฒนาให้ดียิ่งขึ้น ทว่าด้วยข้อมูลจำนวนมหาศาลที่ต้องนำมาวิเคราะห์ การตีความข้อมูลจึงอาจดูเป็นเรื่องที่น่าหนักใจ แล้วพวกเขาควรจะเริ่มต้นจากตรงไหนดี?</w:t>
+        <w:br/>
+        <w:br/>
+        <w:t>การใช้ข้อมูลในงานบริการลูกค้าเป็นสิ่งสำคัญอย่างยิ่ง ข้อมูลนี้ไม่เพียงแต่จะเป็นประโยชน์ต่อทีมบริการลูกค้าเท่านั้น แต่ยังสามารถนำไปใช้ในการปรับปรุงกลยุทธ์และขับเคลื่อนการเติบโตของทั้งองค์กรได้อีกด้วย และผู้จัดการของคุณสามารถปฏิบัติตามแนวทางปฏิบัติที่ดีที่สุดเพื่อใช้ประโยชน์จากข้อมูลให้ได้สูงสุด ซึ่งหลักสูตรนี้จะแสดงให้พวกเขาเห็นว่าต้องทำอย่างไร</w:t>
       </w:r>
     </w:p>
     <w:p>
@@ -1512,7 +1182,290 @@
           <w:color w:val="0369A1"/>
           <w:sz w:val="24"/>
         </w:rPr>
-        <w:t>2.5 [OP-FS-05] การสังเกตและคิดวิเคราะห์อย่างมีตรรกะเพื่อสร้างโอกาสใหม่ (Critical Observation &amp; Logical Thinking)</w:t>
+        <w:t>2.5 [post#13187] การแก้ปัญหาที่ซับซ้อน: เทคนิคการแก้ปัญหา * (Complex Problem-Solving: Problem-Solving Techniques)</w:t>
+      </w:r>
+    </w:p>
+    <w:p>
+      <w:pPr>
+        <w:spacing w:before="0" w:after="80" w:line="276" w:lineRule="auto"/>
+        <w:jc w:val="left"/>
+      </w:pPr>
+      <w:r>
+        <w:rPr>
+          <w:rFonts w:ascii="Prompt" w:hAnsi="Prompt"/>
+          <w:b/>
+          <w:i w:val="0"/>
+          <w:color w:val="047857"/>
+          <w:sz w:val="20"/>
+        </w:rPr>
+        <w:t>• สอดคล้องทักษะ: การตัดสินใจอย่างรอบคอบ &amp; การมองหาโอกาสและสร้างความแตกต่าง</w:t>
+        <w:br/>
+        <w:t>• ระยะเวลาเรียน: 1 ชั่วโมง (4 บทเรียนย่อย) | ภาษา: เสียงบรรยายภาษาไทย 🇹🇭</w:t>
+      </w:r>
+    </w:p>
+    <w:p>
+      <w:pPr>
+        <w:spacing w:before="0" w:after="80" w:line="276" w:lineRule="auto"/>
+        <w:jc w:val="left"/>
+      </w:pPr>
+      <w:r>
+        <w:rPr>
+          <w:rFonts w:ascii="Prompt" w:hAnsi="Prompt"/>
+          <w:b w:val="0"/>
+          <w:i w:val="0"/>
+          <w:color w:val="334155"/>
+          <w:sz w:val="20"/>
+        </w:rPr>
+        <w:t>ภาพรวมเนื้อหา: ผู้บริหารระดับสูงขององค์กรคุณพร้อมที่จะรับมือกับความท้าทายในการทำงานในอนาคตแล้วหรือยัง? โลกธุรกิจเต็มไปด้วยความผันผวนและการเปลี่ยนแปลงที่คาดเดาไม่ได้ ดังนั้น การแก้ไขปัญหาอย่างรวดเร็วและสร้างสรรค์จึงเป็นสิ่งสำคัญอย่างยิ่ง ในสภาพแวดล้อมปัจจุบันที่ซับซ้อนและเปลี่ยนแปลงอย่างรวดเร็ว การมีแนวทางแก้ไขปัญหาที่มีประสิทธิภาพคือกุญแจสำคัญในการรักษาความได้เปรียบทางการแข่งขัน และเมื่อความท้าทายมีความซับซ้อนยิ่งขึ้น วิธีการแบบเดิมๆ ก็อาจใช้ไม่ได้ผลอีกต่อไป การฝึกฝนเทคนิคต่างๆ ให้เชี่ยวชาญ เช่น การสร้างสรรค์ไอเดีย (Idea Generation) การจัดทำแผนผังความคิด (Mind Mapping) การใช้เหตุผล (Reasoning) การคิดแบบแตกแขนง (Divergent Thinking) การทำสตอรี่บอร์ด (Storyboarding) การคิดย้อนกลับ (Reverse Thinking) และเครื่องมือ SCAMPER จะช่วยให้พวกเขาสามารถพัฒนาแนวทางแก้ไขปัญหาที่สร้างสรรค์เพื่อขับเคลื่อนธุรกิจให้เติบโตได้</w:t>
+        <w:br/>
+        <w:br/>
+        <w:t>หลักสูตรนี้จะสอนเทคนิคการแก้ปัญหาที่นำไปใช้ได้จริง ซึ่งจะช่วยให้ผู้บริหารและทีมงานค้นพบแนวทางแก้ไขที่ชาญฉลาดและวางแผนล่วงหน้าได้อย่างมีประสิทธิภาพ ตั้งแต่การระดมความคิดไปจนถึงการคิดในมุมมองใหม่ๆ วิธีการเหล่านี้จะช่วยให้พวกเขารับมือกับทุกปัญหาได้อย่างมั่นใจ</w:t>
+      </w:r>
+    </w:p>
+    <w:p>
+      <w:r>
+        <w:br w:type="page"/>
+      </w:r>
+    </w:p>
+    <w:p>
+      <w:pPr>
+        <w:spacing w:before="360" w:after="160" w:line="276" w:lineRule="auto"/>
+        <w:jc w:val="left"/>
+      </w:pPr>
+      <w:r>
+        <w:rPr>
+          <w:rFonts w:ascii="Prompt" w:hAnsi="Prompt"/>
+          <w:b/>
+          <w:i w:val="0"/>
+          <w:color w:val="0284C5"/>
+          <w:sz w:val="32"/>
+        </w:rPr>
+        <w:t>บทที่ 3: รายชื่อสื่อการเรียนรู้ระดับบริหาร (C10 - C13) [ชื่อตรงคลัง 100%]</w:t>
+      </w:r>
+    </w:p>
+    <w:p>
+      <w:pPr>
+        <w:spacing w:before="200" w:after="80" w:line="276" w:lineRule="auto"/>
+        <w:jc w:val="left"/>
+      </w:pPr>
+      <w:r>
+        <w:rPr>
+          <w:rFonts w:ascii="Prompt" w:hAnsi="Prompt"/>
+          <w:b/>
+          <w:i w:val="0"/>
+          <w:color w:val="0369A1"/>
+          <w:sz w:val="24"/>
+        </w:rPr>
+        <w:t>3.1 [post#14195] ความรอบรู้ด้าน AI สำหรับผู้นำ * (AI Literacy for Leaders)</w:t>
+      </w:r>
+    </w:p>
+    <w:p>
+      <w:pPr>
+        <w:spacing w:before="0" w:after="80" w:line="276" w:lineRule="auto"/>
+        <w:jc w:val="left"/>
+      </w:pPr>
+      <w:r>
+        <w:rPr>
+          <w:rFonts w:ascii="Prompt" w:hAnsi="Prompt"/>
+          <w:b/>
+          <w:i w:val="0"/>
+          <w:color w:val="047857"/>
+          <w:sz w:val="20"/>
+        </w:rPr>
+        <w:t>• สอดคล้องทักษะ: การบูรณาการทำงานด้วยเทคโนโลยีดิจิทัล &amp; การมองหาโอกาสและสร้างความแตกต่าง</w:t>
+        <w:br/>
+        <w:t>• ระยะเวลาเรียน: 1 ชั่วโมง (4 บทเรียนย่อย) | ภาษา: เสียงบรรยายภาษาไทย 🇹🇭</w:t>
+      </w:r>
+    </w:p>
+    <w:p>
+      <w:pPr>
+        <w:spacing w:before="0" w:after="80" w:line="276" w:lineRule="auto"/>
+        <w:jc w:val="left"/>
+      </w:pPr>
+      <w:r>
+        <w:rPr>
+          <w:rFonts w:ascii="Prompt" w:hAnsi="Prompt"/>
+          <w:b w:val="0"/>
+          <w:i w:val="0"/>
+          <w:color w:val="334155"/>
+          <w:sz w:val="20"/>
+        </w:rPr>
+        <w:t>ภาพรวมเนื้อหา: ผู้นำต้องเผชิญกับการตัดสินใจที่ท้าทายในทุกๆ วัน รวมถึงการตัดสินใจเลือกนำ AI มาใช้ในองค์กร ปัจจุบันมีโมเดล AI จำนวนมากจนน่าสับสนให้เลือกสรร และยังสามารถนำไปประยุกต์ใช้กับธุรกิจได้หลากหลายรูปแบบ ด้วยความที่เป็นเทคโนโลยีใหม่ ผู้บริหารอาจรู้สึกขาดความมั่นใจในการตัดสินใจเกี่ยวกับ AI อย่างรอบด้านและมีความรับผิดชอบ</w:t>
+        <w:br/>
+        <w:br/>
+        <w:t>ข่าวดีก็คือ เราสามารถนำเคล็ดลับและกรอบการทำงานต่างๆ มาปรับใช้เพื่อประเมินและนำ AI ไปปฏิบัติจริงได้อย่างมีประสิทธิภาพ หากใช้งานอย่างเหมาะสม AI จะช่วยเพิ่มขีดความสามารถในการทำงานขององค์กรและยกระดับประสบการณ์ของลูกค้าได้ อย่างไรก็ตาม AI ก็อาจมีค่าใช้จ่ายที่สูงและมีประเด็นด้านคุณภาพของข้อมูล รวมถึงความเสี่ยงต่างๆ เช่น การรั่วไหลของข้อมูลและการปฏิบัติตามข้อกำหนด หลักสูตรนี้จะช่วยให้คุณประเมินการนำ AI มาใช้ได้อย่างรอบคอบ และมั่นใจได้ว่าทุกคนในองค์กรจะใช้งานเทคโนโลยีนี้อย่างมีความรับผิดชอบ</w:t>
+      </w:r>
+    </w:p>
+    <w:p>
+      <w:pPr>
+        <w:spacing w:before="200" w:after="80" w:line="276" w:lineRule="auto"/>
+        <w:jc w:val="left"/>
+      </w:pPr>
+      <w:r>
+        <w:rPr>
+          <w:rFonts w:ascii="Prompt" w:hAnsi="Prompt"/>
+          <w:b/>
+          <w:i w:val="0"/>
+          <w:color w:val="0369A1"/>
+          <w:sz w:val="24"/>
+        </w:rPr>
+        <w:t>3.2 [post#13156] การแก้ปัญหาที่ซับซ้อน: การวางแผนและการวิเคราะห์สถานการณ์จำลอง * (Complex Problem-Solving: Scenario Planning and Analysis)</w:t>
+      </w:r>
+    </w:p>
+    <w:p>
+      <w:pPr>
+        <w:spacing w:before="0" w:after="80" w:line="276" w:lineRule="auto"/>
+        <w:jc w:val="left"/>
+      </w:pPr>
+      <w:r>
+        <w:rPr>
+          <w:rFonts w:ascii="Prompt" w:hAnsi="Prompt"/>
+          <w:b/>
+          <w:i w:val="0"/>
+          <w:color w:val="047857"/>
+          <w:sz w:val="20"/>
+        </w:rPr>
+        <w:t>• สอดคล้องทักษะ: การตัดสินใจอย่างรอบคอบ &amp; บริหารงานด้วยข้อมูล</w:t>
+        <w:br/>
+        <w:t>• ระยะเวลาเรียน: 1 ชั่วโมง (4 บทเรียนย่อย) | ภาษา: เสียงบรรยายภาษาไทย 🇹🇭</w:t>
+      </w:r>
+    </w:p>
+    <w:p>
+      <w:pPr>
+        <w:spacing w:before="0" w:after="80" w:line="276" w:lineRule="auto"/>
+        <w:jc w:val="left"/>
+      </w:pPr>
+      <w:r>
+        <w:rPr>
+          <w:rFonts w:ascii="Prompt" w:hAnsi="Prompt"/>
+          <w:b w:val="0"/>
+          <w:i w:val="0"/>
+          <w:color w:val="334155"/>
+          <w:sz w:val="20"/>
+        </w:rPr>
+        <w:t>ภาพรวมเนื้อหา: แม้ว่าผู้จัดการและทีมงานของคุณอาจกำลังดำเนินงานไปในทิศทางที่ถูกต้องในปัจจุบัน แต่พวกเขาตระหนักถึงปัจจัยภายนอกที่อาจส่งผลกระทบในอนาคตแล้วหรือยัง? โลกธุรกิจในปัจจุบันเต็มไปด้วยความไม่แน่นอนและความซับซ้อน ด้วยเทคโนโลยีที่พัฒนาอย่างไม่หยุดยั้ง การเติบโตอย่างก้าวกระโดดของปัญญาประดิษฐ์ (AI) และกฎหมายที่เปลี่ยนแปลงอยู่เสมอ พวกเขาจึงต้องหากลยุทธ์ในการวางแผนล่วงหน้าเพื่อไม่ให้ตกเป็นฝ่ายตั้งรับเมื่อเกิดการเปลี่ยนแปลงกะทันหัน การวางแผนและการวิเคราะห์สถานการณ์จำลองสามารถช่วยให้พวกเขามองเห็นภาพอนาคตในรูปแบบต่าง ๆ และตัดสินใจได้ดียิ่งขึ้น การสร้างสถานการณ์จำลองที่สมจริงจะช่วยให้พวกเขารับมือกับความไม่แน่นอนได้ โดยการสำรวจผลลัพธ์ในรูปแบบต่าง ๆ ซึ่งจะช่วยส่งเสริมการคิดเชิงกลยุทธ์และการตัดสินใจ การคาดการณ์ปัญหาล่วงหน้าโดยการระบุปัจจัยสำคัญและวิเคราะห์ผลกระทบ จะช่วยให้พวกเขาสามารถวางแผนสำหรับอนาคตได้อย่างมีประสิทธิภาพ</w:t>
+      </w:r>
+    </w:p>
+    <w:p>
+      <w:pPr>
+        <w:spacing w:before="200" w:after="80" w:line="276" w:lineRule="auto"/>
+        <w:jc w:val="left"/>
+      </w:pPr>
+      <w:r>
+        <w:rPr>
+          <w:rFonts w:ascii="Prompt" w:hAnsi="Prompt"/>
+          <w:b/>
+          <w:i w:val="0"/>
+          <w:color w:val="0369A1"/>
+          <w:sz w:val="24"/>
+        </w:rPr>
+        <w:t>3.3 [post#1800] กลยุทธ์การเปลี่ยนผ่านสู่ยุคดิจิทัลคืออะไร * (What is a Digital Transformation Strategy?)</w:t>
+      </w:r>
+    </w:p>
+    <w:p>
+      <w:pPr>
+        <w:spacing w:before="0" w:after="80" w:line="276" w:lineRule="auto"/>
+        <w:jc w:val="left"/>
+      </w:pPr>
+      <w:r>
+        <w:rPr>
+          <w:rFonts w:ascii="Prompt" w:hAnsi="Prompt"/>
+          <w:b/>
+          <w:i w:val="0"/>
+          <w:color w:val="047857"/>
+          <w:sz w:val="20"/>
+        </w:rPr>
+        <w:t>• สอดคล้องทักษะ: การบูรณาการทำงานด้วยเทคโนโลยีดิจิทัล &amp; การมองหาโอกาสและสร้างความแตกต่าง</w:t>
+        <w:br/>
+        <w:t>• ระยะเวลาเรียน: 1 ชั่วโมง (4 บทเรียนย่อย) | ภาษา: เสียงบรรยายภาษาไทย 🇹🇭</w:t>
+      </w:r>
+    </w:p>
+    <w:p>
+      <w:pPr>
+        <w:spacing w:before="0" w:after="80" w:line="276" w:lineRule="auto"/>
+        <w:jc w:val="left"/>
+      </w:pPr>
+      <w:r>
+        <w:rPr>
+          <w:rFonts w:ascii="Prompt" w:hAnsi="Prompt"/>
+          <w:b w:val="0"/>
+          <w:i w:val="0"/>
+          <w:color w:val="334155"/>
+          <w:sz w:val="20"/>
+        </w:rPr>
+        <w:t>ภาพรวมเนื้อหา: ตั้งแต่การซื้อของออนไลน์ด้วยการคลิกเพียงครั้งเดียว ไปจนถึงการสั่งให้ลำโพงอัจฉริยะเล่นเพลงรักสุดโปรด เทคโนโลยีนั้นมีประโยชน์อย่างมหาศาล แต่จะเกิดอะไรขึ้นหากคุณทำงานในองค์กรที่กำลังถูกทิ้งไว้ข้างหลังในยุคแห่งการเปลี่ยนผ่านสู่ดิจิทัลที่รวดเร็วเช่นนี้? ในกรณีนั้น ความก้าวหน้าทางเทคโนโลยีอาจกลับกลายเป็นอุปสรรคมากกว่าจะเป็นทางออกในทันที</w:t>
+        <w:br/>
+        <w:br/>
+        <w:t>โชคดีที่กลยุทธ์การเปลี่ยนผ่านสู่ดิจิทัล (Digital Transformation Strategy) ที่ได้รับการออกแบบมาโดยเฉพาะ สามารถช่วยให้องค์กรและบุคลากรภายในรักษาหรือสร้างความได้เปรียบทางการแข่งขันในสายงานของตนได้ อีกทั้งยังช่วยให้ธุรกิจสามารถกำหนดตำแหน่งเชิงกลยุทธ์ท่ามกลางภูมิทัศน์ดิจิทัลที่เปลี่ยนแปลงอยู่ตลอดเวลา ช่วยให้เกิดการปรับเปลี่ยน ปรับปรุง และหลีกเลี่ยงข้อผิดพลาดที่อาจทำให้เสียทั้งเงินและเวลาโดยใช่เหตุ</w:t>
+      </w:r>
+    </w:p>
+    <w:p>
+      <w:pPr>
+        <w:spacing w:before="200" w:after="80" w:line="276" w:lineRule="auto"/>
+        <w:jc w:val="left"/>
+      </w:pPr>
+      <w:r>
+        <w:rPr>
+          <w:rFonts w:ascii="Prompt" w:hAnsi="Prompt"/>
+          <w:b/>
+          <w:i w:val="0"/>
+          <w:color w:val="0369A1"/>
+          <w:sz w:val="24"/>
+        </w:rPr>
+        <w:t>3.4 [post#1623] พลังของ Big Data * (The Power of Big Data)</w:t>
+      </w:r>
+    </w:p>
+    <w:p>
+      <w:pPr>
+        <w:spacing w:before="0" w:after="80" w:line="276" w:lineRule="auto"/>
+        <w:jc w:val="left"/>
+      </w:pPr>
+      <w:r>
+        <w:rPr>
+          <w:rFonts w:ascii="Prompt" w:hAnsi="Prompt"/>
+          <w:b/>
+          <w:i w:val="0"/>
+          <w:color w:val="047857"/>
+          <w:sz w:val="20"/>
+        </w:rPr>
+        <w:t>• สอดคล้องทักษะ: บริหารงานด้วยข้อมูล &amp; การตัดสินใจอย่างรอบคอบ</w:t>
+        <w:br/>
+        <w:t>• ระยะเวลาเรียน: 1 ชั่วโมง (4 บทเรียนย่อย) | ภาษา: เสียงบรรยายภาษาไทย 🇹🇭</w:t>
+      </w:r>
+    </w:p>
+    <w:p>
+      <w:pPr>
+        <w:spacing w:before="0" w:after="80" w:line="276" w:lineRule="auto"/>
+        <w:jc w:val="left"/>
+      </w:pPr>
+      <w:r>
+        <w:rPr>
+          <w:rFonts w:ascii="Prompt" w:hAnsi="Prompt"/>
+          <w:b w:val="0"/>
+          <w:i w:val="0"/>
+          <w:color w:val="334155"/>
+          <w:sz w:val="20"/>
+        </w:rPr>
+        <w:t>ภาพรวมเนื้อหา: "ข้อมูล" คือสิ่งที่มีอยู่รอบตัวเราอย่างมหาศาล และกำลังเพิ่มขึ้นในทุกๆ วัน มีการประมาณการว่า ปริมาณข้อมูลที่มนุษย์สร้างขึ้นตั้งแต่ยุคเริ่มต้นอารยธรรมจนถึงปี ค.ศ. 2003 นั้น ปัจจุบันสามารถสร้างขึ้นได้ภายในเวลาเพียง 2 วันเท่านั้น ซึ่งถือเป็นข้อมูลจำนวนมหาศาลอย่างยิ่ง และเมื่อเราพูดถึงข้อมูลที่มีปริมาณมหาศาลขนาดนี้ เราจะเรียกมันว่า "Big Data" ซึ่งเป็นเครื่องมือที่ทรงพลังอย่างยิ่ง</w:t>
+        <w:br/>
+        <w:br/>
+        <w:t>หลายบริษัทใช้ Big Data ในการตัดสินใจครั้งสำคัญและมองหาโอกาสใหม่ๆ ลองจินตนาการดูว่าจะดีแค่ไหนหากคุณสามารถวิเคราะห์พฤติกรรมการซื้อสินค้าของผู้ใช้บนแพลตฟอร์มโซเชียลมีเดียทั้งหมด หรือวิเคราะห์การค้นหาบนเว็บไซต์ของประชากรทั้งประเทศตลอดทั้งปีได้ ซึ่ง Big Data สามารถช่วยให้คุณทำสิ่งเหล่านี้ได้อย่างง่ายดาย</w:t>
+      </w:r>
+    </w:p>
+    <w:p>
+      <w:pPr>
+        <w:spacing w:before="200" w:after="80" w:line="276" w:lineRule="auto"/>
+        <w:jc w:val="left"/>
+      </w:pPr>
+      <w:r>
+        <w:rPr>
+          <w:rFonts w:ascii="Prompt" w:hAnsi="Prompt"/>
+          <w:b/>
+          <w:i w:val="0"/>
+          <w:color w:val="0369A1"/>
+          <w:sz w:val="24"/>
+        </w:rPr>
+        <w:t>3.5 [post#14240] การปรับตัวรับความเปลี่ยนแปลงในยุค AI * (Adapting to Change in the Age of AI)</w:t>
       </w:r>
     </w:p>
     <w:p>
@@ -1546,92 +1499,10 @@
           <w:color w:val="334155"/>
           <w:sz w:val="20"/>
         </w:rPr>
-        <w:t>วัตถุประสงค์: พัฒนาทักษะการสังเกตรายละเอียดในสภาพแวดล้อมการทำงาน การคิดตามหลักเหตุและผล เพื่อค้นหาความผิดปกติและมองหาโอกาสสร้างนวัตกรรมใหม่</w:t>
-      </w:r>
-    </w:p>
-    <w:p>
-      <w:pPr>
-        <w:spacing w:before="40" w:after="40" w:line="276" w:lineRule="auto"/>
-        <w:jc w:val="left"/>
-      </w:pPr>
-      <w:r>
-        <w:rPr>
-          <w:rFonts w:ascii="Prompt" w:hAnsi="Prompt"/>
-          <w:b/>
-          <w:i w:val="0"/>
-          <w:color w:val="334155"/>
-          <w:sz w:val="20"/>
-        </w:rPr>
-        <w:t>โครงสร้างเนื้อหาบทเรียน (1 ชั่วโมง):</w:t>
-      </w:r>
-    </w:p>
-    <w:p>
-      <w:pPr>
-        <w:spacing w:before="0" w:after="40" w:line="276" w:lineRule="auto"/>
-        <w:jc w:val="left"/>
-      </w:pPr>
-      <w:r>
-        <w:rPr>
-          <w:rFonts w:ascii="Prompt" w:hAnsi="Prompt"/>
-          <w:b w:val="0"/>
-          <w:i w:val="0"/>
-          <w:color w:val="334155"/>
-          <w:sz w:val="19"/>
-        </w:rPr>
-        <w:t xml:space="preserve">   - 1. กรอบการสังเกตการณ์เชิงวิเคราะห์ (Critical Observation Framework) (15 นาที)</w:t>
-      </w:r>
-    </w:p>
-    <w:p>
-      <w:pPr>
-        <w:spacing w:before="0" w:after="40" w:line="276" w:lineRule="auto"/>
-        <w:jc w:val="left"/>
-      </w:pPr>
-      <w:r>
-        <w:rPr>
-          <w:rFonts w:ascii="Prompt" w:hAnsi="Prompt"/>
-          <w:b w:val="0"/>
-          <w:i w:val="0"/>
-          <w:color w:val="334155"/>
-          <w:sz w:val="19"/>
-        </w:rPr>
-        <w:t xml:space="preserve">   - 2. การเชื่อมโยงเหตุและผลด้วย Logical Thinking (15 นาที)</w:t>
-      </w:r>
-    </w:p>
-    <w:p>
-      <w:pPr>
-        <w:spacing w:before="0" w:after="40" w:line="276" w:lineRule="auto"/>
-        <w:jc w:val="left"/>
-      </w:pPr>
-      <w:r>
-        <w:rPr>
-          <w:rFonts w:ascii="Prompt" w:hAnsi="Prompt"/>
-          <w:b w:val="0"/>
-          <w:i w:val="0"/>
-          <w:color w:val="334155"/>
-          <w:sz w:val="19"/>
-        </w:rPr>
-        <w:t xml:space="preserve">   - 3. การค้นหา Root Cause ของปัญหาเพื่อป้องกันการเกิดซ้ำ (15 นาที)</w:t>
-      </w:r>
-    </w:p>
-    <w:p>
-      <w:pPr>
-        <w:spacing w:before="0" w:after="40" w:line="276" w:lineRule="auto"/>
-        <w:jc w:val="left"/>
-      </w:pPr>
-      <w:r>
-        <w:rPr>
-          <w:rFonts w:ascii="Prompt" w:hAnsi="Prompt"/>
-          <w:b w:val="0"/>
-          <w:i w:val="0"/>
-          <w:color w:val="334155"/>
-          <w:sz w:val="19"/>
-        </w:rPr>
-        <w:t xml:space="preserve">   - 4. การต่อยอดข้อสังเกตสู่การเสนอไอเดียและนวัตกรรมใหม่ในงาน (15 นาที)</w:t>
-      </w:r>
-    </w:p>
-    <w:p>
-      <w:r>
-        <w:br w:type="page"/>
+        <w:t>ภาพรวมเนื้อหา: AI เข้ามามีบทบาทในที่ทำงานแล้วและจะยังคงอยู่ต่อไป เทคโนโลยีนี้สามารถช่วยให้งานประจำเสร็จเร็วขึ้น ช่วยจัดระเบียบการทำงาน ช่วยในการค้นคว้าวิจัย และแม้กระทั่งสร้างข้อความและรูปภาพ นี่คือการเปลี่ยนแปลงทางเทคโนโลยีครั้งใหญ่ที่จะช่วยให้การทำงานง่ายขึ้น แต่เมื่อเทคโนโลยีพัฒนาขึ้น ผู้จัดการอาจกังวลว่าในที่สุดแล้ว AI จะสามารถทำงานแทนพนักงานได้ทั้งหมด</w:t>
+        <w:br/>
+        <w:br/>
+        <w:t>แม้ว่าเครื่องมือ AI อาจเข้ามาเปลี่ยนบทบาทหน้าที่การทำงานและรูปแบบการทำงานร่วมกันของทีม แต่เทคโนโลยีนี้จะไม่สามารถแทนที่มนุษย์ในที่ทำงานได้ การทำความเข้าใจและปรับตัวเข้ากับ AI จะช่วยให้พนักงานได้ทดลองใช้เครื่องมือที่เป็นนวัตกรรมใหม่ ๆ และปรับมุมมองต่อการทำงานประจำในรูปแบบที่ต่างไปจากเดิม นอกจากนี้ พนักงานยังจำเป็นต้องมีทักษะใหม่ ๆ และทัศนคติเชิงบวกเพื่อที่จะเติบโตและประสบความสำเร็จในสภาพแวดล้อมที่เปลี่ยนแปลงไปนี้</w:t>
       </w:r>
     </w:p>
     <w:p>
@@ -1647,689 +1518,7 @@
           <w:color w:val="0284C5"/>
           <w:sz w:val="32"/>
         </w:rPr>
-        <w:t>บทที่ 3: ข้อเสนอสื่อการเรียนรู้สำหรับกลุ่มผู้เรียนระดับบริหาร (C10 - C13)</w:t>
-      </w:r>
-    </w:p>
-    <w:p>
-      <w:pPr>
-        <w:spacing w:before="0" w:after="80" w:line="276" w:lineRule="auto"/>
-        <w:jc w:val="left"/>
-      </w:pPr>
-      <w:r>
-        <w:rPr>
-          <w:rFonts w:ascii="Prompt" w:hAnsi="Prompt"/>
-          <w:b w:val="0"/>
-          <w:i/>
-          <w:color w:val="64748B"/>
-          <w:sz w:val="21"/>
-        </w:rPr>
-        <w:t>กลุ่มเป้าหมายผู้เรียน: พนักงานระดับ C10 - C13 (ผู้บริหารระดับสูง, รองอธิบดี, ผู้ตรวจราชการ, อธิบดี, รองปลัดกระทรวง และคณะผู้บริหาร) มุ่งเน้นการกำหนดทิศทางกลยุทธ์ การบริหารจัดการความเสี่ยง การวิเคราะห์ข้อมูล Big Data และการนำองค์กรก้าวสู่ยุคดิจิทัลอย่างยั่งยืน</w:t>
-      </w:r>
-    </w:p>
-    <w:p>
-      <w:pPr>
-        <w:spacing w:before="200" w:after="80" w:line="276" w:lineRule="auto"/>
-        <w:jc w:val="left"/>
-      </w:pPr>
-      <w:r>
-        <w:rPr>
-          <w:rFonts w:ascii="Prompt" w:hAnsi="Prompt"/>
-          <w:b/>
-          <w:i w:val="0"/>
-          <w:color w:val="0369A1"/>
-          <w:sz w:val="24"/>
-        </w:rPr>
-        <w:t>3.1 [EXEC-FS-01] ทักษะความเข้าใจ AI และเทคโนโลยีสำหรับผู้บริหาร (AI Literacy &amp; Leadership for Executives)</w:t>
-      </w:r>
-    </w:p>
-    <w:p>
-      <w:pPr>
-        <w:spacing w:before="0" w:after="80" w:line="276" w:lineRule="auto"/>
-        <w:jc w:val="left"/>
-      </w:pPr>
-      <w:r>
-        <w:rPr>
-          <w:rFonts w:ascii="Prompt" w:hAnsi="Prompt"/>
-          <w:b/>
-          <w:i w:val="0"/>
-          <w:color w:val="047857"/>
-          <w:sz w:val="20"/>
-        </w:rPr>
-        <w:t>• สอดคล้องทักษะ: การบูรณาการทำงานด้วยเทคโนโลยีดิจิทัล &amp; การมองหาโอกาส</w:t>
-        <w:br/>
-        <w:t>• ระยะเวลาเรียน: 1 ชั่วโมง (4 บทเรียนย่อย) | ภาษา: เสียงบรรยายภาษาไทย 🇹🇭</w:t>
-      </w:r>
-    </w:p>
-    <w:p>
-      <w:pPr>
-        <w:spacing w:before="0" w:after="80" w:line="276" w:lineRule="auto"/>
-        <w:jc w:val="left"/>
-      </w:pPr>
-      <w:r>
-        <w:rPr>
-          <w:rFonts w:ascii="Prompt" w:hAnsi="Prompt"/>
-          <w:b w:val="0"/>
-          <w:i w:val="0"/>
-          <w:color w:val="334155"/>
-          <w:sz w:val="20"/>
-        </w:rPr>
-        <w:t>วัตถุประสงค์: เสริมสร้างความเข้าใจระดับนโยบายเกี่ยวกับ AI โอกาสทางธุรกิจ ความเสี่ยงด้านจริยธรรม และการนำองค์กรก้าวสู่ยุคปัญญาประดิษฐ์อย่างมั่นคง</w:t>
-      </w:r>
-    </w:p>
-    <w:p>
-      <w:pPr>
-        <w:spacing w:before="40" w:after="40" w:line="276" w:lineRule="auto"/>
-        <w:jc w:val="left"/>
-      </w:pPr>
-      <w:r>
-        <w:rPr>
-          <w:rFonts w:ascii="Prompt" w:hAnsi="Prompt"/>
-          <w:b/>
-          <w:i w:val="0"/>
-          <w:color w:val="334155"/>
-          <w:sz w:val="20"/>
-        </w:rPr>
-        <w:t>โครงสร้างเนื้อหาบทเรียน (1 ชั่วโมง):</w:t>
-      </w:r>
-    </w:p>
-    <w:p>
-      <w:pPr>
-        <w:spacing w:before="0" w:after="40" w:line="276" w:lineRule="auto"/>
-        <w:jc w:val="left"/>
-      </w:pPr>
-      <w:r>
-        <w:rPr>
-          <w:rFonts w:ascii="Prompt" w:hAnsi="Prompt"/>
-          <w:b w:val="0"/>
-          <w:i w:val="0"/>
-          <w:color w:val="334155"/>
-          <w:sz w:val="19"/>
-        </w:rPr>
-        <w:t xml:space="preserve">   - 1. ภาพรวมเทคโนโลยี AI และผลกระทบต่อโครงสร้างองค์กรยุคใหม่ (15 นาที)</w:t>
-      </w:r>
-    </w:p>
-    <w:p>
-      <w:pPr>
-        <w:spacing w:before="0" w:after="40" w:line="276" w:lineRule="auto"/>
-        <w:jc w:val="left"/>
-      </w:pPr>
-      <w:r>
-        <w:rPr>
-          <w:rFonts w:ascii="Prompt" w:hAnsi="Prompt"/>
-          <w:b w:val="0"/>
-          <w:i w:val="0"/>
-          <w:color w:val="334155"/>
-          <w:sz w:val="19"/>
-        </w:rPr>
-        <w:t xml:space="preserve">   - 2. การประเมินความพร้อมและโอกาสในการลงทุนเทคโนโลยี AI (15 นาที)</w:t>
-      </w:r>
-    </w:p>
-    <w:p>
-      <w:pPr>
-        <w:spacing w:before="0" w:after="40" w:line="276" w:lineRule="auto"/>
-        <w:jc w:val="left"/>
-      </w:pPr>
-      <w:r>
-        <w:rPr>
-          <w:rFonts w:ascii="Prompt" w:hAnsi="Prompt"/>
-          <w:b w:val="0"/>
-          <w:i w:val="0"/>
-          <w:color w:val="334155"/>
-          <w:sz w:val="19"/>
-        </w:rPr>
-        <w:t xml:space="preserve">   - 3. การกำหนดธรรมาภิบาลข้อมูล (Data Governance) และจริยธรรม AI (15 นาที)</w:t>
-      </w:r>
-    </w:p>
-    <w:p>
-      <w:pPr>
-        <w:spacing w:before="0" w:after="40" w:line="276" w:lineRule="auto"/>
-        <w:jc w:val="left"/>
-      </w:pPr>
-      <w:r>
-        <w:rPr>
-          <w:rFonts w:ascii="Prompt" w:hAnsi="Prompt"/>
-          <w:b w:val="0"/>
-          <w:i w:val="0"/>
-          <w:color w:val="334155"/>
-          <w:sz w:val="19"/>
-        </w:rPr>
-        <w:t xml:space="preserve">   - 4. บทบาทผู้นำในการขับเคลื่อนวัฒนธรรม AI-First Organization (15 นาที)</w:t>
-      </w:r>
-    </w:p>
-    <w:p>
-      <w:pPr>
-        <w:spacing w:before="200" w:after="80" w:line="276" w:lineRule="auto"/>
-        <w:jc w:val="left"/>
-      </w:pPr>
-      <w:r>
-        <w:rPr>
-          <w:rFonts w:ascii="Prompt" w:hAnsi="Prompt"/>
-          <w:b/>
-          <w:i w:val="0"/>
-          <w:color w:val="0369A1"/>
-          <w:sz w:val="24"/>
-        </w:rPr>
-        <w:t>3.2 [EXEC-FS-02] การวางแผนกลยุทธ์ตามสถานการณ์และการตัดสินใจเชิงบริหาร (Scenario Planning &amp; Strategic Decision Making)</w:t>
-      </w:r>
-    </w:p>
-    <w:p>
-      <w:pPr>
-        <w:spacing w:before="0" w:after="80" w:line="276" w:lineRule="auto"/>
-        <w:jc w:val="left"/>
-      </w:pPr>
-      <w:r>
-        <w:rPr>
-          <w:rFonts w:ascii="Prompt" w:hAnsi="Prompt"/>
-          <w:b/>
-          <w:i w:val="0"/>
-          <w:color w:val="047857"/>
-          <w:sz w:val="20"/>
-        </w:rPr>
-        <w:t>• สอดคล้องทักษะ: การตัดสินใจอย่างรอบคอบ &amp; บริหารงานด้วยข้อมูล</w:t>
-        <w:br/>
-        <w:t>• ระยะเวลาเรียน: 1 ชั่วโมง (4 บทเรียนย่อย) | ภาษา: เสียงบรรยายภาษาไทย 🇹🇭</w:t>
-      </w:r>
-    </w:p>
-    <w:p>
-      <w:pPr>
-        <w:spacing w:before="0" w:after="80" w:line="276" w:lineRule="auto"/>
-        <w:jc w:val="left"/>
-      </w:pPr>
-      <w:r>
-        <w:rPr>
-          <w:rFonts w:ascii="Prompt" w:hAnsi="Prompt"/>
-          <w:b w:val="0"/>
-          <w:i w:val="0"/>
-          <w:color w:val="334155"/>
-          <w:sz w:val="20"/>
-        </w:rPr>
-        <w:t>วัตถุประสงค์: มุ่งเน้นสร้างทักษะการจำลองสถานการณ์ความเสี่ยงล่วงหน้า การวิเคราะห์ฉากทัศน์ทางเลือก เพื่อการตัดสินใจทางกลยุทธ์ที่รอบคอบที่สุดในสภาวะความไม่แน่นอน</w:t>
-      </w:r>
-    </w:p>
-    <w:p>
-      <w:pPr>
-        <w:spacing w:before="40" w:after="40" w:line="276" w:lineRule="auto"/>
-        <w:jc w:val="left"/>
-      </w:pPr>
-      <w:r>
-        <w:rPr>
-          <w:rFonts w:ascii="Prompt" w:hAnsi="Prompt"/>
-          <w:b/>
-          <w:i w:val="0"/>
-          <w:color w:val="334155"/>
-          <w:sz w:val="20"/>
-        </w:rPr>
-        <w:t>โครงสร้างเนื้อหาบทเรียน (1 ชั่วโมง):</w:t>
-      </w:r>
-    </w:p>
-    <w:p>
-      <w:pPr>
-        <w:spacing w:before="0" w:after="40" w:line="276" w:lineRule="auto"/>
-        <w:jc w:val="left"/>
-      </w:pPr>
-      <w:r>
-        <w:rPr>
-          <w:rFonts w:ascii="Prompt" w:hAnsi="Prompt"/>
-          <w:b w:val="0"/>
-          <w:i w:val="0"/>
-          <w:color w:val="334155"/>
-          <w:sz w:val="19"/>
-        </w:rPr>
-        <w:t xml:space="preserve">   - 1. เครื่องมือและขั้นตอนการทำ Scenario Planning สำหรับผู้บริหาร (15 นาที)</w:t>
-      </w:r>
-    </w:p>
-    <w:p>
-      <w:pPr>
-        <w:spacing w:before="0" w:after="40" w:line="276" w:lineRule="auto"/>
-        <w:jc w:val="left"/>
-      </w:pPr>
-      <w:r>
-        <w:rPr>
-          <w:rFonts w:ascii="Prompt" w:hAnsi="Prompt"/>
-          <w:b w:val="0"/>
-          <w:i w:val="0"/>
-          <w:color w:val="334155"/>
-          <w:sz w:val="19"/>
-        </w:rPr>
-        <w:t xml:space="preserve">   - 2. การวิเคราะห์ปัจจัยความเสี่ยงและความไม่แน่นอนในอนาคต (15 นาที)</w:t>
-      </w:r>
-    </w:p>
-    <w:p>
-      <w:pPr>
-        <w:spacing w:before="0" w:after="40" w:line="276" w:lineRule="auto"/>
-        <w:jc w:val="left"/>
-      </w:pPr>
-      <w:r>
-        <w:rPr>
-          <w:rFonts w:ascii="Prompt" w:hAnsi="Prompt"/>
-          <w:b w:val="0"/>
-          <w:i w:val="0"/>
-          <w:color w:val="334155"/>
-          <w:sz w:val="19"/>
-        </w:rPr>
-        <w:t xml:space="preserve">   - 3. การตัดสินใจเชิงกลยุทธ์ภายใต้สภาวะข้อมูลไม่สมบูรณ์ (15 นาที)</w:t>
-      </w:r>
-    </w:p>
-    <w:p>
-      <w:pPr>
-        <w:spacing w:before="0" w:after="40" w:line="276" w:lineRule="auto"/>
-        <w:jc w:val="left"/>
-      </w:pPr>
-      <w:r>
-        <w:rPr>
-          <w:rFonts w:ascii="Prompt" w:hAnsi="Prompt"/>
-          <w:b w:val="0"/>
-          <w:i w:val="0"/>
-          <w:color w:val="334155"/>
-          <w:sz w:val="19"/>
-        </w:rPr>
-        <w:t xml:space="preserve">   - 4. การจัดทำแผนรองรับฉุกเฉินและการประเมินผลกระทบวงกว้าง (15 นาที)</w:t>
-      </w:r>
-    </w:p>
-    <w:p>
-      <w:pPr>
-        <w:spacing w:before="200" w:after="80" w:line="276" w:lineRule="auto"/>
-        <w:jc w:val="left"/>
-      </w:pPr>
-      <w:r>
-        <w:rPr>
-          <w:rFonts w:ascii="Prompt" w:hAnsi="Prompt"/>
-          <w:b/>
-          <w:i w:val="0"/>
-          <w:color w:val="0369A1"/>
-          <w:sz w:val="24"/>
-        </w:rPr>
-        <w:t>3.3 [EXEC-FS-03] การจัดทำกลยุทธ์การปรับเปลี่ยนองค์กรสู่ยุคดิจิทัล (Digital Transformation Strategy for Leaders)</w:t>
-      </w:r>
-    </w:p>
-    <w:p>
-      <w:pPr>
-        <w:spacing w:before="0" w:after="80" w:line="276" w:lineRule="auto"/>
-        <w:jc w:val="left"/>
-      </w:pPr>
-      <w:r>
-        <w:rPr>
-          <w:rFonts w:ascii="Prompt" w:hAnsi="Prompt"/>
-          <w:b/>
-          <w:i w:val="0"/>
-          <w:color w:val="047857"/>
-          <w:sz w:val="20"/>
-        </w:rPr>
-        <w:t>• สอดคล้องทักษะ: การบูรณาการทำงานด้วยเทคโนโลยีดิจิทัล &amp; การมองหาโอกาสและสร้างความแตกต่าง</w:t>
-        <w:br/>
-        <w:t>• ระยะเวลาเรียน: 1 ชั่วโมง (4 บทเรียนย่อย) | ภาษา: เสียงบรรยายภาษาไทย 🇹🇭</w:t>
-      </w:r>
-    </w:p>
-    <w:p>
-      <w:pPr>
-        <w:spacing w:before="0" w:after="80" w:line="276" w:lineRule="auto"/>
-        <w:jc w:val="left"/>
-      </w:pPr>
-      <w:r>
-        <w:rPr>
-          <w:rFonts w:ascii="Prompt" w:hAnsi="Prompt"/>
-          <w:b w:val="0"/>
-          <w:i w:val="0"/>
-          <w:color w:val="334155"/>
-          <w:sz w:val="20"/>
-        </w:rPr>
-        <w:t>วัตถุประสงค์: เพื่อให้ผู้บริหารระดับสูงสามารถออกแบบแผนโรดแมป Digital Transformation บูรณาการระบบงาน และสร้างความแตกต่างทางการแข่งขันแก่องค์กร</w:t>
-      </w:r>
-    </w:p>
-    <w:p>
-      <w:pPr>
-        <w:spacing w:before="40" w:after="40" w:line="276" w:lineRule="auto"/>
-        <w:jc w:val="left"/>
-      </w:pPr>
-      <w:r>
-        <w:rPr>
-          <w:rFonts w:ascii="Prompt" w:hAnsi="Prompt"/>
-          <w:b/>
-          <w:i w:val="0"/>
-          <w:color w:val="334155"/>
-          <w:sz w:val="20"/>
-        </w:rPr>
-        <w:t>โครงสร้างเนื้อหาบทเรียน (1 ชั่วโมง):</w:t>
-      </w:r>
-    </w:p>
-    <w:p>
-      <w:pPr>
-        <w:spacing w:before="0" w:after="40" w:line="276" w:lineRule="auto"/>
-        <w:jc w:val="left"/>
-      </w:pPr>
-      <w:r>
-        <w:rPr>
-          <w:rFonts w:ascii="Prompt" w:hAnsi="Prompt"/>
-          <w:b w:val="0"/>
-          <w:i w:val="0"/>
-          <w:color w:val="334155"/>
-          <w:sz w:val="19"/>
-        </w:rPr>
-        <w:t xml:space="preserve">   - 1. องค์ประกอบสำคัญของ Digital Transformation Strategy ที่ประสบความสำเร็จ (15 นาที)</w:t>
-      </w:r>
-    </w:p>
-    <w:p>
-      <w:pPr>
-        <w:spacing w:before="0" w:after="40" w:line="276" w:lineRule="auto"/>
-        <w:jc w:val="left"/>
-      </w:pPr>
-      <w:r>
-        <w:rPr>
-          <w:rFonts w:ascii="Prompt" w:hAnsi="Prompt"/>
-          <w:b w:val="0"/>
-          <w:i w:val="0"/>
-          <w:color w:val="334155"/>
-          <w:sz w:val="19"/>
-        </w:rPr>
-        <w:t xml:space="preserve">   - 2. การรื้อปรับระบบงาน (Process Redesign) ด้วยเทคโนโลยีดิจิทัล (15 นาที)</w:t>
-      </w:r>
-    </w:p>
-    <w:p>
-      <w:pPr>
-        <w:spacing w:before="0" w:after="40" w:line="276" w:lineRule="auto"/>
-        <w:jc w:val="left"/>
-      </w:pPr>
-      <w:r>
-        <w:rPr>
-          <w:rFonts w:ascii="Prompt" w:hAnsi="Prompt"/>
-          <w:b w:val="0"/>
-          <w:i w:val="0"/>
-          <w:color w:val="334155"/>
-          <w:sz w:val="19"/>
-        </w:rPr>
-        <w:t xml:space="preserve">   - 3. การบริหารจัดการผู้มีส่วนได้ส่วนเสียและการนำการเปลี่ยนแปลง (15 นาที)</w:t>
-      </w:r>
-    </w:p>
-    <w:p>
-      <w:pPr>
-        <w:spacing w:before="0" w:after="40" w:line="276" w:lineRule="auto"/>
-        <w:jc w:val="left"/>
-      </w:pPr>
-      <w:r>
-        <w:rPr>
-          <w:rFonts w:ascii="Prompt" w:hAnsi="Prompt"/>
-          <w:b w:val="0"/>
-          <w:i w:val="0"/>
-          <w:color w:val="334155"/>
-          <w:sz w:val="19"/>
-        </w:rPr>
-        <w:t xml:space="preserve">   - 4. การวัดผลความสำเร็จ (ROI &amp; Value Creation) จากการปรับเปลี่ยนดิจิทัล (15 นาที)</w:t>
-      </w:r>
-    </w:p>
-    <w:p>
-      <w:pPr>
-        <w:spacing w:before="200" w:after="80" w:line="276" w:lineRule="auto"/>
-        <w:jc w:val="left"/>
-      </w:pPr>
-      <w:r>
-        <w:rPr>
-          <w:rFonts w:ascii="Prompt" w:hAnsi="Prompt"/>
-          <w:b/>
-          <w:i w:val="0"/>
-          <w:color w:val="0369A1"/>
-          <w:sz w:val="24"/>
-        </w:rPr>
-        <w:t>3.4 [EXEC-FS-04] ขุมพลัง Big Data และการบริหารจัดการองค์กรด้วยข้อมูล (The Power of Big Data &amp; Data-Driven Leadership)</w:t>
-      </w:r>
-    </w:p>
-    <w:p>
-      <w:pPr>
-        <w:spacing w:before="0" w:after="80" w:line="276" w:lineRule="auto"/>
-        <w:jc w:val="left"/>
-      </w:pPr>
-      <w:r>
-        <w:rPr>
-          <w:rFonts w:ascii="Prompt" w:hAnsi="Prompt"/>
-          <w:b/>
-          <w:i w:val="0"/>
-          <w:color w:val="047857"/>
-          <w:sz w:val="20"/>
-        </w:rPr>
-        <w:t>• สอดคล้องทักษะ: บริหารงานด้วยข้อมูล &amp; การตัดสินใจอย่างรอบคอบ</w:t>
-        <w:br/>
-        <w:t>• ระยะเวลาเรียน: 1 ชั่วโมง (4 บทเรียนย่อย) | ภาษา: เสียงบรรยายภาษาไทย 🇹🇭</w:t>
-      </w:r>
-    </w:p>
-    <w:p>
-      <w:pPr>
-        <w:spacing w:before="0" w:after="80" w:line="276" w:lineRule="auto"/>
-        <w:jc w:val="left"/>
-      </w:pPr>
-      <w:r>
-        <w:rPr>
-          <w:rFonts w:ascii="Prompt" w:hAnsi="Prompt"/>
-          <w:b w:val="0"/>
-          <w:i w:val="0"/>
-          <w:color w:val="334155"/>
-          <w:sz w:val="20"/>
-        </w:rPr>
-        <w:t>วัตถุประสงค์: เสริมสร้างวิสัยทัศน์ผู้บริหารในการขับเคลื่อนองค์กรด้วยข้อมูล (Data-Driven Organization) การขับเคลื่อนนโยบายด้วยสารสนเทศเชิงลึกและการวิเคราะห์คาดการณ์</w:t>
-      </w:r>
-    </w:p>
-    <w:p>
-      <w:pPr>
-        <w:spacing w:before="40" w:after="40" w:line="276" w:lineRule="auto"/>
-        <w:jc w:val="left"/>
-      </w:pPr>
-      <w:r>
-        <w:rPr>
-          <w:rFonts w:ascii="Prompt" w:hAnsi="Prompt"/>
-          <w:b/>
-          <w:i w:val="0"/>
-          <w:color w:val="334155"/>
-          <w:sz w:val="20"/>
-        </w:rPr>
-        <w:t>โครงสร้างเนื้อหาบทเรียน (1 ชั่วโมง):</w:t>
-      </w:r>
-    </w:p>
-    <w:p>
-      <w:pPr>
-        <w:spacing w:before="0" w:after="40" w:line="276" w:lineRule="auto"/>
-        <w:jc w:val="left"/>
-      </w:pPr>
-      <w:r>
-        <w:rPr>
-          <w:rFonts w:ascii="Prompt" w:hAnsi="Prompt"/>
-          <w:b w:val="0"/>
-          <w:i w:val="0"/>
-          <w:color w:val="334155"/>
-          <w:sz w:val="19"/>
-        </w:rPr>
-        <w:t xml:space="preserve">   - 1. ศักยภาพของ Big Data ในการสร้างความได้เปรียบเชิงกลยุทธ์ (15 นาที)</w:t>
-      </w:r>
-    </w:p>
-    <w:p>
-      <w:pPr>
-        <w:spacing w:before="0" w:after="40" w:line="276" w:lineRule="auto"/>
-        <w:jc w:val="left"/>
-      </w:pPr>
-      <w:r>
-        <w:rPr>
-          <w:rFonts w:ascii="Prompt" w:hAnsi="Prompt"/>
-          <w:b w:val="0"/>
-          <w:i w:val="0"/>
-          <w:color w:val="334155"/>
-          <w:sz w:val="19"/>
-        </w:rPr>
-        <w:t xml:space="preserve">   - 2. การตั้งโจทย์และการตัดสินใจโดยใช้วิเคราะห์ข้อมูลเชิงคาดการณ์ (15 นาที)</w:t>
-      </w:r>
-    </w:p>
-    <w:p>
-      <w:pPr>
-        <w:spacing w:before="0" w:after="40" w:line="276" w:lineRule="auto"/>
-        <w:jc w:val="left"/>
-      </w:pPr>
-      <w:r>
-        <w:rPr>
-          <w:rFonts w:ascii="Prompt" w:hAnsi="Prompt"/>
-          <w:b w:val="0"/>
-          <w:i w:val="0"/>
-          <w:color w:val="334155"/>
-          <w:sz w:val="19"/>
-        </w:rPr>
-        <w:t xml:space="preserve">   - 3. การสร้างโครงสร้างพื้นฐานและทีมงานด้านข้อมูลในองค์กร (15 นาที)</w:t>
-      </w:r>
-    </w:p>
-    <w:p>
-      <w:pPr>
-        <w:spacing w:before="0" w:after="40" w:line="276" w:lineRule="auto"/>
-        <w:jc w:val="left"/>
-      </w:pPr>
-      <w:r>
-        <w:rPr>
-          <w:rFonts w:ascii="Prompt" w:hAnsi="Prompt"/>
-          <w:b w:val="0"/>
-          <w:i w:val="0"/>
-          <w:color w:val="334155"/>
-          <w:sz w:val="19"/>
-        </w:rPr>
-        <w:t xml:space="preserve">   - 4. การเปลี่ยนข้อมูลสารสนเทศให้เป็นมูลค่าและการตัดสินใจระดับนโยบาย (15 นาที)</w:t>
-      </w:r>
-    </w:p>
-    <w:p>
-      <w:pPr>
-        <w:spacing w:before="200" w:after="80" w:line="276" w:lineRule="auto"/>
-        <w:jc w:val="left"/>
-      </w:pPr>
-      <w:r>
-        <w:rPr>
-          <w:rFonts w:ascii="Prompt" w:hAnsi="Prompt"/>
-          <w:b/>
-          <w:i w:val="0"/>
-          <w:color w:val="0369A1"/>
-          <w:sz w:val="24"/>
-        </w:rPr>
-        <w:t>3.5 [EXEC-FS-05] การบริหารการเปลี่ยนแปลงและการรับมือ Digital Disruption (Managing Change &amp; Digital Disruption)</w:t>
-      </w:r>
-    </w:p>
-    <w:p>
-      <w:pPr>
-        <w:spacing w:before="0" w:after="80" w:line="276" w:lineRule="auto"/>
-        <w:jc w:val="left"/>
-      </w:pPr>
-      <w:r>
-        <w:rPr>
-          <w:rFonts w:ascii="Prompt" w:hAnsi="Prompt"/>
-          <w:b/>
-          <w:i w:val="0"/>
-          <w:color w:val="047857"/>
-          <w:sz w:val="20"/>
-        </w:rPr>
-        <w:t>• สอดคล้องทักษะ: การมองหาโอกาสและสร้างความแตกต่าง</w:t>
-        <w:br/>
-        <w:t>• ระยะเวลาเรียน: 1 ชั่วโมง (4 บทเรียนย่อย) | ภาษา: เสียงบรรยายภาษาไทย 🇹🇭</w:t>
-      </w:r>
-    </w:p>
-    <w:p>
-      <w:pPr>
-        <w:spacing w:before="0" w:after="80" w:line="276" w:lineRule="auto"/>
-        <w:jc w:val="left"/>
-      </w:pPr>
-      <w:r>
-        <w:rPr>
-          <w:rFonts w:ascii="Prompt" w:hAnsi="Prompt"/>
-          <w:b w:val="0"/>
-          <w:i w:val="0"/>
-          <w:color w:val="334155"/>
-          <w:sz w:val="20"/>
-        </w:rPr>
-        <w:t>วัตถุประสงค์: พัฒนาความสามารถผู้บริหารในการรับมือกับความท้าทายจาก Digital Disruption การสร้างนวัตกรรมเพื่อสร้างความแตกต่างและนำพาองค์กรเติบโตอย่างยั่งยืน</w:t>
-      </w:r>
-    </w:p>
-    <w:p>
-      <w:pPr>
-        <w:spacing w:before="40" w:after="40" w:line="276" w:lineRule="auto"/>
-        <w:jc w:val="left"/>
-      </w:pPr>
-      <w:r>
-        <w:rPr>
-          <w:rFonts w:ascii="Prompt" w:hAnsi="Prompt"/>
-          <w:b/>
-          <w:i w:val="0"/>
-          <w:color w:val="334155"/>
-          <w:sz w:val="20"/>
-        </w:rPr>
-        <w:t>โครงสร้างเนื้อหาบทเรียน (1 ชั่วโมง):</w:t>
-      </w:r>
-    </w:p>
-    <w:p>
-      <w:pPr>
-        <w:spacing w:before="0" w:after="40" w:line="276" w:lineRule="auto"/>
-        <w:jc w:val="left"/>
-      </w:pPr>
-      <w:r>
-        <w:rPr>
-          <w:rFonts w:ascii="Prompt" w:hAnsi="Prompt"/>
-          <w:b w:val="0"/>
-          <w:i w:val="0"/>
-          <w:color w:val="334155"/>
-          <w:sz w:val="19"/>
-        </w:rPr>
-        <w:t xml:space="preserve">   - 1. สัญญาณเตือนและการวิเคราะห์ผลกระทบจาก Digital Disruption (15 นาที)</w:t>
-      </w:r>
-    </w:p>
-    <w:p>
-      <w:pPr>
-        <w:spacing w:before="0" w:after="40" w:line="276" w:lineRule="auto"/>
-        <w:jc w:val="left"/>
-      </w:pPr>
-      <w:r>
-        <w:rPr>
-          <w:rFonts w:ascii="Prompt" w:hAnsi="Prompt"/>
-          <w:b w:val="0"/>
-          <w:i w:val="0"/>
-          <w:color w:val="334155"/>
-          <w:sz w:val="19"/>
-        </w:rPr>
-        <w:t xml:space="preserve">   - 2. การมองหาช่องว่างตลาดและโอกาสทางธุรกิจใหม่ๆ New Opportunity Identification (15 นาที)</w:t>
-      </w:r>
-    </w:p>
-    <w:p>
-      <w:pPr>
-        <w:spacing w:before="0" w:after="40" w:line="276" w:lineRule="auto"/>
-        <w:jc w:val="left"/>
-      </w:pPr>
-      <w:r>
-        <w:rPr>
-          <w:rFonts w:ascii="Prompt" w:hAnsi="Prompt"/>
-          <w:b w:val="0"/>
-          <w:i w:val="0"/>
-          <w:color w:val="334155"/>
-          <w:sz w:val="19"/>
-        </w:rPr>
-        <w:t xml:space="preserve">   - 3. เทคนิค Change Management เพื่อลดแรงต้านในองค์กร (15 นาที)</w:t>
-      </w:r>
-    </w:p>
-    <w:p>
-      <w:pPr>
-        <w:spacing w:before="0" w:after="40" w:line="276" w:lineRule="auto"/>
-        <w:jc w:val="left"/>
-      </w:pPr>
-      <w:r>
-        <w:rPr>
-          <w:rFonts w:ascii="Prompt" w:hAnsi="Prompt"/>
-          <w:b w:val="0"/>
-          <w:i w:val="0"/>
-          <w:color w:val="334155"/>
-          <w:sz w:val="19"/>
-        </w:rPr>
-        <w:t xml:space="preserve">   - 4. การสร้างวัฒนธรรมองค์กรที่ยืดหยุ่น พร้อมรับมือความเปลี่ยนแปลง Agile Culture (15 นาที)</w:t>
-      </w:r>
-    </w:p>
-    <w:p>
-      <w:pPr>
-        <w:spacing w:before="360" w:after="160" w:line="276" w:lineRule="auto"/>
-        <w:jc w:val="left"/>
-      </w:pPr>
-      <w:r>
-        <w:rPr>
-          <w:rFonts w:ascii="Prompt" w:hAnsi="Prompt"/>
-          <w:b/>
-          <w:i w:val="0"/>
-          <w:color w:val="0284C5"/>
-          <w:sz w:val="32"/>
-        </w:rPr>
-        <w:t>บทที่ 4: คุณลักษณะทางเทคนิคและมาตรฐานสื่อการเรียนรู้ (Technical Specifications)</w:t>
+        <w:t>บทที่ 4: คุณลักษณะทางเทคนิคและช่องทางการค้นหา</w:t>
       </w:r>
     </w:p>
     <w:p>
@@ -2345,55 +1534,13 @@
           <w:color w:val="334155"/>
           <w:sz w:val="21"/>
         </w:rPr>
-        <w:t>1. มาตรฐานสื่อระบบการเรียนรู้ (Courseware Standards):</w:t>
+        <w:t>1. มาตรฐาน SCORM 1.2 / 2004 / xAPI รองรับการติดตั้งบน LMS เดิมขององค์กร 100%</w:t>
         <w:br/>
-        <w:t xml:space="preserve">   • รองรับมาตรฐาน SCORM 1.2, SCORM 2004 และ xAPI (HTML5) สามารถติดตั้งและใช้งานร่วมกับระบบ Learning Management System (LMS) เดิมของหน่วยงานได้ 100%</w:t>
+        <w:t>2. เสียงบรรยายภาษาไทยสตูดิโอ (* 🇹🇭) พร้อมซับไตเติิลประกอบทุกรายวิชา</w:t>
         <w:br/>
-        <w:t xml:space="preserve">   • เสียงบรรยายภาษาไทยระดับสตูดิโอ (High-Quality Thai Voiceover 🇹🇭) พร้อมซับไตเติิลประกอบ</w:t>
+        <w:t>3. ชื่อรายวิชาและ ObjectID ในเอกสารข้อเสนอนี้ตรงกับคลัง TalentLibrary 100% ท่านสามารถพิมพ์ชื่อวิชาในช่องค้นหาบนเว็บแอปเพื่อเปิดดูตัวอย่างสื่อวิดีโอได้ทันทีที่:</w:t>
         <w:br/>
-        <w:t xml:space="preserve">   • แสดงผลแบบ Fluid Responsive รองรับการเรียนรู้ผ่านคอมพิวเตอร์ แท็บเล็ต และสมาร์ตโฟนทุกระบบปฏิบัติการ</w:t>
-      </w:r>
-    </w:p>
-    <w:p>
-      <w:pPr>
-        <w:spacing w:before="0" w:after="80" w:line="276" w:lineRule="auto"/>
-        <w:jc w:val="left"/>
-      </w:pPr>
-      <w:r>
-        <w:rPr>
-          <w:rFonts w:ascii="Prompt" w:hAnsi="Prompt"/>
-          <w:b w:val="0"/>
-          <w:i w:val="0"/>
-          <w:color w:val="334155"/>
-          <w:sz w:val="21"/>
-        </w:rPr>
-        <w:t>2. ระบบการวัดผลและใบรับรอง (Assessment &amp; Certification):</w:t>
-        <w:br/>
-        <w:t xml:space="preserve">   • มีแบบทดสอบก่อนเรียน (Pre-test) และแบบทดสอบหลังเรียน (Post-test) ในทุกวิชา</w:t>
-        <w:br/>
-        <w:t xml:space="preserve">   • มีแบบฝึกหัดอินเทอร์แอ็กทีฟแทรกในเนื้อหาเพื่อทดสอบความเข้าใจ</w:t>
-        <w:br/>
-        <w:t xml:space="preserve">   • รองรับการออกใบประกาศนียบัตรอิเล็กทรอนิกส์ (e-Certificate) เมื่อผู้เรียนเรียนจบตามเกณฑ์เวลาและผ่านการทดสอบ</w:t>
-      </w:r>
-    </w:p>
-    <w:p>
-      <w:pPr>
-        <w:spacing w:before="0" w:after="80" w:line="276" w:lineRule="auto"/>
-        <w:jc w:val="left"/>
-      </w:pPr>
-      <w:r>
-        <w:rPr>
-          <w:rFonts w:ascii="Prompt" w:hAnsi="Prompt"/>
-          <w:b/>
-          <w:i w:val="0"/>
-          <w:color w:val="0284C5"/>
-          <w:sz w:val="21"/>
-        </w:rPr>
-        <w:t>3. ช่องทางการเข้าชมวิดีโอตัวอย่างและทดสอบสื่อการเรียนรู้จริง (Live Demo):</w:t>
-        <w:br/>
-        <w:t xml:space="preserve">   • คณะกรรมการและผู้สนในสามารถเข้าชม ค้นหา และทดลองฟังเสียงบรรยายภาษาไทยของทุกรายวิชาได้ทันทีผ่านระบบเว็บแอปพลิเคชันคลังหลักสูตร TalentLibrary™ ไทย ที่เว็บอ้างอิง:</w:t>
-        <w:br/>
-        <w:t xml:space="preserve">     https://talentlibraryth.streamlit.app</w:t>
+        <w:t xml:space="preserve">   https://talentlibraryth.streamlit.app</w:t>
       </w:r>
     </w:p>
     <w:sectPr>

</xml_diff>

<commit_message>
Structure TOR Proposal with Custom 1-Hour Main Subjects and 4x15-min exact TalentLibrary sub-lessons
</commit_message>
<xml_diff>
--- a/TOR_Courseware_Proposal_TalentLibrary_TH.docx
+++ b/TOR_Courseware_Proposal_TalentLibrary_TH.docx
@@ -47,11 +47,11 @@
           <w:b/>
           <w:i w:val="0"/>
           <w:color w:val="047857"/>
-          <w:sz w:val="26"/>
+          <w:sz w:val="25"/>
         </w:rPr>
         <w:t>ตามข้อกำหนดขอบเขตของงาน (TOR) ข้อ 4.2 และ 4.2.1</w:t>
         <w:br/>
-        <w:t>(ชื่อหลักสูตรตรงกับคลัง TalentLibrary 100%)</w:t>
+        <w:t>(วิชาหลัก 1 ชั่วโมง + 4 บทเรียนย่อย 15 นาทีจากคลัง TalentLibrary)</w:t>
       </w:r>
     </w:p>
     <w:p>
@@ -108,842 +108,9 @@
           <w:color w:val="334155"/>
           <w:sz w:val="22"/>
         </w:rPr>
-        <w:t>ข้อเสนอนี้จัดทำขึ้นเพื่อตอบสนองข้อกำหนดขอบเขตของงาน (TOR) ข้อ 4.2 และ 4.2.1 ในการส่งมอบสื่อการเรียนรู้ออนไลน์ภาษาไทยคุณภาพสูง (พร้อมเสียงบรรยายภาษาไทยแบบสตูดิโอ 🇹🇭) ครอบคลุมทักษะแห่งอนาคต (Future Skills) ทั้ง 4 ด้านหลัก โดยระบุชื่อหลักสูตรตรงตามชื่อในฐานข้อมูลคลังหลักสูตร TalentLibrary เพื่อให้ค้นหา ตรวจสอบ และเชื่อมโยงข้อมูลได้อย่างแม่นยำ 100%</w:t>
+        <w:t>ข้อเสนอนี้จัดทำขึ้นเพื่อตอบสนองข้อกำหนดขอบเขตของงาน (TOR) ข้อ 4.2 และ 4.2.1 ในการส่งมอบสื่อการเรียนรู้ออนไลน์ภาษาไทยคุณภาพสูง (พร้อมเสียงบรรยายภาษาไทยแบบสตูดิโอ 🇹🇭) โดยกำหนดให้ชื่อวิชาหลัก (1 ชั่วโมง) ออกแบบขึ้นให้สอดคล้องกับ TOR และแต่ละวิชาหลักประกอบด้วยเนื้อหาย่อย (15 นาที) จำนวน 4 บทเรียน ที่มีชื่อบทเรียนและ ObjectID ตรงตามคลังหลักสูตร TalentLibrary 100% เพื่อให้ค้นหา ตรวจสอบ และเชื่อมโยงได้ง่ายดาย</w:t>
       </w:r>
     </w:p>
-    <w:p>
-      <w:pPr>
-        <w:spacing w:before="240" w:after="120" w:line="276" w:lineRule="auto"/>
-        <w:jc w:val="left"/>
-      </w:pPr>
-      <w:r>
-        <w:rPr>
-          <w:rFonts w:ascii="Prompt" w:hAnsi="Prompt"/>
-          <w:b/>
-          <w:i w:val="0"/>
-          <w:color w:val="0369A1"/>
-          <w:sz w:val="25"/>
-        </w:rPr>
-        <w:t>ตารางที่ 1.1: สรุปการตารางตารางสอดคล้องกับข้อกำหนด TOR (TOR Compliance Matrix)</w:t>
-      </w:r>
-    </w:p>
-    <w:tbl>
-      <w:tblPr>
-        <w:tblW w:type="auto" w:w="0"/>
-        <w:jc w:val="center"/>
-        <w:tblLook w:firstColumn="1" w:firstRow="1" w:lastColumn="0" w:lastRow="0" w:noHBand="0" w:noVBand="1" w:val="04A0"/>
-      </w:tblPr>
-      <w:tblGrid>
-        <w:gridCol w:w="2340"/>
-        <w:gridCol w:w="2340"/>
-        <w:gridCol w:w="2340"/>
-        <w:gridCol w:w="2340"/>
-      </w:tblGrid>
-      <w:tr>
-        <w:tc>
-          <w:tcPr>
-            <w:tcW w:type="dxa" w:w="1872"/>
-            <w:shd w:fill="0284C7"/>
-            <w:tcMar>
-              <w:top w:w="120" w:type="dxa"/>
-              <w:bottom w:w="120" w:type="dxa"/>
-              <w:left w:w="120" w:type="dxa"/>
-              <w:right w:w="120" w:type="dxa"/>
-            </w:tcMar>
-            <w:tcBorders>
-              <w:top w:val="single" w:sz="4" w:space="0" w:color="0284C7"/>
-              <w:bottom w:val="single" w:sz="4" w:space="0" w:color="0284C7"/>
-              <w:left w:val="single" w:sz="4" w:space="0" w:color="0284C7"/>
-              <w:right w:val="single" w:sz="4" w:space="0" w:color="0284C7"/>
-            </w:tcBorders>
-          </w:tcPr>
-          <w:p>
-            <w:pPr>
-              <w:jc w:val="center"/>
-            </w:pPr>
-            <w:r>
-              <w:rPr>
-                <w:rFonts w:ascii="Prompt" w:hAnsi="Prompt"/>
-                <w:b/>
-                <w:i w:val="0"/>
-                <w:color w:val="FFFFFF"/>
-                <w:sz w:val="20"/>
-              </w:rPr>
-              <w:t>ข้อกำหนด TOR</w:t>
-            </w:r>
-          </w:p>
-        </w:tc>
-        <w:tc>
-          <w:tcPr>
-            <w:tcW w:type="dxa" w:w="3168"/>
-            <w:shd w:fill="0284C7"/>
-            <w:tcMar>
-              <w:top w:w="120" w:type="dxa"/>
-              <w:bottom w:w="120" w:type="dxa"/>
-              <w:left w:w="120" w:type="dxa"/>
-              <w:right w:w="120" w:type="dxa"/>
-            </w:tcMar>
-            <w:tcBorders>
-              <w:top w:val="single" w:sz="4" w:space="0" w:color="0284C7"/>
-              <w:bottom w:val="single" w:sz="4" w:space="0" w:color="0284C7"/>
-              <w:left w:val="single" w:sz="4" w:space="0" w:color="0284C7"/>
-              <w:right w:val="single" w:sz="4" w:space="0" w:color="0284C7"/>
-            </w:tcBorders>
-          </w:tcPr>
-          <w:p>
-            <w:pPr>
-              <w:jc w:val="center"/>
-            </w:pPr>
-            <w:r>
-              <w:rPr>
-                <w:rFonts w:ascii="Prompt" w:hAnsi="Prompt"/>
-                <w:b/>
-                <w:i w:val="0"/>
-                <w:color w:val="FFFFFF"/>
-                <w:sz w:val="20"/>
-              </w:rPr>
-              <w:t>รายละเอียดข้อกำหนด</w:t>
-            </w:r>
-          </w:p>
-        </w:tc>
-        <w:tc>
-          <w:tcPr>
-            <w:tcW w:type="dxa" w:w="3168"/>
-            <w:shd w:fill="0284C7"/>
-            <w:tcMar>
-              <w:top w:w="120" w:type="dxa"/>
-              <w:bottom w:w="120" w:type="dxa"/>
-              <w:left w:w="120" w:type="dxa"/>
-              <w:right w:w="120" w:type="dxa"/>
-            </w:tcMar>
-            <w:tcBorders>
-              <w:top w:val="single" w:sz="4" w:space="0" w:color="0284C7"/>
-              <w:bottom w:val="single" w:sz="4" w:space="0" w:color="0284C7"/>
-              <w:left w:val="single" w:sz="4" w:space="0" w:color="0284C7"/>
-              <w:right w:val="single" w:sz="4" w:space="0" w:color="0284C7"/>
-            </w:tcBorders>
-          </w:tcPr>
-          <w:p>
-            <w:pPr>
-              <w:jc w:val="center"/>
-            </w:pPr>
-            <w:r>
-              <w:rPr>
-                <w:rFonts w:ascii="Prompt" w:hAnsi="Prompt"/>
-                <w:b/>
-                <w:i w:val="0"/>
-                <w:color w:val="FFFFFF"/>
-                <w:sz w:val="20"/>
-              </w:rPr>
-              <w:t>ข้อเสนอสื่อการเรียนรู้ TalentLibrary™ ไทย</w:t>
-            </w:r>
-          </w:p>
-        </w:tc>
-        <w:tc>
-          <w:tcPr>
-            <w:tcW w:type="dxa" w:w="1152"/>
-            <w:shd w:fill="0284C7"/>
-            <w:tcMar>
-              <w:top w:w="120" w:type="dxa"/>
-              <w:bottom w:w="120" w:type="dxa"/>
-              <w:left w:w="120" w:type="dxa"/>
-              <w:right w:w="120" w:type="dxa"/>
-            </w:tcMar>
-            <w:tcBorders>
-              <w:top w:val="single" w:sz="4" w:space="0" w:color="0284C7"/>
-              <w:bottom w:val="single" w:sz="4" w:space="0" w:color="0284C7"/>
-              <w:left w:val="single" w:sz="4" w:space="0" w:color="0284C7"/>
-              <w:right w:val="single" w:sz="4" w:space="0" w:color="0284C7"/>
-            </w:tcBorders>
-          </w:tcPr>
-          <w:p>
-            <w:pPr>
-              <w:jc w:val="center"/>
-            </w:pPr>
-            <w:r>
-              <w:rPr>
-                <w:rFonts w:ascii="Prompt" w:hAnsi="Prompt"/>
-                <w:b/>
-                <w:i w:val="0"/>
-                <w:color w:val="FFFFFF"/>
-                <w:sz w:val="20"/>
-              </w:rPr>
-              <w:t>สถานะความสอดคล้อง</w:t>
-            </w:r>
-          </w:p>
-        </w:tc>
-      </w:tr>
-      <w:tr>
-        <w:tc>
-          <w:tcPr>
-            <w:tcW w:type="dxa" w:w="1872"/>
-            <w:shd w:fill="FFFFFF"/>
-            <w:tcMar>
-              <w:top w:w="100" w:type="dxa"/>
-              <w:bottom w:w="100" w:type="dxa"/>
-              <w:left w:w="120" w:type="dxa"/>
-              <w:right w:w="120" w:type="dxa"/>
-            </w:tcMar>
-            <w:tcBorders>
-              <w:top w:val="single" w:sz="4" w:space="0" w:color="E2E8F0"/>
-              <w:bottom w:val="single" w:sz="4" w:space="0" w:color="E2E8F0"/>
-              <w:left w:val="single" w:sz="4" w:space="0" w:color="E2E8F0"/>
-              <w:right w:val="single" w:sz="4" w:space="0" w:color="E2E8F0"/>
-            </w:tcBorders>
-          </w:tcPr>
-          <w:p>
-            <w:pPr>
-              <w:jc w:val="center"/>
-            </w:pPr>
-            <w:r>
-              <w:rPr>
-                <w:rFonts w:ascii="Prompt" w:hAnsi="Prompt"/>
-                <w:b w:val="0"/>
-                <w:i w:val="0"/>
-                <w:color w:val="334155"/>
-                <w:sz w:val="19"/>
-              </w:rPr>
-              <w:t>สื่อการเรียนรู้ภาษาไทย</w:t>
-            </w:r>
-          </w:p>
-        </w:tc>
-        <w:tc>
-          <w:tcPr>
-            <w:tcW w:type="dxa" w:w="3168"/>
-            <w:shd w:fill="FFFFFF"/>
-            <w:tcMar>
-              <w:top w:w="100" w:type="dxa"/>
-              <w:bottom w:w="100" w:type="dxa"/>
-              <w:left w:w="120" w:type="dxa"/>
-              <w:right w:w="120" w:type="dxa"/>
-            </w:tcMar>
-            <w:tcBorders>
-              <w:top w:val="single" w:sz="4" w:space="0" w:color="E2E8F0"/>
-              <w:bottom w:val="single" w:sz="4" w:space="0" w:color="E2E8F0"/>
-              <w:left w:val="single" w:sz="4" w:space="0" w:color="E2E8F0"/>
-              <w:right w:val="single" w:sz="4" w:space="0" w:color="E2E8F0"/>
-            </w:tcBorders>
-          </w:tcPr>
-          <w:p>
-            <w:pPr>
-              <w:jc w:val="left"/>
-            </w:pPr>
-            <w:r>
-              <w:rPr>
-                <w:rFonts w:ascii="Prompt" w:hAnsi="Prompt"/>
-                <w:b w:val="0"/>
-                <w:i w:val="0"/>
-                <w:color w:val="334155"/>
-                <w:sz w:val="19"/>
-              </w:rPr>
-              <w:t>ต้องทำการสอนด้วยภาษาไทยคุณภาพสูง</w:t>
-            </w:r>
-          </w:p>
-        </w:tc>
-        <w:tc>
-          <w:tcPr>
-            <w:tcW w:type="dxa" w:w="3168"/>
-            <w:shd w:fill="FFFFFF"/>
-            <w:tcMar>
-              <w:top w:w="100" w:type="dxa"/>
-              <w:bottom w:w="100" w:type="dxa"/>
-              <w:left w:w="120" w:type="dxa"/>
-              <w:right w:w="120" w:type="dxa"/>
-            </w:tcMar>
-            <w:tcBorders>
-              <w:top w:val="single" w:sz="4" w:space="0" w:color="E2E8F0"/>
-              <w:bottom w:val="single" w:sz="4" w:space="0" w:color="E2E8F0"/>
-              <w:left w:val="single" w:sz="4" w:space="0" w:color="E2E8F0"/>
-              <w:right w:val="single" w:sz="4" w:space="0" w:color="E2E8F0"/>
-            </w:tcBorders>
-          </w:tcPr>
-          <w:p>
-            <w:pPr>
-              <w:jc w:val="left"/>
-            </w:pPr>
-            <w:r>
-              <w:rPr>
-                <w:rFonts w:ascii="Prompt" w:hAnsi="Prompt"/>
-                <w:b w:val="0"/>
-                <w:i w:val="0"/>
-                <w:color w:val="334155"/>
-                <w:sz w:val="19"/>
-              </w:rPr>
-              <w:t>สื่อเรียนรู้ออนไลน์พร้อมเสียงบรรยายภาษาไทย (* 🇹🇭) ตรงตามคลังข้อมูล</w:t>
-            </w:r>
-          </w:p>
-        </w:tc>
-        <w:tc>
-          <w:tcPr>
-            <w:tcW w:type="dxa" w:w="1152"/>
-            <w:shd w:fill="FFFFFF"/>
-            <w:tcMar>
-              <w:top w:w="100" w:type="dxa"/>
-              <w:bottom w:w="100" w:type="dxa"/>
-              <w:left w:w="120" w:type="dxa"/>
-              <w:right w:w="120" w:type="dxa"/>
-            </w:tcMar>
-            <w:tcBorders>
-              <w:top w:val="single" w:sz="4" w:space="0" w:color="E2E8F0"/>
-              <w:bottom w:val="single" w:sz="4" w:space="0" w:color="E2E8F0"/>
-              <w:left w:val="single" w:sz="4" w:space="0" w:color="E2E8F0"/>
-              <w:right w:val="single" w:sz="4" w:space="0" w:color="E2E8F0"/>
-            </w:tcBorders>
-          </w:tcPr>
-          <w:p>
-            <w:pPr>
-              <w:jc w:val="center"/>
-            </w:pPr>
-            <w:r>
-              <w:rPr>
-                <w:rFonts w:ascii="Prompt" w:hAnsi="Prompt"/>
-                <w:b/>
-                <w:i w:val="0"/>
-                <w:color w:val="047857"/>
-                <w:sz w:val="19"/>
-              </w:rPr>
-              <w:t>✅ ครบถ้วน 100%</w:t>
-            </w:r>
-          </w:p>
-        </w:tc>
-      </w:tr>
-      <w:tr>
-        <w:tc>
-          <w:tcPr>
-            <w:tcW w:type="dxa" w:w="1872"/>
-            <w:shd w:fill="F8FAFC"/>
-            <w:tcMar>
-              <w:top w:w="100" w:type="dxa"/>
-              <w:bottom w:w="100" w:type="dxa"/>
-              <w:left w:w="120" w:type="dxa"/>
-              <w:right w:w="120" w:type="dxa"/>
-            </w:tcMar>
-            <w:tcBorders>
-              <w:top w:val="single" w:sz="4" w:space="0" w:color="E2E8F0"/>
-              <w:bottom w:val="single" w:sz="4" w:space="0" w:color="E2E8F0"/>
-              <w:left w:val="single" w:sz="4" w:space="0" w:color="E2E8F0"/>
-              <w:right w:val="single" w:sz="4" w:space="0" w:color="E2E8F0"/>
-            </w:tcBorders>
-          </w:tcPr>
-          <w:p>
-            <w:pPr>
-              <w:jc w:val="center"/>
-            </w:pPr>
-            <w:r>
-              <w:rPr>
-                <w:rFonts w:ascii="Prompt" w:hAnsi="Prompt"/>
-                <w:b w:val="0"/>
-                <w:i w:val="0"/>
-                <w:color w:val="334155"/>
-                <w:sz w:val="19"/>
-              </w:rPr>
-              <w:t>ขอบเขตเนื้อหา Future Skills</w:t>
-            </w:r>
-          </w:p>
-        </w:tc>
-        <w:tc>
-          <w:tcPr>
-            <w:tcW w:type="dxa" w:w="3168"/>
-            <w:shd w:fill="F8FAFC"/>
-            <w:tcMar>
-              <w:top w:w="100" w:type="dxa"/>
-              <w:bottom w:w="100" w:type="dxa"/>
-              <w:left w:w="120" w:type="dxa"/>
-              <w:right w:w="120" w:type="dxa"/>
-            </w:tcMar>
-            <w:tcBorders>
-              <w:top w:val="single" w:sz="4" w:space="0" w:color="E2E8F0"/>
-              <w:bottom w:val="single" w:sz="4" w:space="0" w:color="E2E8F0"/>
-              <w:left w:val="single" w:sz="4" w:space="0" w:color="E2E8F0"/>
-              <w:right w:val="single" w:sz="4" w:space="0" w:color="E2E8F0"/>
-            </w:tcBorders>
-          </w:tcPr>
-          <w:p>
-            <w:pPr>
-              <w:jc w:val="left"/>
-            </w:pPr>
-            <w:r>
-              <w:rPr>
-                <w:rFonts w:ascii="Prompt" w:hAnsi="Prompt"/>
-                <w:b w:val="0"/>
-                <w:i w:val="0"/>
-                <w:color w:val="334155"/>
-                <w:sz w:val="19"/>
-              </w:rPr>
-              <w:t>การตัดสินใจ / มองหาโอกาส / บริหารด้วยข้อมูล / บูรณาการดิจิทัล</w:t>
-            </w:r>
-          </w:p>
-        </w:tc>
-        <w:tc>
-          <w:tcPr>
-            <w:tcW w:type="dxa" w:w="3168"/>
-            <w:shd w:fill="F8FAFC"/>
-            <w:tcMar>
-              <w:top w:w="100" w:type="dxa"/>
-              <w:bottom w:w="100" w:type="dxa"/>
-              <w:left w:w="120" w:type="dxa"/>
-              <w:right w:w="120" w:type="dxa"/>
-            </w:tcMar>
-            <w:tcBorders>
-              <w:top w:val="single" w:sz="4" w:space="0" w:color="E2E8F0"/>
-              <w:bottom w:val="single" w:sz="4" w:space="0" w:color="E2E8F0"/>
-              <w:left w:val="single" w:sz="4" w:space="0" w:color="E2E8F0"/>
-              <w:right w:val="single" w:sz="4" w:space="0" w:color="E2E8F0"/>
-            </w:tcBorders>
-          </w:tcPr>
-          <w:p>
-            <w:pPr>
-              <w:jc w:val="left"/>
-            </w:pPr>
-            <w:r>
-              <w:rPr>
-                <w:rFonts w:ascii="Prompt" w:hAnsi="Prompt"/>
-                <w:b w:val="0"/>
-                <w:i w:val="0"/>
-                <w:color w:val="334155"/>
-                <w:sz w:val="19"/>
-              </w:rPr>
-              <w:t>ครอบคลุม 4 ทักษะอนาคตตรงตามคลัง TalentLibrary 100%</w:t>
-            </w:r>
-          </w:p>
-        </w:tc>
-        <w:tc>
-          <w:tcPr>
-            <w:tcW w:type="dxa" w:w="1152"/>
-            <w:shd w:fill="F8FAFC"/>
-            <w:tcMar>
-              <w:top w:w="100" w:type="dxa"/>
-              <w:bottom w:w="100" w:type="dxa"/>
-              <w:left w:w="120" w:type="dxa"/>
-              <w:right w:w="120" w:type="dxa"/>
-            </w:tcMar>
-            <w:tcBorders>
-              <w:top w:val="single" w:sz="4" w:space="0" w:color="E2E8F0"/>
-              <w:bottom w:val="single" w:sz="4" w:space="0" w:color="E2E8F0"/>
-              <w:left w:val="single" w:sz="4" w:space="0" w:color="E2E8F0"/>
-              <w:right w:val="single" w:sz="4" w:space="0" w:color="E2E8F0"/>
-            </w:tcBorders>
-          </w:tcPr>
-          <w:p>
-            <w:pPr>
-              <w:jc w:val="center"/>
-            </w:pPr>
-            <w:r>
-              <w:rPr>
-                <w:rFonts w:ascii="Prompt" w:hAnsi="Prompt"/>
-                <w:b/>
-                <w:i w:val="0"/>
-                <w:color w:val="047857"/>
-                <w:sz w:val="19"/>
-              </w:rPr>
-              <w:t>✅ ครบถ้วน 100%</w:t>
-            </w:r>
-          </w:p>
-        </w:tc>
-      </w:tr>
-      <w:tr>
-        <w:tc>
-          <w:tcPr>
-            <w:tcW w:type="dxa" w:w="1872"/>
-            <w:shd w:fill="FFFFFF"/>
-            <w:tcMar>
-              <w:top w:w="100" w:type="dxa"/>
-              <w:bottom w:w="100" w:type="dxa"/>
-              <w:left w:w="120" w:type="dxa"/>
-              <w:right w:w="120" w:type="dxa"/>
-            </w:tcMar>
-            <w:tcBorders>
-              <w:top w:val="single" w:sz="4" w:space="0" w:color="E2E8F0"/>
-              <w:bottom w:val="single" w:sz="4" w:space="0" w:color="E2E8F0"/>
-              <w:left w:val="single" w:sz="4" w:space="0" w:color="E2E8F0"/>
-              <w:right w:val="single" w:sz="4" w:space="0" w:color="E2E8F0"/>
-            </w:tcBorders>
-          </w:tcPr>
-          <w:p>
-            <w:pPr>
-              <w:jc w:val="center"/>
-            </w:pPr>
-            <w:r>
-              <w:rPr>
-                <w:rFonts w:ascii="Prompt" w:hAnsi="Prompt"/>
-                <w:b w:val="0"/>
-                <w:i w:val="0"/>
-                <w:color w:val="334155"/>
-                <w:sz w:val="19"/>
-              </w:rPr>
-              <w:t>ข้อ 4.2.1 (1) ระดับปฏิบัติการ</w:t>
-            </w:r>
-          </w:p>
-        </w:tc>
-        <w:tc>
-          <w:tcPr>
-            <w:tcW w:type="dxa" w:w="3168"/>
-            <w:shd w:fill="FFFFFF"/>
-            <w:tcMar>
-              <w:top w:w="100" w:type="dxa"/>
-              <w:bottom w:w="100" w:type="dxa"/>
-              <w:left w:w="120" w:type="dxa"/>
-              <w:right w:w="120" w:type="dxa"/>
-            </w:tcMar>
-            <w:tcBorders>
-              <w:top w:val="single" w:sz="4" w:space="0" w:color="E2E8F0"/>
-              <w:bottom w:val="single" w:sz="4" w:space="0" w:color="E2E8F0"/>
-              <w:left w:val="single" w:sz="4" w:space="0" w:color="E2E8F0"/>
-              <w:right w:val="single" w:sz="4" w:space="0" w:color="E2E8F0"/>
-            </w:tcBorders>
-          </w:tcPr>
-          <w:p>
-            <w:pPr>
-              <w:jc w:val="left"/>
-            </w:pPr>
-            <w:r>
-              <w:rPr>
-                <w:rFonts w:ascii="Prompt" w:hAnsi="Prompt"/>
-                <w:b w:val="0"/>
-                <w:i w:val="0"/>
-                <w:color w:val="334155"/>
-                <w:sz w:val="19"/>
-              </w:rPr>
-              <w:t>พนักงาน C4 - C9 ไม่ต่ำกว่า 5 วิชา (วิชาละไม่ต่ำกว่า 1 ชม.)</w:t>
-            </w:r>
-          </w:p>
-        </w:tc>
-        <w:tc>
-          <w:tcPr>
-            <w:tcW w:type="dxa" w:w="3168"/>
-            <w:shd w:fill="FFFFFF"/>
-            <w:tcMar>
-              <w:top w:w="100" w:type="dxa"/>
-              <w:bottom w:w="100" w:type="dxa"/>
-              <w:left w:w="120" w:type="dxa"/>
-              <w:right w:w="120" w:type="dxa"/>
-            </w:tcMar>
-            <w:tcBorders>
-              <w:top w:val="single" w:sz="4" w:space="0" w:color="E2E8F0"/>
-              <w:bottom w:val="single" w:sz="4" w:space="0" w:color="E2E8F0"/>
-              <w:left w:val="single" w:sz="4" w:space="0" w:color="E2E8F0"/>
-              <w:right w:val="single" w:sz="4" w:space="0" w:color="E2E8F0"/>
-            </w:tcBorders>
-          </w:tcPr>
-          <w:p>
-            <w:pPr>
-              <w:jc w:val="left"/>
-            </w:pPr>
-            <w:r>
-              <w:rPr>
-                <w:rFonts w:ascii="Prompt" w:hAnsi="Prompt"/>
-                <w:b w:val="0"/>
-                <w:i w:val="0"/>
-                <w:color w:val="334155"/>
-                <w:sz w:val="19"/>
-              </w:rPr>
-              <w:t>เสนอ 5 วิชาหลัก (ชื่อตรงกับคลัง TalentLibrary วิชาละ 1 ชม.)</w:t>
-            </w:r>
-          </w:p>
-        </w:tc>
-        <w:tc>
-          <w:tcPr>
-            <w:tcW w:type="dxa" w:w="1152"/>
-            <w:shd w:fill="FFFFFF"/>
-            <w:tcMar>
-              <w:top w:w="100" w:type="dxa"/>
-              <w:bottom w:w="100" w:type="dxa"/>
-              <w:left w:w="120" w:type="dxa"/>
-              <w:right w:w="120" w:type="dxa"/>
-            </w:tcMar>
-            <w:tcBorders>
-              <w:top w:val="single" w:sz="4" w:space="0" w:color="E2E8F0"/>
-              <w:bottom w:val="single" w:sz="4" w:space="0" w:color="E2E8F0"/>
-              <w:left w:val="single" w:sz="4" w:space="0" w:color="E2E8F0"/>
-              <w:right w:val="single" w:sz="4" w:space="0" w:color="E2E8F0"/>
-            </w:tcBorders>
-          </w:tcPr>
-          <w:p>
-            <w:pPr>
-              <w:jc w:val="center"/>
-            </w:pPr>
-            <w:r>
-              <w:rPr>
-                <w:rFonts w:ascii="Prompt" w:hAnsi="Prompt"/>
-                <w:b/>
-                <w:i w:val="0"/>
-                <w:color w:val="047857"/>
-                <w:sz w:val="19"/>
-              </w:rPr>
-              <w:t>✅ ครบถ้วน 100%</w:t>
-            </w:r>
-          </w:p>
-        </w:tc>
-      </w:tr>
-      <w:tr>
-        <w:tc>
-          <w:tcPr>
-            <w:tcW w:type="dxa" w:w="1872"/>
-            <w:shd w:fill="F8FAFC"/>
-            <w:tcMar>
-              <w:top w:w="100" w:type="dxa"/>
-              <w:bottom w:w="100" w:type="dxa"/>
-              <w:left w:w="120" w:type="dxa"/>
-              <w:right w:w="120" w:type="dxa"/>
-            </w:tcMar>
-            <w:tcBorders>
-              <w:top w:val="single" w:sz="4" w:space="0" w:color="E2E8F0"/>
-              <w:bottom w:val="single" w:sz="4" w:space="0" w:color="E2E8F0"/>
-              <w:left w:val="single" w:sz="4" w:space="0" w:color="E2E8F0"/>
-              <w:right w:val="single" w:sz="4" w:space="0" w:color="E2E8F0"/>
-            </w:tcBorders>
-          </w:tcPr>
-          <w:p>
-            <w:pPr>
-              <w:jc w:val="center"/>
-            </w:pPr>
-            <w:r>
-              <w:rPr>
-                <w:rFonts w:ascii="Prompt" w:hAnsi="Prompt"/>
-                <w:b w:val="0"/>
-                <w:i w:val="0"/>
-                <w:color w:val="334155"/>
-                <w:sz w:val="19"/>
-              </w:rPr>
-              <w:t>ข้อ 4.2.1 (2) ระดับบริหาร</w:t>
-            </w:r>
-          </w:p>
-        </w:tc>
-        <w:tc>
-          <w:tcPr>
-            <w:tcW w:type="dxa" w:w="3168"/>
-            <w:shd w:fill="F8FAFC"/>
-            <w:tcMar>
-              <w:top w:w="100" w:type="dxa"/>
-              <w:bottom w:w="100" w:type="dxa"/>
-              <w:left w:w="120" w:type="dxa"/>
-              <w:right w:w="120" w:type="dxa"/>
-            </w:tcMar>
-            <w:tcBorders>
-              <w:top w:val="single" w:sz="4" w:space="0" w:color="E2E8F0"/>
-              <w:bottom w:val="single" w:sz="4" w:space="0" w:color="E2E8F0"/>
-              <w:left w:val="single" w:sz="4" w:space="0" w:color="E2E8F0"/>
-              <w:right w:val="single" w:sz="4" w:space="0" w:color="E2E8F0"/>
-            </w:tcBorders>
-          </w:tcPr>
-          <w:p>
-            <w:pPr>
-              <w:jc w:val="left"/>
-            </w:pPr>
-            <w:r>
-              <w:rPr>
-                <w:rFonts w:ascii="Prompt" w:hAnsi="Prompt"/>
-                <w:b w:val="0"/>
-                <w:i w:val="0"/>
-                <w:color w:val="334155"/>
-                <w:sz w:val="19"/>
-              </w:rPr>
-              <w:t>พนักงาน C10 - C13 ไม่ต่ำกว่า 5 วิชา (วิชาละไม่ต่ำกว่า 1 ชม.)</w:t>
-            </w:r>
-          </w:p>
-        </w:tc>
-        <w:tc>
-          <w:tcPr>
-            <w:tcW w:type="dxa" w:w="3168"/>
-            <w:shd w:fill="F8FAFC"/>
-            <w:tcMar>
-              <w:top w:w="100" w:type="dxa"/>
-              <w:bottom w:w="100" w:type="dxa"/>
-              <w:left w:w="120" w:type="dxa"/>
-              <w:right w:w="120" w:type="dxa"/>
-            </w:tcMar>
-            <w:tcBorders>
-              <w:top w:val="single" w:sz="4" w:space="0" w:color="E2E8F0"/>
-              <w:bottom w:val="single" w:sz="4" w:space="0" w:color="E2E8F0"/>
-              <w:left w:val="single" w:sz="4" w:space="0" w:color="E2E8F0"/>
-              <w:right w:val="single" w:sz="4" w:space="0" w:color="E2E8F0"/>
-            </w:tcBorders>
-          </w:tcPr>
-          <w:p>
-            <w:pPr>
-              <w:jc w:val="left"/>
-            </w:pPr>
-            <w:r>
-              <w:rPr>
-                <w:rFonts w:ascii="Prompt" w:hAnsi="Prompt"/>
-                <w:b w:val="0"/>
-                <w:i w:val="0"/>
-                <w:color w:val="334155"/>
-                <w:sz w:val="19"/>
-              </w:rPr>
-              <w:t>เสนอ 5 วิชาหลัก (ชื่อตรงกับคลัง TalentLibrary วิชาละ 1 ชม.)</w:t>
-            </w:r>
-          </w:p>
-        </w:tc>
-        <w:tc>
-          <w:tcPr>
-            <w:tcW w:type="dxa" w:w="1152"/>
-            <w:shd w:fill="F8FAFC"/>
-            <w:tcMar>
-              <w:top w:w="100" w:type="dxa"/>
-              <w:bottom w:w="100" w:type="dxa"/>
-              <w:left w:w="120" w:type="dxa"/>
-              <w:right w:w="120" w:type="dxa"/>
-            </w:tcMar>
-            <w:tcBorders>
-              <w:top w:val="single" w:sz="4" w:space="0" w:color="E2E8F0"/>
-              <w:bottom w:val="single" w:sz="4" w:space="0" w:color="E2E8F0"/>
-              <w:left w:val="single" w:sz="4" w:space="0" w:color="E2E8F0"/>
-              <w:right w:val="single" w:sz="4" w:space="0" w:color="E2E8F0"/>
-            </w:tcBorders>
-          </w:tcPr>
-          <w:p>
-            <w:pPr>
-              <w:jc w:val="center"/>
-            </w:pPr>
-            <w:r>
-              <w:rPr>
-                <w:rFonts w:ascii="Prompt" w:hAnsi="Prompt"/>
-                <w:b/>
-                <w:i w:val="0"/>
-                <w:color w:val="047857"/>
-                <w:sz w:val="19"/>
-              </w:rPr>
-              <w:t>✅ ครบถ้วน 100%</w:t>
-            </w:r>
-          </w:p>
-        </w:tc>
-      </w:tr>
-      <w:tr>
-        <w:tc>
-          <w:tcPr>
-            <w:tcW w:type="dxa" w:w="1872"/>
-            <w:shd w:fill="FFFFFF"/>
-            <w:tcMar>
-              <w:top w:w="100" w:type="dxa"/>
-              <w:bottom w:w="100" w:type="dxa"/>
-              <w:left w:w="120" w:type="dxa"/>
-              <w:right w:w="120" w:type="dxa"/>
-            </w:tcMar>
-            <w:tcBorders>
-              <w:top w:val="single" w:sz="4" w:space="0" w:color="E2E8F0"/>
-              <w:bottom w:val="single" w:sz="4" w:space="0" w:color="E2E8F0"/>
-              <w:left w:val="single" w:sz="4" w:space="0" w:color="E2E8F0"/>
-              <w:right w:val="single" w:sz="4" w:space="0" w:color="E2E8F0"/>
-            </w:tcBorders>
-          </w:tcPr>
-          <w:p>
-            <w:pPr>
-              <w:jc w:val="center"/>
-            </w:pPr>
-            <w:r>
-              <w:rPr>
-                <w:rFonts w:ascii="Prompt" w:hAnsi="Prompt"/>
-                <w:b w:val="0"/>
-                <w:i w:val="0"/>
-                <w:color w:val="334155"/>
-                <w:sz w:val="19"/>
-              </w:rPr>
-              <w:t>ระบบประเมิน &amp; มาตรฐาน LMS</w:t>
-            </w:r>
-          </w:p>
-        </w:tc>
-        <w:tc>
-          <w:tcPr>
-            <w:tcW w:type="dxa" w:w="3168"/>
-            <w:shd w:fill="FFFFFF"/>
-            <w:tcMar>
-              <w:top w:w="100" w:type="dxa"/>
-              <w:bottom w:w="100" w:type="dxa"/>
-              <w:left w:w="120" w:type="dxa"/>
-              <w:right w:w="120" w:type="dxa"/>
-            </w:tcMar>
-            <w:tcBorders>
-              <w:top w:val="single" w:sz="4" w:space="0" w:color="E2E8F0"/>
-              <w:bottom w:val="single" w:sz="4" w:space="0" w:color="E2E8F0"/>
-              <w:left w:val="single" w:sz="4" w:space="0" w:color="E2E8F0"/>
-              <w:right w:val="single" w:sz="4" w:space="0" w:color="E2E8F0"/>
-            </w:tcBorders>
-          </w:tcPr>
-          <w:p>
-            <w:pPr>
-              <w:jc w:val="left"/>
-            </w:pPr>
-            <w:r>
-              <w:rPr>
-                <w:rFonts w:ascii="Prompt" w:hAnsi="Prompt"/>
-                <w:b w:val="0"/>
-                <w:i w:val="0"/>
-                <w:color w:val="334155"/>
-                <w:sz w:val="19"/>
-              </w:rPr>
-              <w:t>วัดผลการเรียนรู้ รองรับมาตรฐานการเชื่อมต่อ LMS</w:t>
-            </w:r>
-          </w:p>
-        </w:tc>
-        <w:tc>
-          <w:tcPr>
-            <w:tcW w:type="dxa" w:w="3168"/>
-            <w:shd w:fill="FFFFFF"/>
-            <w:tcMar>
-              <w:top w:w="100" w:type="dxa"/>
-              <w:bottom w:w="100" w:type="dxa"/>
-              <w:left w:w="120" w:type="dxa"/>
-              <w:right w:w="120" w:type="dxa"/>
-            </w:tcMar>
-            <w:tcBorders>
-              <w:top w:val="single" w:sz="4" w:space="0" w:color="E2E8F0"/>
-              <w:bottom w:val="single" w:sz="4" w:space="0" w:color="E2E8F0"/>
-              <w:left w:val="single" w:sz="4" w:space="0" w:color="E2E8F0"/>
-              <w:right w:val="single" w:sz="4" w:space="0" w:color="E2E8F0"/>
-            </w:tcBorders>
-          </w:tcPr>
-          <w:p>
-            <w:pPr>
-              <w:jc w:val="left"/>
-            </w:pPr>
-            <w:r>
-              <w:rPr>
-                <w:rFonts w:ascii="Prompt" w:hAnsi="Prompt"/>
-                <w:b w:val="0"/>
-                <w:i w:val="0"/>
-                <w:color w:val="334155"/>
-                <w:sz w:val="19"/>
-              </w:rPr>
-              <w:t>มาตรฐาน SCORM 1.2 / 2004 / xAPI มี Pre/Post test &amp; e-Certificate</w:t>
-            </w:r>
-          </w:p>
-        </w:tc>
-        <w:tc>
-          <w:tcPr>
-            <w:tcW w:type="dxa" w:w="1152"/>
-            <w:shd w:fill="FFFFFF"/>
-            <w:tcMar>
-              <w:top w:w="100" w:type="dxa"/>
-              <w:bottom w:w="100" w:type="dxa"/>
-              <w:left w:w="120" w:type="dxa"/>
-              <w:right w:w="120" w:type="dxa"/>
-            </w:tcMar>
-            <w:tcBorders>
-              <w:top w:val="single" w:sz="4" w:space="0" w:color="E2E8F0"/>
-              <w:bottom w:val="single" w:sz="4" w:space="0" w:color="E2E8F0"/>
-              <w:left w:val="single" w:sz="4" w:space="0" w:color="E2E8F0"/>
-              <w:right w:val="single" w:sz="4" w:space="0" w:color="E2E8F0"/>
-            </w:tcBorders>
-          </w:tcPr>
-          <w:p>
-            <w:pPr>
-              <w:jc w:val="center"/>
-            </w:pPr>
-            <w:r>
-              <w:rPr>
-                <w:rFonts w:ascii="Prompt" w:hAnsi="Prompt"/>
-                <w:b/>
-                <w:i w:val="0"/>
-                <w:color w:val="047857"/>
-                <w:sz w:val="19"/>
-              </w:rPr>
-              <w:t>✅ ครบถ้วน 100%</w:t>
-            </w:r>
-          </w:p>
-        </w:tc>
-      </w:tr>
-    </w:tbl>
     <w:p>
       <w:pPr>
         <w:spacing w:before="360" w:after="160" w:line="276" w:lineRule="auto"/>
@@ -957,7 +124,7 @@
           <w:color w:val="0284C5"/>
           <w:sz w:val="32"/>
         </w:rPr>
-        <w:t>บทที่ 2: รายชื่อสื่อการเรียนรู้ระดับปฏิบัติการ (C4 - C9) [ชื่อตรงคลัง 100%]</w:t>
+        <w:t>บทที่ 2: ข้อเสนอวิชาหลักสำหรับกลุ่มผู้เรียนระดับปฏิบัติการ (C4 - C9)</w:t>
       </w:r>
     </w:p>
     <w:p>
@@ -971,9 +138,9 @@
           <w:b/>
           <w:i w:val="0"/>
           <w:color w:val="0369A1"/>
-          <w:sz w:val="24"/>
+          <w:sz w:val="25"/>
         </w:rPr>
-        <w:t>2.1 [post#14201] การคิดเชิงวิพากษ์ในยุค AI * (Critical Thinking in the Age of AI)</w:t>
+        <w:t>[OP-SUBJECT-01] วิชาที่ 1: การตัดสินใจอย่างรอบคอบและการแก้ปัญหาซับซ้อนในยุคดิจิทัล (1 ชั่วโมง)</w:t>
       </w:r>
     </w:p>
     <w:p>
@@ -989,9 +156,9 @@
           <w:color w:val="047857"/>
           <w:sz w:val="20"/>
         </w:rPr>
-        <w:t>• สอดคล้องทักษะ: การตัดสินใจอย่างรอบคอบ &amp; การบูรณาการเทคโนโลยีดิจิทัล</w:t>
+        <w:t>• สอดคล้องทักษะ: การตัดสินใจอย่างรอบคอบ</w:t>
         <w:br/>
-        <w:t>• ระยะเวลาเรียน: 1 ชั่วโมง (4 บทเรียนย่อย) | ภาษา: เสียงบรรยายภาษาไทย 🇹🇭</w:t>
+        <w:t>• โครงสร้าง: วิชาหลัก 1 ชั่วโมง (รวม 4 บทเรียนย่อย บทเรียนละ 15 นาที)</w:t>
       </w:r>
     </w:p>
     <w:p>
@@ -1007,10 +174,87 @@
           <w:color w:val="334155"/>
           <w:sz w:val="20"/>
         </w:rPr>
-        <w:t>ภาพรวมเนื้อหา: เครื่องมือ AI สามารถช่วยเพิ่มประสิทธิภาพในการทำงานและจัดการงานที่ซ้ำซากจำเจได้อย่างมีนัยสำคัญ ช่วยให้พนักงานมีเวลาไปโฟกัสกับงานที่ต้องใช้ความคิดสร้างสรรค์มากขึ้น อย่างไรก็ตาม การปล่อยให้ AI ทำงานโดยปราศจากการควบคุมดูแลของมนุษย์อาจนำไปสู่ข้อมูลที่ไม่ถูกต้องและการตัดสินใจที่ผิดพลาดได้</w:t>
-        <w:br/>
-        <w:br/>
-        <w:t>เพื่อใช้ประโยชน์จากเครื่องมือ AI ให้ได้สูงสุด พนักงานจำเป็นต้องประเมินเนื้อหาที่สร้างด้วย AI อย่างมีวิจารณญาณ เนื่องจาก AI อาจประมวลผลจากข้อมูลที่มีคุณภาพต่ำ ซึ่งส่งผลให้เนื้อหาคลาดเคลื่อน มีอคติ หรือสร้างทัศนคติแบบเหมารวมที่เป็นอันตราย หลักสูตรนี้จะฝึกอบรมทีมงานเกี่ยวกับเทคนิคการตั้งคำถามเชิงวิเคราะห์ เช่น การตรวจสอบแหล่งที่มาของข้อมูล และส่งเสริมให้พนักงานใช้ดุลยพินิจของตนเองเพื่อตัดสินใจนำ AI มาประยุกต์ใช้ในองค์กรได้อย่างชาญฉลาดและปลอดภัยยิ่งขึ้น</w:t>
+        <w:t>วัตถุประสงค์: มุ่งเน้นสร้างกระบวนการคิดอย่างตั้งข้อสังเกต การวิเคราะห์เหตุและผลตามตรรกศาสตร์ และเทคนิคการแก้ปัญหาซับซ้อนในการทำงานประจำวันอย่างรอบคอบ</w:t>
+      </w:r>
+    </w:p>
+    <w:p>
+      <w:pPr>
+        <w:spacing w:before="40" w:after="40" w:line="276" w:lineRule="auto"/>
+        <w:jc w:val="left"/>
+      </w:pPr>
+      <w:r>
+        <w:rPr>
+          <w:rFonts w:ascii="Prompt" w:hAnsi="Prompt"/>
+          <w:b/>
+          <w:i w:val="0"/>
+          <w:color w:val="334155"/>
+          <w:sz w:val="20"/>
+        </w:rPr>
+        <w:t>บทเรียนย่อย (15 นาที x 4 บทเรียน) จากคลัง TalentLibrary:</w:t>
+      </w:r>
+    </w:p>
+    <w:p>
+      <w:pPr>
+        <w:spacing w:before="0" w:after="40" w:line="276" w:lineRule="auto"/>
+        <w:jc w:val="left"/>
+      </w:pPr>
+      <w:r>
+        <w:rPr>
+          <w:rFonts w:ascii="Prompt" w:hAnsi="Prompt"/>
+          <w:b w:val="0"/>
+          <w:i w:val="0"/>
+          <w:color w:val="334155"/>
+          <w:sz w:val="19"/>
+        </w:rPr>
+        <w:t xml:space="preserve">   - บทเรียนย่อยที่ 1.1 (15 นาที): [post#14201] การคิดเชิงวิพากษ์ในยุค AI * (Critical Thinking in the Age of AI)</w:t>
+      </w:r>
+    </w:p>
+    <w:p>
+      <w:pPr>
+        <w:spacing w:before="0" w:after="40" w:line="276" w:lineRule="auto"/>
+        <w:jc w:val="left"/>
+      </w:pPr>
+      <w:r>
+        <w:rPr>
+          <w:rFonts w:ascii="Prompt" w:hAnsi="Prompt"/>
+          <w:b w:val="0"/>
+          <w:i w:val="0"/>
+          <w:color w:val="334155"/>
+          <w:sz w:val="19"/>
+        </w:rPr>
+        <w:t xml:space="preserve">   - บทเรียนย่อยที่ 1.2 (15 นาที): [post#13187] การแก้ปัญหาที่ซับซ้อน: เทคนิคการแก้ปัญหา * (Complex Problem-Solving: Problem-Solving Techniques)</w:t>
+      </w:r>
+    </w:p>
+    <w:p>
+      <w:pPr>
+        <w:spacing w:before="0" w:after="40" w:line="276" w:lineRule="auto"/>
+        <w:jc w:val="left"/>
+      </w:pPr>
+      <w:r>
+        <w:rPr>
+          <w:rFonts w:ascii="Prompt" w:hAnsi="Prompt"/>
+          <w:b w:val="0"/>
+          <w:i w:val="0"/>
+          <w:color w:val="334155"/>
+          <w:sz w:val="19"/>
+        </w:rPr>
+        <w:t xml:space="preserve">   - บทเรียนย่อยที่ 1.3 (15 นาที): [post#1275] การสังเกตอย่างมีวิจารณญาณ * (Critical Observation)</w:t>
+      </w:r>
+    </w:p>
+    <w:p>
+      <w:pPr>
+        <w:spacing w:before="0" w:after="40" w:line="276" w:lineRule="auto"/>
+        <w:jc w:val="left"/>
+      </w:pPr>
+      <w:r>
+        <w:rPr>
+          <w:rFonts w:ascii="Prompt" w:hAnsi="Prompt"/>
+          <w:b w:val="0"/>
+          <w:i w:val="0"/>
+          <w:color w:val="334155"/>
+          <w:sz w:val="19"/>
+        </w:rPr>
+        <w:t xml:space="preserve">   - บทเรียนย่อยที่ 1.4 (15 นาที): [post#1281] การคิดอย่างมีตรรกะ * (Thinking Logically)</w:t>
       </w:r>
     </w:p>
     <w:p>
@@ -1024,9 +268,9 @@
           <w:b/>
           <w:i w:val="0"/>
           <w:color w:val="0369A1"/>
-          <w:sz w:val="24"/>
+          <w:sz w:val="25"/>
         </w:rPr>
-        <w:t>2.2 [post#9044] การวิเคราะห์ข้อมูลเชิงคุณภาพและเชิงปริมาณ * (Qualitative &amp; Quantitative Data Analysis)</w:t>
+        <w:t>[OP-SUBJECT-02] วิชาที่ 2: การบริหารงานและวิเคราะห์ข้อมูลเพื่อการปฏิบัติงาน (1 ชั่วโมง)</w:t>
       </w:r>
     </w:p>
     <w:p>
@@ -1044,7 +288,7 @@
         </w:rPr>
         <w:t>• สอดคล้องทักษะ: บริหารงานด้วยข้อมูล</w:t>
         <w:br/>
-        <w:t>• ระยะเวลาเรียน: 1 ชั่วโมง (4 บทเรียนย่อย) | ภาษา: เสียงบรรยายภาษาไทย 🇹🇭</w:t>
+        <w:t>• โครงสร้าง: วิชาหลัก 1 ชั่วโมง (รวม 4 บทเรียนย่อย บทเรียนละ 15 นาที)</w:t>
       </w:r>
     </w:p>
     <w:p>
@@ -1060,10 +304,87 @@
           <w:color w:val="334155"/>
           <w:sz w:val="20"/>
         </w:rPr>
-        <w:t>ภาพรวมเนื้อหา: ข้อมูลเป็นสิ่งสำคัญและเป็นรากฐานของเกือบทุกสิ่ง ตั้งแต่วิทยาศาสตร์ เทคโนโลยี ไปจนถึงการดำเนินธุรกิจ ข้อมูลมีอยู่ทุกหนทุกแห่ง แต่การวิเคราะห์ข้อมูลอาจดูเป็นเรื่องยากหากคุณไม่รู้ว่าจะเริ่มต้นจากตรงไหน ทว่าการวิเคราะห์ข้อมูลนั้นมีความสำคัญไม่แพ้การมีข้อมูลอยู่กับตัว เพราะจะมีประโยชน์อะไรหากเรามีข้อมูลแต่กลับไม่รู้ว่าจะนำไปใช้ทำอะไรต่อ?</w:t>
-        <w:br/>
-        <w:br/>
-        <w:t>เมื่อต้องทำงานกับข้อมูล สิ่งสำคัญคือการรู้ว่าคุณสามารถวิเคราะห์ข้อมูลในรูปแบบใดได้บ้าง และวิธีใดที่จะช่วยให้คุณได้คำตอบที่ต้องการอย่างแท้จริง การเข้าใจความแตกต่างระหว่างข้อมูลเชิงคุณภาพและเชิงปริมาณจึงเป็นจุดเริ่มต้นที่ดี เนื่องจากข้อมูลทั้งสองประเภทต่างมีประโยชน์และแนวทางการใช้งานที่เฉพาะตัว หลักสูตรนี้จะช่วยให้ทีมงานของคุณเข้าใจภาพรวมของความแตกต่างระหว่างการวิเคราะห์ข้อมูลเชิงคุณภาพและเชิงปริมาณ รวมถึงเข้าใจว่าควรเลือกใช้ข้อมูลแต่ละประเภทในสถานการณ์ใดจึงจะเกิดประโยชน์สูงสุด</w:t>
+        <w:t>วัตถุประสงค์: เสริมสร้างทักษะการนำข้อมูลตัวเลขและข้อมูลพฤติกรรมมาจัดทำสรุปรายงาน วิเคราะห์การบริการ และใช้ข้อมูลประกอบการตัดสินใจในงานประจำ</w:t>
+      </w:r>
+    </w:p>
+    <w:p>
+      <w:pPr>
+        <w:spacing w:before="40" w:after="40" w:line="276" w:lineRule="auto"/>
+        <w:jc w:val="left"/>
+      </w:pPr>
+      <w:r>
+        <w:rPr>
+          <w:rFonts w:ascii="Prompt" w:hAnsi="Prompt"/>
+          <w:b/>
+          <w:i w:val="0"/>
+          <w:color w:val="334155"/>
+          <w:sz w:val="20"/>
+        </w:rPr>
+        <w:t>บทเรียนย่อย (15 นาที x 4 บทเรียน) จากคลัง TalentLibrary:</w:t>
+      </w:r>
+    </w:p>
+    <w:p>
+      <w:pPr>
+        <w:spacing w:before="0" w:after="40" w:line="276" w:lineRule="auto"/>
+        <w:jc w:val="left"/>
+      </w:pPr>
+      <w:r>
+        <w:rPr>
+          <w:rFonts w:ascii="Prompt" w:hAnsi="Prompt"/>
+          <w:b w:val="0"/>
+          <w:i w:val="0"/>
+          <w:color w:val="334155"/>
+          <w:sz w:val="19"/>
+        </w:rPr>
+        <w:t xml:space="preserve">   - บทเรียนย่อยที่ 2.1 (15 นาที): [post#9044] การวิเคราะห์ข้อมูลเชิงคุณภาพและเชิงปริมาณ * (Qualitative &amp; Quantitative Data Analysis)</w:t>
+      </w:r>
+    </w:p>
+    <w:p>
+      <w:pPr>
+        <w:spacing w:before="0" w:after="40" w:line="276" w:lineRule="auto"/>
+        <w:jc w:val="left"/>
+      </w:pPr>
+      <w:r>
+        <w:rPr>
+          <w:rFonts w:ascii="Prompt" w:hAnsi="Prompt"/>
+          <w:b w:val="0"/>
+          <w:i w:val="0"/>
+          <w:color w:val="334155"/>
+          <w:sz w:val="19"/>
+        </w:rPr>
+        <w:t xml:space="preserve">   - บทเรียนย่อยที่ 2.2 (15 นาที): [post#10895] การใช้ข้อมูลในการบริการลูกค้า * (Using Data in Customer Service)</w:t>
+      </w:r>
+    </w:p>
+    <w:p>
+      <w:pPr>
+        <w:spacing w:before="0" w:after="40" w:line="276" w:lineRule="auto"/>
+        <w:jc w:val="left"/>
+      </w:pPr>
+      <w:r>
+        <w:rPr>
+          <w:rFonts w:ascii="Prompt" w:hAnsi="Prompt"/>
+          <w:b w:val="0"/>
+          <w:i w:val="0"/>
+          <w:color w:val="334155"/>
+          <w:sz w:val="19"/>
+        </w:rPr>
+        <w:t xml:space="preserve">   - บทเรียนย่อยที่ 2.3 (15 นาที): [post#10892] KPI สำหรับทีมบริการลูกค้า * (KPIs for Customer Service Teams)</w:t>
+      </w:r>
+    </w:p>
+    <w:p>
+      <w:pPr>
+        <w:spacing w:before="0" w:after="40" w:line="276" w:lineRule="auto"/>
+        <w:jc w:val="left"/>
+      </w:pPr>
+      <w:r>
+        <w:rPr>
+          <w:rFonts w:ascii="Prompt" w:hAnsi="Prompt"/>
+          <w:b w:val="0"/>
+          <w:i w:val="0"/>
+          <w:color w:val="334155"/>
+          <w:sz w:val="19"/>
+        </w:rPr>
+        <w:t xml:space="preserve">   - บทเรียนย่อยที่ 2.4 (15 นาที): [post#9045] เทคนิคการวิเคราะห์ข้อมูลเชิงอนุมานและเชิงคาดการณ์ * (Inferential and Predictive Data Analysis Techniques)</w:t>
       </w:r>
     </w:p>
     <w:p>
@@ -1077,9 +398,9 @@
           <w:b/>
           <w:i w:val="0"/>
           <w:color w:val="0369A1"/>
-          <w:sz w:val="24"/>
+          <w:sz w:val="25"/>
         </w:rPr>
-        <w:t>2.3 [post#12159] ChatGPT: การพัฒนาตนเองและการเติบโตในสายอาชีพ * (ChatGPT: Personal Development and Growing Your Career)</w:t>
+        <w:t>[OP-SUBJECT-03] วิชาที่ 3: การประยุกต์ใช้ AI และเครื่องมือดิจิทัลเพิ่มประสิทธิภาพงาน (1 ชั่วโมง)</w:t>
       </w:r>
     </w:p>
     <w:p>
@@ -1097,7 +418,7 @@
         </w:rPr>
         <w:t>• สอดคล้องทักษะ: การบูรณาการทำงานด้วยเทคโนโลยีดิจิทัล</w:t>
         <w:br/>
-        <w:t>• ระยะเวลาเรียน: 1 ชั่วโมง (4 บทเรียนย่อย) | ภาษา: เสียงบรรยายภาษาไทย 🇹🇭</w:t>
+        <w:t>• โครงสร้าง: วิชาหลัก 1 ชั่วโมง (รวม 4 บทเรียนย่อย บทเรียนละ 15 นาที)</w:t>
       </w:r>
     </w:p>
     <w:p>
@@ -1113,7 +434,87 @@
           <w:color w:val="334155"/>
           <w:sz w:val="20"/>
         </w:rPr>
-        <w:t>ภาพรวมเนื้อหา: การส่งเสริมให้พนักงานดึงศักยภาพสูงสุดของตนเองออกมา ทั้งในด้านการทำงานและชีวิตส่วนตัวนั้นต้องอาศัยความพยายามอย่างมาก แต่นั่นไม่ได้หมายความว่าพวกเขาจะไม่สามารถใช้เทคโนโลยีเพื่อช่วยให้การพัฒนาตนเองในบางด้านง่ายขึ้นได้ ChatGPT เป็นเครื่องมือที่ยอดเยี่ยมที่จะช่วยให้พวกเขาอยู่ในจุดที่ได้เปรียบยิ่งขึ้นเมื่อมองหาโอกาสทางอาชีพใหม่ๆ รวมถึงช่วยสนับสนุนการพัฒนาตนเองในด้านต่างๆ หลักสูตรนี้จะช่วยให้พนักงานของคุณสามารถใช้ ChatGPT เพื่ออัปเดตเรซูเมและโปรไฟล์ LinkedIn รวมถึงสร้างจดหมายนำสมัครงาน (Cover Letter) ได้อย่างมีประสิทธิภาพ นอกจากนี้ ยังช่วยให้พวกเขาใช้ ChatGPT ในการเตรียมตัวสัมภาษณ์งานและพัฒนาทักษะส่วนบุคคล ซึ่งครอบคลุมถึงการตั้งเป้าหมายและการติดตามผล ความฉลาดทางอารมณ์ และการบริหารเวลา โดยวิดีโอแต่ละตอนจะเน้นเฉพาะเจาะจงในแต่ละหัวข้อ เพื่อให้พนักงานสามารถเลือกเรียนรู้สิ่งที่ต้องการได้ตามความเร็วและจังหวะที่ตนเองสะดวก</w:t>
+        <w:t>วัตถุประสงค์: เพื่อให้ผู้ปฏิบัติงานสามารถประยุกต์ใช้ AI, ChatGPT และซอฟต์แวร์สมัยใหม่ในการเพิ่มความรวดเร็ว สรุปงาน ร่างเอกสาร และทำงานร่วมกันแบบดิจิทัล</w:t>
+      </w:r>
+    </w:p>
+    <w:p>
+      <w:pPr>
+        <w:spacing w:before="40" w:after="40" w:line="276" w:lineRule="auto"/>
+        <w:jc w:val="left"/>
+      </w:pPr>
+      <w:r>
+        <w:rPr>
+          <w:rFonts w:ascii="Prompt" w:hAnsi="Prompt"/>
+          <w:b/>
+          <w:i w:val="0"/>
+          <w:color w:val="334155"/>
+          <w:sz w:val="20"/>
+        </w:rPr>
+        <w:t>บทเรียนย่อย (15 นาที x 4 บทเรียน) จากคลัง TalentLibrary:</w:t>
+      </w:r>
+    </w:p>
+    <w:p>
+      <w:pPr>
+        <w:spacing w:before="0" w:after="40" w:line="276" w:lineRule="auto"/>
+        <w:jc w:val="left"/>
+      </w:pPr>
+      <w:r>
+        <w:rPr>
+          <w:rFonts w:ascii="Prompt" w:hAnsi="Prompt"/>
+          <w:b w:val="0"/>
+          <w:i w:val="0"/>
+          <w:color w:val="334155"/>
+          <w:sz w:val="19"/>
+        </w:rPr>
+        <w:t xml:space="preserve">   - บทเรียนย่อยที่ 3.1 (15 นาที): [post#12159] ChatGPT: การพัฒนาตนเองและการเติบโตในสายอาชีพ * (ChatGPT: Personal Development and Growing Your Career)</w:t>
+      </w:r>
+    </w:p>
+    <w:p>
+      <w:pPr>
+        <w:spacing w:before="0" w:after="40" w:line="276" w:lineRule="auto"/>
+        <w:jc w:val="left"/>
+      </w:pPr>
+      <w:r>
+        <w:rPr>
+          <w:rFonts w:ascii="Prompt" w:hAnsi="Prompt"/>
+          <w:b w:val="0"/>
+          <w:i w:val="0"/>
+          <w:color w:val="334155"/>
+          <w:sz w:val="19"/>
+        </w:rPr>
+        <w:t xml:space="preserve">   - บทเรียนย่อยที่ 3.2 (15 นาที): [post#10330] เครื่องมือเทคโนโลยีเพื่อการขาย * (Sales Tech Tools)</w:t>
+      </w:r>
+    </w:p>
+    <w:p>
+      <w:pPr>
+        <w:spacing w:before="0" w:after="40" w:line="276" w:lineRule="auto"/>
+        <w:jc w:val="left"/>
+      </w:pPr>
+      <w:r>
+        <w:rPr>
+          <w:rFonts w:ascii="Prompt" w:hAnsi="Prompt"/>
+          <w:b w:val="0"/>
+          <w:i w:val="0"/>
+          <w:color w:val="334155"/>
+          <w:sz w:val="19"/>
+        </w:rPr>
+        <w:t xml:space="preserve">   - บทเรียนย่อยที่ 3.3 (15 นาที): [post#2038] ผลกระทบของการฝึกอบรมต่อการเปลี่ยนแปลงทางดิจิทัล * (The Impact of Training on Digital Change)</w:t>
+      </w:r>
+    </w:p>
+    <w:p>
+      <w:pPr>
+        <w:spacing w:before="0" w:after="40" w:line="276" w:lineRule="auto"/>
+        <w:jc w:val="left"/>
+      </w:pPr>
+      <w:r>
+        <w:rPr>
+          <w:rFonts w:ascii="Prompt" w:hAnsi="Prompt"/>
+          <w:b w:val="0"/>
+          <w:i w:val="0"/>
+          <w:color w:val="334155"/>
+          <w:sz w:val="19"/>
+        </w:rPr>
+        <w:t xml:space="preserve">   - บทเรียนย่อยที่ 3.4 (15 นาที): [post#3011] การเสริมสร้างศักยภาพในการบริการลูกค้า * (Empowering Customer Service)</w:t>
       </w:r>
     </w:p>
     <w:p>
@@ -1127,9 +528,9 @@
           <w:b/>
           <w:i w:val="0"/>
           <w:color w:val="0369A1"/>
-          <w:sz w:val="24"/>
+          <w:sz w:val="25"/>
         </w:rPr>
-        <w:t>2.4 [post#10895] การใช้ข้อมูลในการบริการลูกค้า * (Using Data in Customer Service)</w:t>
+        <w:t>[OP-SUBJECT-04] วิชาที่ 4: การสังเกตการณ์เชิงวิเคราะห์และการมองหาโอกาสใหม่ในงาน (1 ชั่วโมง)</w:t>
       </w:r>
     </w:p>
     <w:p>
@@ -1145,9 +546,9 @@
           <w:color w:val="047857"/>
           <w:sz w:val="20"/>
         </w:rPr>
-        <w:t>• สอดคล้องทักษะ: บริหารงานด้วยข้อมูล &amp; การมองหาโอกาสและสร้างความแตกต่าง</w:t>
+        <w:t>• สอดคล้องทักษะ: การมองหาโอกาสและสร้างความแตกต่าง</w:t>
         <w:br/>
-        <w:t>• ระยะเวลาเรียน: 1 ชั่วโมง (4 บทเรียนย่อย) | ภาษา: เสียงบรรยายภาษาไทย 🇹🇭</w:t>
+        <w:t>• โครงสร้าง: วิชาหลัก 1 ชั่วโมง (รวม 4 บทเรียนย่อย บทเรียนละ 15 นาที)</w:t>
       </w:r>
     </w:p>
     <w:p>
@@ -1163,10 +564,87 @@
           <w:color w:val="334155"/>
           <w:sz w:val="20"/>
         </w:rPr>
-        <w:t>ภาพรวมเนื้อหา: การเก็บรวบรวมข้อมูลลูกค้าถือเป็นเรื่องปกติทั่วไปในปัจจุบัน ข้อมูลเหล่านี้มีประโยชน์ในการช่วยให้ผู้จัดการฝ่ายบริการลูกค้าเข้าใจกลุ่มลูกค้า ความต้องการของพวกเขา และแนวทางในการปรับปรุงพัฒนาให้ดียิ่งขึ้น ทว่าด้วยข้อมูลจำนวนมหาศาลที่ต้องนำมาวิเคราะห์ การตีความข้อมูลจึงอาจดูเป็นเรื่องที่น่าหนักใจ แล้วพวกเขาควรจะเริ่มต้นจากตรงไหนดี?</w:t>
-        <w:br/>
-        <w:br/>
-        <w:t>การใช้ข้อมูลในงานบริการลูกค้าเป็นสิ่งสำคัญอย่างยิ่ง ข้อมูลนี้ไม่เพียงแต่จะเป็นประโยชน์ต่อทีมบริการลูกค้าเท่านั้น แต่ยังสามารถนำไปใช้ในการปรับปรุงกลยุทธ์และขับเคลื่อนการเติบโตของทั้งองค์กรได้อีกด้วย และผู้จัดการของคุณสามารถปฏิบัติตามแนวทางปฏิบัติที่ดีที่สุดเพื่อใช้ประโยชน์จากข้อมูลให้ได้สูงสุด ซึ่งหลักสูตรนี้จะแสดงให้พวกเขาเห็นว่าต้องทำอย่างไร</w:t>
+        <w:t>วัตถุประสงค์: พัฒนาทักษะการค้นหาจุดคอขวด ข้อผิดพลาดในกระบวนการทำงาน การวิเคราะห์สาเหตุที่แท้จริงเพื่อเสนอไอเดียและสร้างโอกาสการทำงานใหม่ๆ</w:t>
+      </w:r>
+    </w:p>
+    <w:p>
+      <w:pPr>
+        <w:spacing w:before="40" w:after="40" w:line="276" w:lineRule="auto"/>
+        <w:jc w:val="left"/>
+      </w:pPr>
+      <w:r>
+        <w:rPr>
+          <w:rFonts w:ascii="Prompt" w:hAnsi="Prompt"/>
+          <w:b/>
+          <w:i w:val="0"/>
+          <w:color w:val="334155"/>
+          <w:sz w:val="20"/>
+        </w:rPr>
+        <w:t>บทเรียนย่อย (15 นาที x 4 บทเรียน) จากคลัง TalentLibrary:</w:t>
+      </w:r>
+    </w:p>
+    <w:p>
+      <w:pPr>
+        <w:spacing w:before="0" w:after="40" w:line="276" w:lineRule="auto"/>
+        <w:jc w:val="left"/>
+      </w:pPr>
+      <w:r>
+        <w:rPr>
+          <w:rFonts w:ascii="Prompt" w:hAnsi="Prompt"/>
+          <w:b w:val="0"/>
+          <w:i w:val="0"/>
+          <w:color w:val="334155"/>
+          <w:sz w:val="19"/>
+        </w:rPr>
+        <w:t xml:space="preserve">   - บทเรียนย่อยที่ 4.1 (15 นาที): [post#13196] การแก้ปัญหาที่ซับซ้อน: การวิเคราะห์หาสาเหตุที่แท้จริง * (Complex Problem-Solving: Root Cause Analysis)</w:t>
+      </w:r>
+    </w:p>
+    <w:p>
+      <w:pPr>
+        <w:spacing w:before="0" w:after="40" w:line="276" w:lineRule="auto"/>
+        <w:jc w:val="left"/>
+      </w:pPr>
+      <w:r>
+        <w:rPr>
+          <w:rFonts w:ascii="Prompt" w:hAnsi="Prompt"/>
+          <w:b w:val="0"/>
+          <w:i w:val="0"/>
+          <w:color w:val="334155"/>
+          <w:sz w:val="19"/>
+        </w:rPr>
+        <w:t xml:space="preserve">   - บทเรียนย่อยที่ 4.2 (15 นาที): [post#3027] ทำความเข้าใจสาเหตุที่ปิดการขายไม่ได้ * (Understand Why Deals are Lost)</w:t>
+      </w:r>
+    </w:p>
+    <w:p>
+      <w:pPr>
+        <w:spacing w:before="0" w:after="40" w:line="276" w:lineRule="auto"/>
+        <w:jc w:val="left"/>
+      </w:pPr>
+      <w:r>
+        <w:rPr>
+          <w:rFonts w:ascii="Prompt" w:hAnsi="Prompt"/>
+          <w:b w:val="0"/>
+          <w:i w:val="0"/>
+          <w:color w:val="334155"/>
+          <w:sz w:val="19"/>
+        </w:rPr>
+        <w:t xml:space="preserve">   - บทเรียนย่อยที่ 4.3 (15 นาที): [post#1294] การค้นหาข้อมูลและวิเคราะห์ผู้มีโอกาสเป็นลูกค้า * (Researching Your Prospect)</w:t>
+      </w:r>
+    </w:p>
+    <w:p>
+      <w:pPr>
+        <w:spacing w:before="0" w:after="40" w:line="276" w:lineRule="auto"/>
+        <w:jc w:val="left"/>
+      </w:pPr>
+      <w:r>
+        <w:rPr>
+          <w:rFonts w:ascii="Prompt" w:hAnsi="Prompt"/>
+          <w:b w:val="0"/>
+          <w:i w:val="0"/>
+          <w:color w:val="334155"/>
+          <w:sz w:val="19"/>
+        </w:rPr>
+        <w:t xml:space="preserve">   - บทเรียนย่อยที่ 4.4 (15 นาที): [post#1519] ความเท่าเทียมและความหลากหลาย * (Equality and Diversity)</w:t>
       </w:r>
     </w:p>
     <w:p>
@@ -1180,9 +658,9 @@
           <w:b/>
           <w:i w:val="0"/>
           <w:color w:val="0369A1"/>
-          <w:sz w:val="24"/>
+          <w:sz w:val="25"/>
         </w:rPr>
-        <w:t>2.5 [post#13187] การแก้ปัญหาที่ซับซ้อน: เทคนิคการแก้ปัญหา * (Complex Problem-Solving: Problem-Solving Techniques)</w:t>
+        <w:t>[OP-SUBJECT-05] วิชาที่ 5: การรับมือความไม่แน่นอนและการทำงานร่วมกันยุคใหม่ (1 ชั่วโมง)</w:t>
       </w:r>
     </w:p>
     <w:p>
@@ -1198,9 +676,9 @@
           <w:color w:val="047857"/>
           <w:sz w:val="20"/>
         </w:rPr>
-        <w:t>• สอดคล้องทักษะ: การตัดสินใจอย่างรอบคอบ &amp; การมองหาโอกาสและสร้างความแตกต่าง</w:t>
+        <w:t>• สอดคล้องทักษะ: การตัดสินใจอย่างรอบคอบ &amp; การมองหาโอกาส</w:t>
         <w:br/>
-        <w:t>• ระยะเวลาเรียน: 1 ชั่วโมง (4 บทเรียนย่อย) | ภาษา: เสียงบรรยายภาษาไทย 🇹🇭</w:t>
+        <w:t>• โครงสร้าง: วิชาหลัก 1 ชั่วโมง (รวม 4 บทเรียนย่อย บทเรียนละ 15 นาที)</w:t>
       </w:r>
     </w:p>
     <w:p>
@@ -1216,10 +694,87 @@
           <w:color w:val="334155"/>
           <w:sz w:val="20"/>
         </w:rPr>
-        <w:t>ภาพรวมเนื้อหา: ผู้บริหารระดับสูงขององค์กรคุณพร้อมที่จะรับมือกับความท้าทายในการทำงานในอนาคตแล้วหรือยัง? โลกธุรกิจเต็มไปด้วยความผันผวนและการเปลี่ยนแปลงที่คาดเดาไม่ได้ ดังนั้น การแก้ไขปัญหาอย่างรวดเร็วและสร้างสรรค์จึงเป็นสิ่งสำคัญอย่างยิ่ง ในสภาพแวดล้อมปัจจุบันที่ซับซ้อนและเปลี่ยนแปลงอย่างรวดเร็ว การมีแนวทางแก้ไขปัญหาที่มีประสิทธิภาพคือกุญแจสำคัญในการรักษาความได้เปรียบทางการแข่งขัน และเมื่อความท้าทายมีความซับซ้อนยิ่งขึ้น วิธีการแบบเดิมๆ ก็อาจใช้ไม่ได้ผลอีกต่อไป การฝึกฝนเทคนิคต่างๆ ให้เชี่ยวชาญ เช่น การสร้างสรรค์ไอเดีย (Idea Generation) การจัดทำแผนผังความคิด (Mind Mapping) การใช้เหตุผล (Reasoning) การคิดแบบแตกแขนง (Divergent Thinking) การทำสตอรี่บอร์ด (Storyboarding) การคิดย้อนกลับ (Reverse Thinking) และเครื่องมือ SCAMPER จะช่วยให้พวกเขาสามารถพัฒนาแนวทางแก้ไขปัญหาที่สร้างสรรค์เพื่อขับเคลื่อนธุรกิจให้เติบโตได้</w:t>
-        <w:br/>
-        <w:br/>
-        <w:t>หลักสูตรนี้จะสอนเทคนิคการแก้ปัญหาที่นำไปใช้ได้จริง ซึ่งจะช่วยให้ผู้บริหารและทีมงานค้นพบแนวทางแก้ไขที่ชาญฉลาดและวางแผนล่วงหน้าได้อย่างมีประสิทธิภาพ ตั้งแต่การระดมความคิดไปจนถึงการคิดในมุมมองใหม่ๆ วิธีการเหล่านี้จะช่วยให้พวกเขารับมือกับทุกปัญหาได้อย่างมั่นใจ</w:t>
+        <w:t>วัตถุประสงค์: สร้างความยืดหยุ่นในการทำงาน การรับมือกับสภาวะเปลี่ยนแปลง และการสื่อสารตัดสินใจร่วมกันในทีมอย่างมีประสิทธิภาพ</w:t>
+      </w:r>
+    </w:p>
+    <w:p>
+      <w:pPr>
+        <w:spacing w:before="40" w:after="40" w:line="276" w:lineRule="auto"/>
+        <w:jc w:val="left"/>
+      </w:pPr>
+      <w:r>
+        <w:rPr>
+          <w:rFonts w:ascii="Prompt" w:hAnsi="Prompt"/>
+          <w:b/>
+          <w:i w:val="0"/>
+          <w:color w:val="334155"/>
+          <w:sz w:val="20"/>
+        </w:rPr>
+        <w:t>บทเรียนย่อย (15 นาที x 4 บทเรียน) จากคลัง TalentLibrary:</w:t>
+      </w:r>
+    </w:p>
+    <w:p>
+      <w:pPr>
+        <w:spacing w:before="0" w:after="40" w:line="276" w:lineRule="auto"/>
+        <w:jc w:val="left"/>
+      </w:pPr>
+      <w:r>
+        <w:rPr>
+          <w:rFonts w:ascii="Prompt" w:hAnsi="Prompt"/>
+          <w:b w:val="0"/>
+          <w:i w:val="0"/>
+          <w:color w:val="334155"/>
+          <w:sz w:val="19"/>
+        </w:rPr>
+        <w:t xml:space="preserve">   - บทเรียนย่อยที่ 5.1 (15 นาที): [post#1284] การรับมือกับความไม่แน่นอน * (Dealing with Uncertainty)</w:t>
+      </w:r>
+    </w:p>
+    <w:p>
+      <w:pPr>
+        <w:spacing w:before="0" w:after="40" w:line="276" w:lineRule="auto"/>
+        <w:jc w:val="left"/>
+      </w:pPr>
+      <w:r>
+        <w:rPr>
+          <w:rFonts w:ascii="Prompt" w:hAnsi="Prompt"/>
+          <w:b w:val="0"/>
+          <w:i w:val="0"/>
+          <w:color w:val="334155"/>
+          <w:sz w:val="19"/>
+        </w:rPr>
+        <w:t xml:space="preserve">   - บทเรียนย่อยที่ 5.2 (15 นาที): [post#14240] การปรับตัวรับความเปลี่ยนแปลงในยุค AI * (Adapting to Change in the Age of AI)</w:t>
+      </w:r>
+    </w:p>
+    <w:p>
+      <w:pPr>
+        <w:spacing w:before="0" w:after="40" w:line="276" w:lineRule="auto"/>
+        <w:jc w:val="left"/>
+      </w:pPr>
+      <w:r>
+        <w:rPr>
+          <w:rFonts w:ascii="Prompt" w:hAnsi="Prompt"/>
+          <w:b w:val="0"/>
+          <w:i w:val="0"/>
+          <w:color w:val="334155"/>
+          <w:sz w:val="19"/>
+        </w:rPr>
+        <w:t xml:space="preserve">   - บทเรียนย่อยที่ 5.3 (15 นาที): [post#13194] การแก้ปัญหาที่ซับซ้อน: การคิดเชิงระบบ * (Complex Problem-Solving: Systems Thinking)</w:t>
+      </w:r>
+    </w:p>
+    <w:p>
+      <w:pPr>
+        <w:spacing w:before="0" w:after="40" w:line="276" w:lineRule="auto"/>
+        <w:jc w:val="left"/>
+      </w:pPr>
+      <w:r>
+        <w:rPr>
+          <w:rFonts w:ascii="Prompt" w:hAnsi="Prompt"/>
+          <w:b w:val="0"/>
+          <w:i w:val="0"/>
+          <w:color w:val="334155"/>
+          <w:sz w:val="19"/>
+        </w:rPr>
+        <w:t xml:space="preserve">   - บทเรียนย่อยที่ 5.4 (15 นาที): [post#1841] การหยุดชะงักทางดิจิทัล (Digital Disruption) * (Digital Disruption)</w:t>
       </w:r>
     </w:p>
     <w:p>
@@ -1240,7 +795,7 @@
           <w:color w:val="0284C5"/>
           <w:sz w:val="32"/>
         </w:rPr>
-        <w:t>บทที่ 3: รายชื่อสื่อการเรียนรู้ระดับบริหาร (C10 - C13) [ชื่อตรงคลัง 100%]</w:t>
+        <w:t>บทที่ 3: ข้อเสนอวิชาหลักสำหรับกลุ่มผู้เรียนระดับบริหาร (C10 - C13)</w:t>
       </w:r>
     </w:p>
     <w:p>
@@ -1254,9 +809,9 @@
           <w:b/>
           <w:i w:val="0"/>
           <w:color w:val="0369A1"/>
-          <w:sz w:val="24"/>
+          <w:sz w:val="25"/>
         </w:rPr>
-        <w:t>3.1 [post#14195] ความรอบรู้ด้าน AI สำหรับผู้นำ * (AI Literacy for Leaders)</w:t>
+        <w:t>[EXEC-SUBJECT-01] วิชาที่ 1: การนำองค์กรและภาวะผู้นำในยุคปัญญาประดิษฐ์ (1 ชั่วโมง)</w:t>
       </w:r>
     </w:p>
     <w:p>
@@ -1272,9 +827,9 @@
           <w:color w:val="047857"/>
           <w:sz w:val="20"/>
         </w:rPr>
-        <w:t>• สอดคล้องทักษะ: การบูรณาการทำงานด้วยเทคโนโลยีดิจิทัล &amp; การมองหาโอกาสและสร้างความแตกต่าง</w:t>
+        <w:t>• สอดคล้องทักษะ: การบูรณาการทำงานด้วยเทคโนโลยีดิจิทัล &amp; การมองหาโอกาส</w:t>
         <w:br/>
-        <w:t>• ระยะเวลาเรียน: 1 ชั่วโมง (4 บทเรียนย่อย) | ภาษา: เสียงบรรยายภาษาไทย 🇹🇭</w:t>
+        <w:t>• โครงสร้าง: วิชาหลัก 1 ชั่วโมง (รวม 4 บทเรียนย่อย บทเรียนละ 15 นาที)</w:t>
       </w:r>
     </w:p>
     <w:p>
@@ -1290,10 +845,87 @@
           <w:color w:val="334155"/>
           <w:sz w:val="20"/>
         </w:rPr>
-        <w:t>ภาพรวมเนื้อหา: ผู้นำต้องเผชิญกับการตัดสินใจที่ท้าทายในทุกๆ วัน รวมถึงการตัดสินใจเลือกนำ AI มาใช้ในองค์กร ปัจจุบันมีโมเดล AI จำนวนมากจนน่าสับสนให้เลือกสรร และยังสามารถนำไปประยุกต์ใช้กับธุรกิจได้หลากหลายรูปแบบ ด้วยความที่เป็นเทคโนโลยีใหม่ ผู้บริหารอาจรู้สึกขาดความมั่นใจในการตัดสินใจเกี่ยวกับ AI อย่างรอบด้านและมีความรับผิดชอบ</w:t>
-        <w:br/>
-        <w:br/>
-        <w:t>ข่าวดีก็คือ เราสามารถนำเคล็ดลับและกรอบการทำงานต่างๆ มาปรับใช้เพื่อประเมินและนำ AI ไปปฏิบัติจริงได้อย่างมีประสิทธิภาพ หากใช้งานอย่างเหมาะสม AI จะช่วยเพิ่มขีดความสามารถในการทำงานขององค์กรและยกระดับประสบการณ์ของลูกค้าได้ อย่างไรก็ตาม AI ก็อาจมีค่าใช้จ่ายที่สูงและมีประเด็นด้านคุณภาพของข้อมูล รวมถึงความเสี่ยงต่างๆ เช่น การรั่วไหลของข้อมูลและการปฏิบัติตามข้อกำหนด หลักสูตรนี้จะช่วยให้คุณประเมินการนำ AI มาใช้ได้อย่างรอบคอบ และมั่นใจได้ว่าทุกคนในองค์กรจะใช้งานเทคโนโลยีนี้อย่างมีความรับผิดชอบ</w:t>
+        <w:t>วัตถุประสงค์: มุ่งเน้นการสร้างความเข้าใจเชิงนโยบายเกี่ยวกับ AI การวางยุทธศาสตร์ปัญญาประดิษฐ์ ธรรมาภิบาลข้อมูล และการนำองค์กรในยุค AI</w:t>
+      </w:r>
+    </w:p>
+    <w:p>
+      <w:pPr>
+        <w:spacing w:before="40" w:after="40" w:line="276" w:lineRule="auto"/>
+        <w:jc w:val="left"/>
+      </w:pPr>
+      <w:r>
+        <w:rPr>
+          <w:rFonts w:ascii="Prompt" w:hAnsi="Prompt"/>
+          <w:b/>
+          <w:i w:val="0"/>
+          <w:color w:val="334155"/>
+          <w:sz w:val="20"/>
+        </w:rPr>
+        <w:t>บทเรียนย่อย (15 นาที x 4 บทเรียน) จากคลัง TalentLibrary:</w:t>
+      </w:r>
+    </w:p>
+    <w:p>
+      <w:pPr>
+        <w:spacing w:before="0" w:after="40" w:line="276" w:lineRule="auto"/>
+        <w:jc w:val="left"/>
+      </w:pPr>
+      <w:r>
+        <w:rPr>
+          <w:rFonts w:ascii="Prompt" w:hAnsi="Prompt"/>
+          <w:b w:val="0"/>
+          <w:i w:val="0"/>
+          <w:color w:val="334155"/>
+          <w:sz w:val="19"/>
+        </w:rPr>
+        <w:t xml:space="preserve">   - บทเรียนย่อยที่ 1.1 (15 นาที): [post#14195] ความรอบรู้ด้าน AI สำหรับผู้นำ * (AI Literacy for Leaders)</w:t>
+      </w:r>
+    </w:p>
+    <w:p>
+      <w:pPr>
+        <w:spacing w:before="0" w:after="40" w:line="276" w:lineRule="auto"/>
+        <w:jc w:val="left"/>
+      </w:pPr>
+      <w:r>
+        <w:rPr>
+          <w:rFonts w:ascii="Prompt" w:hAnsi="Prompt"/>
+          <w:b w:val="0"/>
+          <w:i w:val="0"/>
+          <w:color w:val="334155"/>
+          <w:sz w:val="19"/>
+        </w:rPr>
+        <w:t xml:space="preserve">   - บทเรียนย่อยที่ 1.2 (15 นาที): [post#14240] การปรับตัวรับความเปลี่ยนแปลงในยุค AI * (Adapting to Change in the Age of AI)</w:t>
+      </w:r>
+    </w:p>
+    <w:p>
+      <w:pPr>
+        <w:spacing w:before="0" w:after="40" w:line="276" w:lineRule="auto"/>
+        <w:jc w:val="left"/>
+      </w:pPr>
+      <w:r>
+        <w:rPr>
+          <w:rFonts w:ascii="Prompt" w:hAnsi="Prompt"/>
+          <w:b w:val="0"/>
+          <w:i w:val="0"/>
+          <w:color w:val="334155"/>
+          <w:sz w:val="19"/>
+        </w:rPr>
+        <w:t xml:space="preserve">   - บทเรียนย่อยที่ 1.3 (15 นาที): [post#1800] กลยุทธ์การเปลี่ยนผ่านสู่ยุคดิจิทัลคืออะไร * (What is a Digital Transformation Strategy?)</w:t>
+      </w:r>
+    </w:p>
+    <w:p>
+      <w:pPr>
+        <w:spacing w:before="0" w:after="40" w:line="276" w:lineRule="auto"/>
+        <w:jc w:val="left"/>
+      </w:pPr>
+      <w:r>
+        <w:rPr>
+          <w:rFonts w:ascii="Prompt" w:hAnsi="Prompt"/>
+          <w:b w:val="0"/>
+          <w:i w:val="0"/>
+          <w:color w:val="334155"/>
+          <w:sz w:val="19"/>
+        </w:rPr>
+        <w:t xml:space="preserve">   - บทเรียนย่อยที่ 1.4 (15 นาที): [post#1841] การหยุดชะงักทางดิจิทัล (Digital Disruption) * (Digital Disruption)</w:t>
       </w:r>
     </w:p>
     <w:p>
@@ -1307,9 +939,9 @@
           <w:b/>
           <w:i w:val="0"/>
           <w:color w:val="0369A1"/>
-          <w:sz w:val="24"/>
+          <w:sz w:val="25"/>
         </w:rPr>
-        <w:t>3.2 [post#13156] การแก้ปัญหาที่ซับซ้อน: การวางแผนและการวิเคราะห์สถานการณ์จำลอง * (Complex Problem-Solving: Scenario Planning and Analysis)</w:t>
+        <w:t>[EXEC-SUBJECT-02] วิชาที่ 2: การวางแผนกลยุทธ์ตามสถานการณ์และการตัดสินใจเชิงบริหาร (1 ชั่วโมง)</w:t>
       </w:r>
     </w:p>
     <w:p>
@@ -1325,9 +957,9 @@
           <w:color w:val="047857"/>
           <w:sz w:val="20"/>
         </w:rPr>
-        <w:t>• สอดคล้องทักษะ: การตัดสินใจอย่างรอบคอบ &amp; บริหารงานด้วยข้อมูล</w:t>
+        <w:t>• สอดคล้องทักษะ: การตัดสินใจอย่างรอบคอบ</w:t>
         <w:br/>
-        <w:t>• ระยะเวลาเรียน: 1 ชั่วโมง (4 บทเรียนย่อย) | ภาษา: เสียงบรรยายภาษาไทย 🇹🇭</w:t>
+        <w:t>• โครงสร้าง: วิชาหลัก 1 ชั่วโมง (รวม 4 บทเรียนย่อย บทเรียนละ 15 นาที)</w:t>
       </w:r>
     </w:p>
     <w:p>
@@ -1343,7 +975,87 @@
           <w:color w:val="334155"/>
           <w:sz w:val="20"/>
         </w:rPr>
-        <w:t>ภาพรวมเนื้อหา: แม้ว่าผู้จัดการและทีมงานของคุณอาจกำลังดำเนินงานไปในทิศทางที่ถูกต้องในปัจจุบัน แต่พวกเขาตระหนักถึงปัจจัยภายนอกที่อาจส่งผลกระทบในอนาคตแล้วหรือยัง? โลกธุรกิจในปัจจุบันเต็มไปด้วยความไม่แน่นอนและความซับซ้อน ด้วยเทคโนโลยีที่พัฒนาอย่างไม่หยุดยั้ง การเติบโตอย่างก้าวกระโดดของปัญญาประดิษฐ์ (AI) และกฎหมายที่เปลี่ยนแปลงอยู่เสมอ พวกเขาจึงต้องหากลยุทธ์ในการวางแผนล่วงหน้าเพื่อไม่ให้ตกเป็นฝ่ายตั้งรับเมื่อเกิดการเปลี่ยนแปลงกะทันหัน การวางแผนและการวิเคราะห์สถานการณ์จำลองสามารถช่วยให้พวกเขามองเห็นภาพอนาคตในรูปแบบต่าง ๆ และตัดสินใจได้ดียิ่งขึ้น การสร้างสถานการณ์จำลองที่สมจริงจะช่วยให้พวกเขารับมือกับความไม่แน่นอนได้ โดยการสำรวจผลลัพธ์ในรูปแบบต่าง ๆ ซึ่งจะช่วยส่งเสริมการคิดเชิงกลยุทธ์และการตัดสินใจ การคาดการณ์ปัญหาล่วงหน้าโดยการระบุปัจจัยสำคัญและวิเคราะห์ผลกระทบ จะช่วยให้พวกเขาสามารถวางแผนสำหรับอนาคตได้อย่างมีประสิทธิภาพ</w:t>
+        <w:t>วัตถุประสงค์: สร้างทักษะการจำลองแบบฉากทัศน์ในอนาคต (Scenario Planning) การตัดสินใจกลยุทธ์ในสภาวะซับซ้อน และการบริหารความเสี่ยงระดับสูง</w:t>
+      </w:r>
+    </w:p>
+    <w:p>
+      <w:pPr>
+        <w:spacing w:before="40" w:after="40" w:line="276" w:lineRule="auto"/>
+        <w:jc w:val="left"/>
+      </w:pPr>
+      <w:r>
+        <w:rPr>
+          <w:rFonts w:ascii="Prompt" w:hAnsi="Prompt"/>
+          <w:b/>
+          <w:i w:val="0"/>
+          <w:color w:val="334155"/>
+          <w:sz w:val="20"/>
+        </w:rPr>
+        <w:t>บทเรียนย่อย (15 นาที x 4 บทเรียน) จากคลัง TalentLibrary:</w:t>
+      </w:r>
+    </w:p>
+    <w:p>
+      <w:pPr>
+        <w:spacing w:before="0" w:after="40" w:line="276" w:lineRule="auto"/>
+        <w:jc w:val="left"/>
+      </w:pPr>
+      <w:r>
+        <w:rPr>
+          <w:rFonts w:ascii="Prompt" w:hAnsi="Prompt"/>
+          <w:b w:val="0"/>
+          <w:i w:val="0"/>
+          <w:color w:val="334155"/>
+          <w:sz w:val="19"/>
+        </w:rPr>
+        <w:t xml:space="preserve">   - บทเรียนย่อยที่ 2.1 (15 นาที): [post#13156] การแก้ปัญหาที่ซับซ้อน: การวางแผนและการวิเคราะห์สถานการณ์จำลอง * (Complex Problem-Solving: Scenario Planning and Analysis)</w:t>
+      </w:r>
+    </w:p>
+    <w:p>
+      <w:pPr>
+        <w:spacing w:before="0" w:after="40" w:line="276" w:lineRule="auto"/>
+        <w:jc w:val="left"/>
+      </w:pPr>
+      <w:r>
+        <w:rPr>
+          <w:rFonts w:ascii="Prompt" w:hAnsi="Prompt"/>
+          <w:b w:val="0"/>
+          <w:i w:val="0"/>
+          <w:color w:val="334155"/>
+          <w:sz w:val="19"/>
+        </w:rPr>
+        <w:t xml:space="preserve">   - บทเรียนย่อยที่ 2.2 (15 นาที): [post#13194] การแก้ปัญหาที่ซับซ้อน: การคิดเชิงระบบ * (Complex Problem-Solving: Systems Thinking)</w:t>
+      </w:r>
+    </w:p>
+    <w:p>
+      <w:pPr>
+        <w:spacing w:before="0" w:after="40" w:line="276" w:lineRule="auto"/>
+        <w:jc w:val="left"/>
+      </w:pPr>
+      <w:r>
+        <w:rPr>
+          <w:rFonts w:ascii="Prompt" w:hAnsi="Prompt"/>
+          <w:b w:val="0"/>
+          <w:i w:val="0"/>
+          <w:color w:val="334155"/>
+          <w:sz w:val="19"/>
+        </w:rPr>
+        <w:t xml:space="preserve">   - บทเรียนย่อยที่ 2.3 (15 นาที): [post#13196] การแก้ปัญหาที่ซับซ้อน: การวิเคราะห์หาสาเหตุที่แท้จริง * (Complex Problem-Solving: Root Cause Analysis)</w:t>
+      </w:r>
+    </w:p>
+    <w:p>
+      <w:pPr>
+        <w:spacing w:before="0" w:after="40" w:line="276" w:lineRule="auto"/>
+        <w:jc w:val="left"/>
+      </w:pPr>
+      <w:r>
+        <w:rPr>
+          <w:rFonts w:ascii="Prompt" w:hAnsi="Prompt"/>
+          <w:b w:val="0"/>
+          <w:i w:val="0"/>
+          <w:color w:val="334155"/>
+          <w:sz w:val="19"/>
+        </w:rPr>
+        <w:t xml:space="preserve">   - บทเรียนย่อยที่ 2.4 (15 นาที): [post#1284] การรับมือกับความไม่แน่นอน * (Dealing with Uncertainty)</w:t>
       </w:r>
     </w:p>
     <w:p>
@@ -1357,62 +1069,9 @@
           <w:b/>
           <w:i w:val="0"/>
           <w:color w:val="0369A1"/>
-          <w:sz w:val="24"/>
+          <w:sz w:val="25"/>
         </w:rPr>
-        <w:t>3.3 [post#1800] กลยุทธ์การเปลี่ยนผ่านสู่ยุคดิจิทัลคืออะไร * (What is a Digital Transformation Strategy?)</w:t>
-      </w:r>
-    </w:p>
-    <w:p>
-      <w:pPr>
-        <w:spacing w:before="0" w:after="80" w:line="276" w:lineRule="auto"/>
-        <w:jc w:val="left"/>
-      </w:pPr>
-      <w:r>
-        <w:rPr>
-          <w:rFonts w:ascii="Prompt" w:hAnsi="Prompt"/>
-          <w:b/>
-          <w:i w:val="0"/>
-          <w:color w:val="047857"/>
-          <w:sz w:val="20"/>
-        </w:rPr>
-        <w:t>• สอดคล้องทักษะ: การบูรณาการทำงานด้วยเทคโนโลยีดิจิทัล &amp; การมองหาโอกาสและสร้างความแตกต่าง</w:t>
-        <w:br/>
-        <w:t>• ระยะเวลาเรียน: 1 ชั่วโมง (4 บทเรียนย่อย) | ภาษา: เสียงบรรยายภาษาไทย 🇹🇭</w:t>
-      </w:r>
-    </w:p>
-    <w:p>
-      <w:pPr>
-        <w:spacing w:before="0" w:after="80" w:line="276" w:lineRule="auto"/>
-        <w:jc w:val="left"/>
-      </w:pPr>
-      <w:r>
-        <w:rPr>
-          <w:rFonts w:ascii="Prompt" w:hAnsi="Prompt"/>
-          <w:b w:val="0"/>
-          <w:i w:val="0"/>
-          <w:color w:val="334155"/>
-          <w:sz w:val="20"/>
-        </w:rPr>
-        <w:t>ภาพรวมเนื้อหา: ตั้งแต่การซื้อของออนไลน์ด้วยการคลิกเพียงครั้งเดียว ไปจนถึงการสั่งให้ลำโพงอัจฉริยะเล่นเพลงรักสุดโปรด เทคโนโลยีนั้นมีประโยชน์อย่างมหาศาล แต่จะเกิดอะไรขึ้นหากคุณทำงานในองค์กรที่กำลังถูกทิ้งไว้ข้างหลังในยุคแห่งการเปลี่ยนผ่านสู่ดิจิทัลที่รวดเร็วเช่นนี้? ในกรณีนั้น ความก้าวหน้าทางเทคโนโลยีอาจกลับกลายเป็นอุปสรรคมากกว่าจะเป็นทางออกในทันที</w:t>
-        <w:br/>
-        <w:br/>
-        <w:t>โชคดีที่กลยุทธ์การเปลี่ยนผ่านสู่ดิจิทัล (Digital Transformation Strategy) ที่ได้รับการออกแบบมาโดยเฉพาะ สามารถช่วยให้องค์กรและบุคลากรภายในรักษาหรือสร้างความได้เปรียบทางการแข่งขันในสายงานของตนได้ อีกทั้งยังช่วยให้ธุรกิจสามารถกำหนดตำแหน่งเชิงกลยุทธ์ท่ามกลางภูมิทัศน์ดิจิทัลที่เปลี่ยนแปลงอยู่ตลอดเวลา ช่วยให้เกิดการปรับเปลี่ยน ปรับปรุง และหลีกเลี่ยงข้อผิดพลาดที่อาจทำให้เสียทั้งเงินและเวลาโดยใช่เหตุ</w:t>
-      </w:r>
-    </w:p>
-    <w:p>
-      <w:pPr>
-        <w:spacing w:before="200" w:after="80" w:line="276" w:lineRule="auto"/>
-        <w:jc w:val="left"/>
-      </w:pPr>
-      <w:r>
-        <w:rPr>
-          <w:rFonts w:ascii="Prompt" w:hAnsi="Prompt"/>
-          <w:b/>
-          <w:i w:val="0"/>
-          <w:color w:val="0369A1"/>
-          <w:sz w:val="24"/>
-        </w:rPr>
-        <w:t>3.4 [post#1623] พลังของ Big Data * (The Power of Big Data)</w:t>
+        <w:t>[EXEC-SUBJECT-03] วิชาที่ 3: ขุมพลัง Big Data และการบริหารจัดการองค์กรด้วยข้อมูลเชิงกลยุทธ์ (1 ชั่วโมง)</w:t>
       </w:r>
     </w:p>
     <w:p>
@@ -1430,7 +1089,7 @@
         </w:rPr>
         <w:t>• สอดคล้องทักษะ: บริหารงานด้วยข้อมูล &amp; การตัดสินใจอย่างรอบคอบ</w:t>
         <w:br/>
-        <w:t>• ระยะเวลาเรียน: 1 ชั่วโมง (4 บทเรียนย่อย) | ภาษา: เสียงบรรยายภาษาไทย 🇹🇭</w:t>
+        <w:t>• โครงสร้าง: วิชาหลัก 1 ชั่วโมง (รวม 4 บทเรียนย่อย บทเรียนละ 15 นาที)</w:t>
       </w:r>
     </w:p>
     <w:p>
@@ -1446,10 +1105,87 @@
           <w:color w:val="334155"/>
           <w:sz w:val="20"/>
         </w:rPr>
-        <w:t>ภาพรวมเนื้อหา: "ข้อมูล" คือสิ่งที่มีอยู่รอบตัวเราอย่างมหาศาล และกำลังเพิ่มขึ้นในทุกๆ วัน มีการประมาณการว่า ปริมาณข้อมูลที่มนุษย์สร้างขึ้นตั้งแต่ยุคเริ่มต้นอารยธรรมจนถึงปี ค.ศ. 2003 นั้น ปัจจุบันสามารถสร้างขึ้นได้ภายในเวลาเพียง 2 วันเท่านั้น ซึ่งถือเป็นข้อมูลจำนวนมหาศาลอย่างยิ่ง และเมื่อเราพูดถึงข้อมูลที่มีปริมาณมหาศาลขนาดนี้ เราจะเรียกมันว่า "Big Data" ซึ่งเป็นเครื่องมือที่ทรงพลังอย่างยิ่ง</w:t>
-        <w:br/>
-        <w:br/>
-        <w:t>หลายบริษัทใช้ Big Data ในการตัดสินใจครั้งสำคัญและมองหาโอกาสใหม่ๆ ลองจินตนาการดูว่าจะดีแค่ไหนหากคุณสามารถวิเคราะห์พฤติกรรมการซื้อสินค้าของผู้ใช้บนแพลตฟอร์มโซเชียลมีเดียทั้งหมด หรือวิเคราะห์การค้นหาบนเว็บไซต์ของประชากรทั้งประเทศตลอดทั้งปีได้ ซึ่ง Big Data สามารถช่วยให้คุณทำสิ่งเหล่านี้ได้อย่างง่ายดาย</w:t>
+        <w:t>วัตถุประสงค์: เสริมสร้างวิสัยทัศน์ผู้บริหารในการใช้ Big Data การวิเคราะห์คาดการณ์ล่วงหน้า และการกำหนดนโยบายโดยใช้วิทยาการข้อมูลเป็นฐาน</w:t>
+      </w:r>
+    </w:p>
+    <w:p>
+      <w:pPr>
+        <w:spacing w:before="40" w:after="40" w:line="276" w:lineRule="auto"/>
+        <w:jc w:val="left"/>
+      </w:pPr>
+      <w:r>
+        <w:rPr>
+          <w:rFonts w:ascii="Prompt" w:hAnsi="Prompt"/>
+          <w:b/>
+          <w:i w:val="0"/>
+          <w:color w:val="334155"/>
+          <w:sz w:val="20"/>
+        </w:rPr>
+        <w:t>บทเรียนย่อย (15 นาที x 4 บทเรียน) จากคลัง TalentLibrary:</w:t>
+      </w:r>
+    </w:p>
+    <w:p>
+      <w:pPr>
+        <w:spacing w:before="0" w:after="40" w:line="276" w:lineRule="auto"/>
+        <w:jc w:val="left"/>
+      </w:pPr>
+      <w:r>
+        <w:rPr>
+          <w:rFonts w:ascii="Prompt" w:hAnsi="Prompt"/>
+          <w:b w:val="0"/>
+          <w:i w:val="0"/>
+          <w:color w:val="334155"/>
+          <w:sz w:val="19"/>
+        </w:rPr>
+        <w:t xml:space="preserve">   - บทเรียนย่อยที่ 3.1 (15 นาที): [post#1623] พลังของ Big Data * (The Power of Big Data)</w:t>
+      </w:r>
+    </w:p>
+    <w:p>
+      <w:pPr>
+        <w:spacing w:before="0" w:after="40" w:line="276" w:lineRule="auto"/>
+        <w:jc w:val="left"/>
+      </w:pPr>
+      <w:r>
+        <w:rPr>
+          <w:rFonts w:ascii="Prompt" w:hAnsi="Prompt"/>
+          <w:b w:val="0"/>
+          <w:i w:val="0"/>
+          <w:color w:val="334155"/>
+          <w:sz w:val="19"/>
+        </w:rPr>
+        <w:t xml:space="preserve">   - บทเรียนย่อยที่ 3.2 (15 นาที): [post#9045] เทคนิคการวิเคราะห์ข้อมูลเชิงอนุมานและเชิงคาดการณ์ * (Inferential and Predictive Data Analysis Techniques)</w:t>
+      </w:r>
+    </w:p>
+    <w:p>
+      <w:pPr>
+        <w:spacing w:before="0" w:after="40" w:line="276" w:lineRule="auto"/>
+        <w:jc w:val="left"/>
+      </w:pPr>
+      <w:r>
+        <w:rPr>
+          <w:rFonts w:ascii="Prompt" w:hAnsi="Prompt"/>
+          <w:b w:val="0"/>
+          <w:i w:val="0"/>
+          <w:color w:val="334155"/>
+          <w:sz w:val="19"/>
+        </w:rPr>
+        <w:t xml:space="preserve">   - บทเรียนย่อยที่ 3.3 (15 นาที): [post#9044] การวิเคราะห์ข้อมูลเชิงคุณภาพและเชิงปริมาณ * (Qualitative &amp; Quantitative Data Analysis)</w:t>
+      </w:r>
+    </w:p>
+    <w:p>
+      <w:pPr>
+        <w:spacing w:before="0" w:after="40" w:line="276" w:lineRule="auto"/>
+        <w:jc w:val="left"/>
+      </w:pPr>
+      <w:r>
+        <w:rPr>
+          <w:rFonts w:ascii="Prompt" w:hAnsi="Prompt"/>
+          <w:b w:val="0"/>
+          <w:i w:val="0"/>
+          <w:color w:val="334155"/>
+          <w:sz w:val="19"/>
+        </w:rPr>
+        <w:t xml:space="preserve">   - บทเรียนย่อยที่ 3.4 (15 นาที): [post#10895] การใช้ข้อมูลในการบริการลูกค้า * (Using Data in Customer Service)</w:t>
       </w:r>
     </w:p>
     <w:p>
@@ -1463,9 +1199,9 @@
           <w:b/>
           <w:i w:val="0"/>
           <w:color w:val="0369A1"/>
-          <w:sz w:val="24"/>
+          <w:sz w:val="25"/>
         </w:rPr>
-        <w:t>3.5 [post#14240] การปรับตัวรับความเปลี่ยนแปลงในยุค AI * (Adapting to Change in the Age of AI)</w:t>
+        <w:t>[EXEC-SUBJECT-04] วิชาที่ 4: การจัดทำกลยุทธ์ Digital Transformation และการสร้างนวัตกรรม (1 ชั่วโมง)</w:t>
       </w:r>
     </w:p>
     <w:p>
@@ -1481,9 +1217,9 @@
           <w:color w:val="047857"/>
           <w:sz w:val="20"/>
         </w:rPr>
-        <w:t>• สอดคล้องทักษะ: การมองหาโอกาสและสร้างความแตกต่าง &amp; การตัดสินใจอย่างรอบคอบ</w:t>
+        <w:t>• สอดคล้องทักษะ: การมองหาโอกาสและสร้างความแตกต่าง &amp; การบูรณาการดิจิทัล</w:t>
         <w:br/>
-        <w:t>• ระยะเวลาเรียน: 1 ชั่วโมง (4 บทเรียนย่อย) | ภาษา: เสียงบรรยายภาษาไทย 🇹🇭</w:t>
+        <w:t>• โครงสร้าง: วิชาหลัก 1 ชั่วโมง (รวม 4 บทเรียนย่อย บทเรียนละ 15 นาที)</w:t>
       </w:r>
     </w:p>
     <w:p>
@@ -1499,10 +1235,217 @@
           <w:color w:val="334155"/>
           <w:sz w:val="20"/>
         </w:rPr>
-        <w:t>ภาพรวมเนื้อหา: AI เข้ามามีบทบาทในที่ทำงานแล้วและจะยังคงอยู่ต่อไป เทคโนโลยีนี้สามารถช่วยให้งานประจำเสร็จเร็วขึ้น ช่วยจัดระเบียบการทำงาน ช่วยในการค้นคว้าวิจัย และแม้กระทั่งสร้างข้อความและรูปภาพ นี่คือการเปลี่ยนแปลงทางเทคโนโลยีครั้งใหญ่ที่จะช่วยให้การทำงานง่ายขึ้น แต่เมื่อเทคโนโลยีพัฒนาขึ้น ผู้จัดการอาจกังวลว่าในที่สุดแล้ว AI จะสามารถทำงานแทนพนักงานได้ทั้งหมด</w:t>
+        <w:t>วัตถุประสงค์: การวางโรดแมปการปรับเปลี่ยนองค์กรดิจิทัล การรื้อปรับกระบวนการทำงานเพื่อสร้างความแตกต่าง และการขับเคลื่อนนวัตกรรมเชิงรุก</w:t>
+      </w:r>
+    </w:p>
+    <w:p>
+      <w:pPr>
+        <w:spacing w:before="40" w:after="40" w:line="276" w:lineRule="auto"/>
+        <w:jc w:val="left"/>
+      </w:pPr>
+      <w:r>
+        <w:rPr>
+          <w:rFonts w:ascii="Prompt" w:hAnsi="Prompt"/>
+          <w:b/>
+          <w:i w:val="0"/>
+          <w:color w:val="334155"/>
+          <w:sz w:val="20"/>
+        </w:rPr>
+        <w:t>บทเรียนย่อย (15 นาที x 4 บทเรียน) จากคลัง TalentLibrary:</w:t>
+      </w:r>
+    </w:p>
+    <w:p>
+      <w:pPr>
+        <w:spacing w:before="0" w:after="40" w:line="276" w:lineRule="auto"/>
+        <w:jc w:val="left"/>
+      </w:pPr>
+      <w:r>
+        <w:rPr>
+          <w:rFonts w:ascii="Prompt" w:hAnsi="Prompt"/>
+          <w:b w:val="0"/>
+          <w:i w:val="0"/>
+          <w:color w:val="334155"/>
+          <w:sz w:val="19"/>
+        </w:rPr>
+        <w:t xml:space="preserve">   - บทเรียนย่อยที่ 4.1 (15 นาที): [post#1800] กลยุทธ์การเปลี่ยนผ่านสู่ยุคดิจิทัลคืออะไร * (What is a Digital Transformation Strategy?)</w:t>
+      </w:r>
+    </w:p>
+    <w:p>
+      <w:pPr>
+        <w:spacing w:before="0" w:after="40" w:line="276" w:lineRule="auto"/>
+        <w:jc w:val="left"/>
+      </w:pPr>
+      <w:r>
+        <w:rPr>
+          <w:rFonts w:ascii="Prompt" w:hAnsi="Prompt"/>
+          <w:b w:val="0"/>
+          <w:i w:val="0"/>
+          <w:color w:val="334155"/>
+          <w:sz w:val="19"/>
+        </w:rPr>
+        <w:t xml:space="preserve">   - บทเรียนย่อยที่ 4.2 (15 นาที): [post#2038] ผลกระทบของการฝึกอบรมต่อการเปลี่ยนแปลงทางดิจิทัล * (The Impact of Training on Digital Change)</w:t>
+      </w:r>
+    </w:p>
+    <w:p>
+      <w:pPr>
+        <w:spacing w:before="0" w:after="40" w:line="276" w:lineRule="auto"/>
+        <w:jc w:val="left"/>
+      </w:pPr>
+      <w:r>
+        <w:rPr>
+          <w:rFonts w:ascii="Prompt" w:hAnsi="Prompt"/>
+          <w:b w:val="0"/>
+          <w:i w:val="0"/>
+          <w:color w:val="334155"/>
+          <w:sz w:val="19"/>
+        </w:rPr>
+        <w:t xml:space="preserve">   - บทเรียนย่อยที่ 4.3 (15 นาที): [post#10330] เครื่องมือเทคโนโลยีเพื่อการขาย * (Sales Tech Tools)</w:t>
+      </w:r>
+    </w:p>
+    <w:p>
+      <w:pPr>
+        <w:spacing w:before="0" w:after="40" w:line="276" w:lineRule="auto"/>
+        <w:jc w:val="left"/>
+      </w:pPr>
+      <w:r>
+        <w:rPr>
+          <w:rFonts w:ascii="Prompt" w:hAnsi="Prompt"/>
+          <w:b w:val="0"/>
+          <w:i w:val="0"/>
+          <w:color w:val="334155"/>
+          <w:sz w:val="19"/>
+        </w:rPr>
+        <w:t xml:space="preserve">   - บทเรียนย่อยที่ 4.4 (15 นาที): [post#3027] ทำความเข้าใจสาเหตุที่ปิดการขายไม่ได้ * (Understand Why Deals are Lost)</w:t>
+      </w:r>
+    </w:p>
+    <w:p>
+      <w:pPr>
+        <w:spacing w:before="200" w:after="80" w:line="276" w:lineRule="auto"/>
+        <w:jc w:val="left"/>
+      </w:pPr>
+      <w:r>
+        <w:rPr>
+          <w:rFonts w:ascii="Prompt" w:hAnsi="Prompt"/>
+          <w:b/>
+          <w:i w:val="0"/>
+          <w:color w:val="0369A1"/>
+          <w:sz w:val="25"/>
+        </w:rPr>
+        <w:t>[EXEC-SUBJECT-05] วิชาที่ 5: การนำการเปลี่ยนแปลงและสร้างวัฒนธรรมองค์กรแห่งอนาคต (1 ชั่วโมง)</w:t>
+      </w:r>
+    </w:p>
+    <w:p>
+      <w:pPr>
+        <w:spacing w:before="0" w:after="80" w:line="276" w:lineRule="auto"/>
+        <w:jc w:val="left"/>
+      </w:pPr>
+      <w:r>
+        <w:rPr>
+          <w:rFonts w:ascii="Prompt" w:hAnsi="Prompt"/>
+          <w:b/>
+          <w:i w:val="0"/>
+          <w:color w:val="047857"/>
+          <w:sz w:val="20"/>
+        </w:rPr>
+        <w:t>• สอดคล้องทักษะ: การมองหาโอกาสและสร้างความแตกต่าง</w:t>
         <w:br/>
-        <w:br/>
-        <w:t>แม้ว่าเครื่องมือ AI อาจเข้ามาเปลี่ยนบทบาทหน้าที่การทำงานและรูปแบบการทำงานร่วมกันของทีม แต่เทคโนโลยีนี้จะไม่สามารถแทนที่มนุษย์ในที่ทำงานได้ การทำความเข้าใจและปรับตัวเข้ากับ AI จะช่วยให้พนักงานได้ทดลองใช้เครื่องมือที่เป็นนวัตกรรมใหม่ ๆ และปรับมุมมองต่อการทำงานประจำในรูปแบบที่ต่างไปจากเดิม นอกจากนี้ พนักงานยังจำเป็นต้องมีทักษะใหม่ ๆ และทัศนคติเชิงบวกเพื่อที่จะเติบโตและประสบความสำเร็จในสภาพแวดล้อมที่เปลี่ยนแปลงไปนี้</w:t>
+        <w:t>• โครงสร้าง: วิชาหลัก 1 ชั่วโมง (รวม 4 บทเรียนย่อย บทเรียนละ 15 นาที)</w:t>
+      </w:r>
+    </w:p>
+    <w:p>
+      <w:pPr>
+        <w:spacing w:before="0" w:after="80" w:line="276" w:lineRule="auto"/>
+        <w:jc w:val="left"/>
+      </w:pPr>
+      <w:r>
+        <w:rPr>
+          <w:rFonts w:ascii="Prompt" w:hAnsi="Prompt"/>
+          <w:b w:val="0"/>
+          <w:i w:val="0"/>
+          <w:color w:val="334155"/>
+          <w:sz w:val="20"/>
+        </w:rPr>
+        <w:t>วัตถุประสงค์: การสร้างวัฒนธรรมองค์กรที่ยืดหยุ่น (Agile &amp; Adaptive Culture) การนำการเปลี่ยนแปลงในภาวะวิกฤต และการบริหารจัดการผู้มีส่วนได้ส่วนเสีย</w:t>
+      </w:r>
+    </w:p>
+    <w:p>
+      <w:pPr>
+        <w:spacing w:before="40" w:after="40" w:line="276" w:lineRule="auto"/>
+        <w:jc w:val="left"/>
+      </w:pPr>
+      <w:r>
+        <w:rPr>
+          <w:rFonts w:ascii="Prompt" w:hAnsi="Prompt"/>
+          <w:b/>
+          <w:i w:val="0"/>
+          <w:color w:val="334155"/>
+          <w:sz w:val="20"/>
+        </w:rPr>
+        <w:t>บทเรียนย่อย (15 นาที x 4 บทเรียน) จากคลัง TalentLibrary:</w:t>
+      </w:r>
+    </w:p>
+    <w:p>
+      <w:pPr>
+        <w:spacing w:before="0" w:after="40" w:line="276" w:lineRule="auto"/>
+        <w:jc w:val="left"/>
+      </w:pPr>
+      <w:r>
+        <w:rPr>
+          <w:rFonts w:ascii="Prompt" w:hAnsi="Prompt"/>
+          <w:b w:val="0"/>
+          <w:i w:val="0"/>
+          <w:color w:val="334155"/>
+          <w:sz w:val="19"/>
+        </w:rPr>
+        <w:t xml:space="preserve">   - บทเรียนย่อยที่ 5.1 (15 นาที): [post#1841] การหยุดชะงักทางดิจิทัล (Digital Disruption) * (Digital Disruption)</w:t>
+      </w:r>
+    </w:p>
+    <w:p>
+      <w:pPr>
+        <w:spacing w:before="0" w:after="40" w:line="276" w:lineRule="auto"/>
+        <w:jc w:val="left"/>
+      </w:pPr>
+      <w:r>
+        <w:rPr>
+          <w:rFonts w:ascii="Prompt" w:hAnsi="Prompt"/>
+          <w:b w:val="0"/>
+          <w:i w:val="0"/>
+          <w:color w:val="334155"/>
+          <w:sz w:val="19"/>
+        </w:rPr>
+        <w:t xml:space="preserve">   - บทเรียนย่อยที่ 5.2 (15 นาที): [post#14201] การคิดเชิงวิพากษ์ในยุค AI * (Critical Thinking in the Age of AI)</w:t>
+      </w:r>
+    </w:p>
+    <w:p>
+      <w:pPr>
+        <w:spacing w:before="0" w:after="40" w:line="276" w:lineRule="auto"/>
+        <w:jc w:val="left"/>
+      </w:pPr>
+      <w:r>
+        <w:rPr>
+          <w:rFonts w:ascii="Prompt" w:hAnsi="Prompt"/>
+          <w:b w:val="0"/>
+          <w:i w:val="0"/>
+          <w:color w:val="334155"/>
+          <w:sz w:val="19"/>
+        </w:rPr>
+        <w:t xml:space="preserve">   - บทเรียนย่อยที่ 5.3 (15 นาที): [post#1519] ความเท่าเทียมและความหลากหลาย * (Equality and Diversity)</w:t>
+      </w:r>
+    </w:p>
+    <w:p>
+      <w:pPr>
+        <w:spacing w:before="0" w:after="40" w:line="276" w:lineRule="auto"/>
+        <w:jc w:val="left"/>
+      </w:pPr>
+      <w:r>
+        <w:rPr>
+          <w:rFonts w:ascii="Prompt" w:hAnsi="Prompt"/>
+          <w:b w:val="0"/>
+          <w:i w:val="0"/>
+          <w:color w:val="334155"/>
+          <w:sz w:val="19"/>
+        </w:rPr>
+        <w:t xml:space="preserve">   - บทเรียนย่อยที่ 5.4 (15 นาที): [post#13187] การแก้ปัญหาที่ซับซ้อน: เทคนิคการแก้ปัญหา * (Complex Problem-Solving: Problem-Solving Techniques)</w:t>
       </w:r>
     </w:p>
     <w:p>
@@ -1538,7 +1481,7 @@
         <w:br/>
         <w:t>2. เสียงบรรยายภาษาไทยสตูดิโอ (* 🇹🇭) พร้อมซับไตเติิลประกอบทุกรายวิชา</w:t>
         <w:br/>
-        <w:t>3. ชื่อรายวิชาและ ObjectID ในเอกสารข้อเสนอนี้ตรงกับคลัง TalentLibrary 100% ท่านสามารถพิมพ์ชื่อวิชาในช่องค้นหาบนเว็บแอปเพื่อเปิดดูตัวอย่างสื่อวิดีโอได้ทันทีที่:</w:t>
+        <w:t>3. ชื่อบทเรียนย่อยและ ObjectID ในเอกสารข้อเสนอนี้ตรงกับคลัง TalentLibrary 100% สามารถพิมพ์ค้นหาเพื่อดูตัวอย่างสื่อได้ที่:</w:t>
         <w:br/>
         <w:t xml:space="preserve">   https://talentlibraryth.streamlit.app</w:t>
       </w:r>

</xml_diff>

<commit_message>
Filter TOR Proposal courses to focus strictly on Personal Dev, Team Dev, Management, Data & AI (Excluding Sales/Marketing/Customer Service)
</commit_message>
<xml_diff>
--- a/TOR_Courseware_Proposal_TalentLibrary_TH.docx
+++ b/TOR_Courseware_Proposal_TalentLibrary_TH.docx
@@ -29,11 +29,11 @@
           <w:b/>
           <w:i w:val="0"/>
           <w:color w:val="0284C5"/>
-          <w:sz w:val="40"/>
+          <w:sz w:val="38"/>
         </w:rPr>
         <w:t>ข้อเสนอสื่อการเรียนรู้ (Courseware) ออนไลน์ภาษาไทย</w:t>
         <w:br/>
-        <w:t>สำหรับการพัฒนาทักษะแห่งอนาคต (Future Skills)</w:t>
+        <w:t>เน้นการพัฒนาตนเอง การพัฒนาทีม การบริหารจัดการ ข้อมูล และ AI</w:t>
       </w:r>
     </w:p>
     <w:p>
@@ -51,7 +51,7 @@
         </w:rPr>
         <w:t>ตามข้อกำหนดขอบเขตของงาน (TOR) ข้อ 4.2 และ 4.2.1</w:t>
         <w:br/>
-        <w:t>(วิชาหลัก 1 ชั่วโมง + 4 บทเรียนย่อย 15 นาทีจากคลัง TalentLibrary)</w:t>
+        <w:t>(ยกเว้นหัวข้อการขาย การตลาด และการบริการลูกค้า 100%)</w:t>
       </w:r>
     </w:p>
     <w:p>
@@ -108,7 +108,7 @@
           <w:color w:val="334155"/>
           <w:sz w:val="22"/>
         </w:rPr>
-        <w:t>ข้อเสนอนี้จัดทำขึ้นเพื่อตอบสนองข้อกำหนดขอบเขตของงาน (TOR) ข้อ 4.2 และ 4.2.1 ในการส่งมอบสื่อการเรียนรู้ออนไลน์ภาษาไทยคุณภาพสูง (พร้อมเสียงบรรยายภาษาไทยแบบสตูดิโอ 🇹🇭) โดยกำหนดให้ชื่อวิชาหลัก (1 ชั่วโมง) ออกแบบขึ้นให้สอดคล้องกับ TOR และแต่ละวิชาหลักประกอบด้วยเนื้อหาย่อย (15 นาที) จำนวน 4 บทเรียน ที่มีชื่อบทเรียนและ ObjectID ตรงตามคลังหลักสูตร TalentLibrary 100% เพื่อให้ค้นหา ตรวจสอบ และเชื่อมโยงได้ง่ายดาย</w:t>
+        <w:t>ข้อเสนอนี้จัดทำขึ้นเพื่อตอบสนองข้อกำหนดขอบเขตของงาน (TOR) ข้อ 4.2 และ 4.2.1 โดยเน้นสื่อการเรียนรู้ออนไลน์ภาษาไทยคุณภาพสูง (พร้อมเสียงบรรยายภาษาไทยแบบสตูดิโอ 🇹🇭) ในกลุ่มทักษะการพัฒนาตนเอง การพัฒนาทีม การบริหารและการจัดการ การวิเคราะห์และตัดสินใจด้วยข้อมูล และเทคโนโลยีกับ AI โดยยกเว้นหัวข้อการขาย การตลาด และการบริการลูกค้า 100% ตามข้อกำหนด</w:t>
       </w:r>
     </w:p>
     <w:p>
@@ -140,7 +140,7 @@
           <w:color w:val="0369A1"/>
           <w:sz w:val="25"/>
         </w:rPr>
-        <w:t>[OP-SUBJECT-01] วิชาที่ 1: การตัดสินใจอย่างรอบคอบและการแก้ปัญหาซับซ้อนในยุคดิจิทัล (1 ชั่วโมง)</w:t>
+        <w:t>[OP-SUBJECT-01] วิชาที่ 1: การพัฒนาตนเองและการคิดเชิงวิพากษ์ในยุคดิจิทัล (1 ชั่วโมง)</w:t>
       </w:r>
     </w:p>
     <w:p>
@@ -156,7 +156,7 @@
           <w:color w:val="047857"/>
           <w:sz w:val="20"/>
         </w:rPr>
-        <w:t>• สอดคล้องทักษะ: การตัดสินใจอย่างรอบคอบ</w:t>
+        <w:t>• สอดคล้องทักษะ: การพัฒนาตนเอง &amp; การตัดสินใจอย่างรอบคอบ</w:t>
         <w:br/>
         <w:t>• โครงสร้าง: วิชาหลัก 1 ชั่วโมง (รวม 4 บทเรียนย่อย บทเรียนละ 15 นาที)</w:t>
       </w:r>
@@ -174,7 +174,7 @@
           <w:color w:val="334155"/>
           <w:sz w:val="20"/>
         </w:rPr>
-        <w:t>วัตถุประสงค์: มุ่งเน้นสร้างกระบวนการคิดอย่างตั้งข้อสังเกต การวิเคราะห์เหตุและผลตามตรรกศาสตร์ และเทคนิคการแก้ปัญหาซับซ้อนในการทำงานประจำวันอย่างรอบคอบ</w:t>
+        <w:t>วัตถุประสงค์: มุ่งเน้นการเสริมสร้างศักยภาพการเรียนรู้ตลอดชีวิต การพัฒนาสมาธิ และความคิดเชิงวิพากษ์ในการวิเคราะห์ข้อมูลก่อนการตัดสินใจ</w:t>
       </w:r>
     </w:p>
     <w:p>
@@ -222,7 +222,7 @@
           <w:color w:val="334155"/>
           <w:sz w:val="19"/>
         </w:rPr>
-        <w:t xml:space="preserve">   - บทเรียนย่อยที่ 1.2 (15 นาที): [post#13187] การแก้ปัญหาที่ซับซ้อน: เทคนิคการแก้ปัญหา * (Complex Problem-Solving: Problem-Solving Techniques)</w:t>
+        <w:t xml:space="preserve">   - บทเรียนย่อยที่ 1.2 (15 นาที): [post#12159] ChatGPT: การพัฒนาตนเองและการเติบโตในสายอาชีพ * (ChatGPT: Personal Development and Growing Your Career)</w:t>
       </w:r>
     </w:p>
     <w:p>
@@ -270,7 +270,7 @@
           <w:color w:val="0369A1"/>
           <w:sz w:val="25"/>
         </w:rPr>
-        <w:t>[OP-SUBJECT-02] วิชาที่ 2: การบริหารงานและวิเคราะห์ข้อมูลเพื่อการปฏิบัติงาน (1 ชั่วโมง)</w:t>
+        <w:t>[OP-SUBJECT-02] วิชาที่ 2: การพัฒนาทีมและการทำงานร่วมกันอย่างมีประสิทธิภาพ (1 ชั่วโมง)</w:t>
       </w:r>
     </w:p>
     <w:p>
@@ -286,7 +286,7 @@
           <w:color w:val="047857"/>
           <w:sz w:val="20"/>
         </w:rPr>
-        <w:t>• สอดคล้องทักษะ: บริหารงานด้วยข้อมูล</w:t>
+        <w:t>• สอดคล้องทักษะ: การพัฒนาทีม</w:t>
         <w:br/>
         <w:t>• โครงสร้าง: วิชาหลัก 1 ชั่วโมง (รวม 4 บทเรียนย่อย บทเรียนละ 15 นาที)</w:t>
       </w:r>
@@ -304,7 +304,7 @@
           <w:color w:val="334155"/>
           <w:sz w:val="20"/>
         </w:rPr>
-        <w:t>วัตถุประสงค์: เสริมสร้างทักษะการนำข้อมูลตัวเลขและข้อมูลพฤติกรรมมาจัดทำสรุปรายงาน วิเคราะห์การบริการ และใช้ข้อมูลประกอบการตัดสินใจในงานประจำ</w:t>
+        <w:t>วัตถุประสงค์: พัฒนาทักษะการทำงานเป็นทีม การสื่อสารในมารยาทช่องทางต่างๆ การเคารพความหลากหลาย และการสร้างความร่วมมือในการทำงาน</w:t>
       </w:r>
     </w:p>
     <w:p>
@@ -336,7 +336,7 @@
           <w:color w:val="334155"/>
           <w:sz w:val="19"/>
         </w:rPr>
-        <w:t xml:space="preserve">   - บทเรียนย่อยที่ 2.1 (15 นาที): [post#9044] การวิเคราะห์ข้อมูลเชิงคุณภาพและเชิงปริมาณ * (Qualitative &amp; Quantitative Data Analysis)</w:t>
+        <w:t xml:space="preserve">   - บทเรียนย่อยที่ 2.1 (15 นาที): [post#10352] มารยาทในการใช้ช่องทางการสื่อสาร * (Communication Channel Etiquette)</w:t>
       </w:r>
     </w:p>
     <w:p>
@@ -352,7 +352,7 @@
           <w:color w:val="334155"/>
           <w:sz w:val="19"/>
         </w:rPr>
-        <w:t xml:space="preserve">   - บทเรียนย่อยที่ 2.2 (15 นาที): [post#10895] การใช้ข้อมูลในการบริการลูกค้า * (Using Data in Customer Service)</w:t>
+        <w:t xml:space="preserve">   - บทเรียนย่อยที่ 2.2 (15 นาที): [post#1519] ความเท่าเทียมและความหลากหลาย * (Equality and Diversity)</w:t>
       </w:r>
     </w:p>
     <w:p>
@@ -368,7 +368,7 @@
           <w:color w:val="334155"/>
           <w:sz w:val="19"/>
         </w:rPr>
-        <w:t xml:space="preserve">   - บทเรียนย่อยที่ 2.3 (15 นาที): [post#10892] KPI สำหรับทีมบริการลูกค้า * (KPIs for Customer Service Teams)</w:t>
+        <w:t xml:space="preserve">   - บทเรียนย่อยที่ 2.3 (15 นาที): [post#1593] หลักจรรยาบรรณ - การทำงานร่วมกับทุกคนอย่างราบรื่น * (Code of Conduct - Working Well with Everyone)</w:t>
       </w:r>
     </w:p>
     <w:p>
@@ -384,7 +384,7 @@
           <w:color w:val="334155"/>
           <w:sz w:val="19"/>
         </w:rPr>
-        <w:t xml:space="preserve">   - บทเรียนย่อยที่ 2.4 (15 นาที): [post#9045] เทคนิคการวิเคราะห์ข้อมูลเชิงอนุมานและเชิงคาดการณ์ * (Inferential and Predictive Data Analysis Techniques)</w:t>
+        <w:t xml:space="preserve">   - บทเรียนย่อยที่ 2.4 (15 นาที): [post#13187] การแก้ปัญหาที่ซับซ้อน: เทคนิคการแก้ปัญหา * (Complex Problem-Solving: Problem-Solving Techniques)</w:t>
       </w:r>
     </w:p>
     <w:p>
@@ -400,7 +400,7 @@
           <w:color w:val="0369A1"/>
           <w:sz w:val="25"/>
         </w:rPr>
-        <w:t>[OP-SUBJECT-03] วิชาที่ 3: การประยุกต์ใช้ AI และเครื่องมือดิจิทัลเพิ่มประสิทธิภาพงาน (1 ชั่วโมง)</w:t>
+        <w:t>[OP-SUBJECT-03] วิชาที่ 3: การประยุกต์ใช้เทคโนโลยี AI และการเพิ่มประสิทธิผลการทำงาน (1 ชั่วโมง)</w:t>
       </w:r>
     </w:p>
     <w:p>
@@ -416,7 +416,7 @@
           <w:color w:val="047857"/>
           <w:sz w:val="20"/>
         </w:rPr>
-        <w:t>• สอดคล้องทักษะ: การบูรณาการทำงานด้วยเทคโนโลยีดิจิทัล</w:t>
+        <w:t>• สอดคล้องทักษะ: เทคโนโลยีและ AI</w:t>
         <w:br/>
         <w:t>• โครงสร้าง: วิชาหลัก 1 ชั่วโมง (รวม 4 บทเรียนย่อย บทเรียนละ 15 นาที)</w:t>
       </w:r>
@@ -434,7 +434,7 @@
           <w:color w:val="334155"/>
           <w:sz w:val="20"/>
         </w:rPr>
-        <w:t>วัตถุประสงค์: เพื่อให้ผู้ปฏิบัติงานสามารถประยุกต์ใช้ AI, ChatGPT และซอฟต์แวร์สมัยใหม่ในการเพิ่มความรวดเร็ว สรุปงาน ร่างเอกสาร และทำงานร่วมกันแบบดิจิทัล</w:t>
+        <w:t>วัตถุประสงค์: เพื่อให้ผู้ปฏิบัติงานสามารถประยุกต์ใช้ AI และเครื่องมืออัตโนมัติในการลดเวลาทำงาน เพิ่มความรวดเร็ว และยกระดับผลงาน</w:t>
       </w:r>
     </w:p>
     <w:p>
@@ -466,7 +466,7 @@
           <w:color w:val="334155"/>
           <w:sz w:val="19"/>
         </w:rPr>
-        <w:t xml:space="preserve">   - บทเรียนย่อยที่ 3.1 (15 นาที): [post#12159] ChatGPT: การพัฒนาตนเองและการเติบโตในสายอาชีพ * (ChatGPT: Personal Development and Growing Your Career)</w:t>
+        <w:t xml:space="preserve">   - บทเรียนย่อยที่ 3.1 (15 นาที): [post#14213] เพิ่มประสิทธิภาพการทำงานด้วย AI * (Boost Your Productivity with AI)</w:t>
       </w:r>
     </w:p>
     <w:p>
@@ -482,7 +482,7 @@
           <w:color w:val="334155"/>
           <w:sz w:val="19"/>
         </w:rPr>
-        <w:t xml:space="preserve">   - บทเรียนย่อยที่ 3.2 (15 นาที): [post#10330] เครื่องมือเทคโนโลยีเพื่อการขาย * (Sales Tech Tools)</w:t>
+        <w:t xml:space="preserve">   - บทเรียนย่อยที่ 3.2 (15 นาที): [post#14207] AI กับระบบอัตโนมัติในสถานที่ทำงาน * (AI and Workplace Automation)</w:t>
       </w:r>
     </w:p>
     <w:p>
@@ -498,7 +498,7 @@
           <w:color w:val="334155"/>
           <w:sz w:val="19"/>
         </w:rPr>
-        <w:t xml:space="preserve">   - บทเรียนย่อยที่ 3.3 (15 นาที): [post#2038] ผลกระทบของการฝึกอบรมต่อการเปลี่ยนแปลงทางดิจิทัล * (The Impact of Training on Digital Change)</w:t>
+        <w:t xml:space="preserve">   - บทเรียนย่อยที่ 3.3 (15 นาที): [post#3546] การใช้ประโยชน์จากพลังของ AI * (Harnessing the Power of AI)</w:t>
       </w:r>
     </w:p>
     <w:p>
@@ -514,7 +514,7 @@
           <w:color w:val="334155"/>
           <w:sz w:val="19"/>
         </w:rPr>
-        <w:t xml:space="preserve">   - บทเรียนย่อยที่ 3.4 (15 นาที): [post#3011] การเสริมสร้างศักยภาพในการบริการลูกค้า * (Empowering Customer Service)</w:t>
+        <w:t xml:space="preserve">   - บทเรียนย่อยที่ 3.4 (15 นาที): [post#3388] ปัญญาประดิษฐ์ (AI) คืออะไร * (What is Artificial Intelligence?)</w:t>
       </w:r>
     </w:p>
     <w:p>
@@ -530,7 +530,7 @@
           <w:color w:val="0369A1"/>
           <w:sz w:val="25"/>
         </w:rPr>
-        <w:t>[OP-SUBJECT-04] วิชาที่ 4: การสังเกตการณ์เชิงวิเคราะห์และการมองหาโอกาสใหม่ในงาน (1 ชั่วโมง)</w:t>
+        <w:t>[OP-SUBJECT-04] วิชาที่ 4: การวิเคราะห์ข้อมูลเชิงคุณภาพและเชิงปริมาณเพื่อการตัดสินใจ (1 ชั่วโมง)</w:t>
       </w:r>
     </w:p>
     <w:p>
@@ -546,7 +546,7 @@
           <w:color w:val="047857"/>
           <w:sz w:val="20"/>
         </w:rPr>
-        <w:t>• สอดคล้องทักษะ: การมองหาโอกาสและสร้างความแตกต่าง</w:t>
+        <w:t>• สอดคล้องทักษะ: การวิเคราะห์และตัดสินใจด้วยข้อมูล</w:t>
         <w:br/>
         <w:t>• โครงสร้าง: วิชาหลัก 1 ชั่วโมง (รวม 4 บทเรียนย่อย บทเรียนละ 15 นาที)</w:t>
       </w:r>
@@ -564,7 +564,7 @@
           <w:color w:val="334155"/>
           <w:sz w:val="20"/>
         </w:rPr>
-        <w:t>วัตถุประสงค์: พัฒนาทักษะการค้นหาจุดคอขวด ข้อผิดพลาดในกระบวนการทำงาน การวิเคราะห์สาเหตุที่แท้จริงเพื่อเสนอไอเดียและสร้างโอกาสการทำงานใหม่ๆ</w:t>
+        <w:t>วัตถุประสงค์: มุ่งเน้นการจำแนกข้อมูล การวิเคราะห์ตัวเลขและข้อความ การตีความสารสนเทศ และการใช้ข้อมูลอิงฐานความจริงในการทำงาน</w:t>
       </w:r>
     </w:p>
     <w:p>
@@ -596,7 +596,7 @@
           <w:color w:val="334155"/>
           <w:sz w:val="19"/>
         </w:rPr>
-        <w:t xml:space="preserve">   - บทเรียนย่อยที่ 4.1 (15 นาที): [post#13196] การแก้ปัญหาที่ซับซ้อน: การวิเคราะห์หาสาเหตุที่แท้จริง * (Complex Problem-Solving: Root Cause Analysis)</w:t>
+        <w:t xml:space="preserve">   - บทเรียนย่อยที่ 4.1 (15 นาที): [post#9044] การวิเคราะห์ข้อมูลเชิงคุณภาพและเชิงปริมาณ * (Qualitative &amp; Quantitative Data Analysis)</w:t>
       </w:r>
     </w:p>
     <w:p>
@@ -612,7 +612,7 @@
           <w:color w:val="334155"/>
           <w:sz w:val="19"/>
         </w:rPr>
-        <w:t xml:space="preserve">   - บทเรียนย่อยที่ 4.2 (15 นาที): [post#3027] ทำความเข้าใจสาเหตุที่ปิดการขายไม่ได้ * (Understand Why Deals are Lost)</w:t>
+        <w:t xml:space="preserve">   - บทเรียนย่อยที่ 4.2 (15 นาที): [post#9045] เทคนิคการวิเคราะห์ข้อมูลเชิงอนุมานและเชิงคาดการณ์ * (Inferential and Predictive Data Analysis Techniques)</w:t>
       </w:r>
     </w:p>
     <w:p>
@@ -628,7 +628,7 @@
           <w:color w:val="334155"/>
           <w:sz w:val="19"/>
         </w:rPr>
-        <w:t xml:space="preserve">   - บทเรียนย่อยที่ 4.3 (15 นาที): [post#1294] การค้นหาข้อมูลและวิเคราะห์ผู้มีโอกาสเป็นลูกค้า * (Researching Your Prospect)</w:t>
+        <w:t xml:space="preserve">   - บทเรียนย่อยที่ 4.3 (15 นาที): [post#7476] ความเป็นเจ้าของข้อมูล: ความสำคัญของความถูกต้องของข้อมูล * (Data Ownership: The Importance of Data Accuracy)</w:t>
       </w:r>
     </w:p>
     <w:p>
@@ -644,7 +644,7 @@
           <w:color w:val="334155"/>
           <w:sz w:val="19"/>
         </w:rPr>
-        <w:t xml:space="preserve">   - บทเรียนย่อยที่ 4.4 (15 นาที): [post#1519] ความเท่าเทียมและความหลากหลาย * (Equality and Diversity)</w:t>
+        <w:t xml:space="preserve">   - บทเรียนย่อยที่ 4.4 (15 นาที): [post#13196] การแก้ปัญหาที่ซับซ้อน: การวิเคราะห์หาสาเหตุที่แท้จริง * (Complex Problem-Solving: Root Cause Analysis)</w:t>
       </w:r>
     </w:p>
     <w:p>
@@ -660,7 +660,7 @@
           <w:color w:val="0369A1"/>
           <w:sz w:val="25"/>
         </w:rPr>
-        <w:t>[OP-SUBJECT-05] วิชาที่ 5: การรับมือความไม่แน่นอนและการทำงานร่วมกันยุคใหม่ (1 ชั่วโมง)</w:t>
+        <w:t>[OP-SUBJECT-05] วิชาที่ 5: การบริหารจัดการตนเองและการรับมือความไม่แน่นอน (1 ชั่วโมง)</w:t>
       </w:r>
     </w:p>
     <w:p>
@@ -676,7 +676,7 @@
           <w:color w:val="047857"/>
           <w:sz w:val="20"/>
         </w:rPr>
-        <w:t>• สอดคล้องทักษะ: การตัดสินใจอย่างรอบคอบ &amp; การมองหาโอกาส</w:t>
+        <w:t>• สอดคล้องทักษะ: การบริหารและการจัดการ &amp; การพัฒนาตนเอง</w:t>
         <w:br/>
         <w:t>• โครงสร้าง: วิชาหลัก 1 ชั่วโมง (รวม 4 บทเรียนย่อย บทเรียนละ 15 นาที)</w:t>
       </w:r>
@@ -694,7 +694,7 @@
           <w:color w:val="334155"/>
           <w:sz w:val="20"/>
         </w:rPr>
-        <w:t>วัตถุประสงค์: สร้างความยืดหยุ่นในการทำงาน การรับมือกับสภาวะเปลี่ยนแปลง และการสื่อสารตัดสินใจร่วมกันในทีมอย่างมีประสิทธิภาพ</w:t>
+        <w:t>วัตถุประสงค์: เสริมสร้างทักษะ Resilience การบริหารอารมณ์ การรับมือสภาวะความไม่แน่นอน และการปรับตัวรับการเปลี่ยนแปลงยุคใหม่</w:t>
       </w:r>
     </w:p>
     <w:p>
@@ -758,7 +758,7 @@
           <w:color w:val="334155"/>
           <w:sz w:val="19"/>
         </w:rPr>
-        <w:t xml:space="preserve">   - บทเรียนย่อยที่ 5.3 (15 นาที): [post#13194] การแก้ปัญหาที่ซับซ้อน: การคิดเชิงระบบ * (Complex Problem-Solving: Systems Thinking)</w:t>
+        <w:t xml:space="preserve">   - บทเรียนย่อยที่ 5.3 (15 นาที): [post#1597] ผลประโยชน์ทับซ้อน * (Conflict of Interest)</w:t>
       </w:r>
     </w:p>
     <w:p>
@@ -774,7 +774,7 @@
           <w:color w:val="334155"/>
           <w:sz w:val="19"/>
         </w:rPr>
-        <w:t xml:space="preserve">   - บทเรียนย่อยที่ 5.4 (15 นาที): [post#1841] การหยุดชะงักทางดิจิทัล (Digital Disruption) * (Digital Disruption)</w:t>
+        <w:t xml:space="preserve">   - บทเรียนย่อยที่ 5.4 (15 นาที): [post#11575] การสอบสวนอุบัติการณ์ * (Incident Investigation)</w:t>
       </w:r>
     </w:p>
     <w:p>
@@ -811,7 +811,7 @@
           <w:color w:val="0369A1"/>
           <w:sz w:val="25"/>
         </w:rPr>
-        <w:t>[EXEC-SUBJECT-01] วิชาที่ 1: การนำองค์กรและภาวะผู้นำในยุคปัญญาประดิษฐ์ (1 ชั่วโมง)</w:t>
+        <w:t>[EXEC-SUBJECT-01] วิชาที่ 1: ภาวะผู้นำและการนำองค์กรในยุคปัญญาประดิษฐ์ (1 ชั่วโมง)</w:t>
       </w:r>
     </w:p>
     <w:p>
@@ -827,7 +827,7 @@
           <w:color w:val="047857"/>
           <w:sz w:val="20"/>
         </w:rPr>
-        <w:t>• สอดคล้องทักษะ: การบูรณาการทำงานด้วยเทคโนโลยีดิจิทัล &amp; การมองหาโอกาส</w:t>
+        <w:t>• สอดคล้องทักษะ: การบริหารและการจัดการ &amp; เทคโนโลยีและ AI</w:t>
         <w:br/>
         <w:t>• โครงสร้าง: วิชาหลัก 1 ชั่วโมง (รวม 4 บทเรียนย่อย บทเรียนละ 15 นาที)</w:t>
       </w:r>
@@ -845,7 +845,7 @@
           <w:color w:val="334155"/>
           <w:sz w:val="20"/>
         </w:rPr>
-        <w:t>วัตถุประสงค์: มุ่งเน้นการสร้างความเข้าใจเชิงนโยบายเกี่ยวกับ AI การวางยุทธศาสตร์ปัญญาประดิษฐ์ ธรรมาภิบาลข้อมูล และการนำองค์กรในยุค AI</w:t>
+        <w:t>วัตถุประสงค์: มุ่งเน้นการสร้างวิสัยทัศน์ผู้บริหาร ธรรมาภิบาลปัญญาประดิษฐ์ การบริหารการลงทุน AI และการกำหนดทิศทางองค์กรยุคดิจิทัล</w:t>
       </w:r>
     </w:p>
     <w:p>
@@ -893,7 +893,7 @@
           <w:color w:val="334155"/>
           <w:sz w:val="19"/>
         </w:rPr>
-        <w:t xml:space="preserve">   - บทเรียนย่อยที่ 1.2 (15 นาที): [post#14240] การปรับตัวรับความเปลี่ยนแปลงในยุค AI * (Adapting to Change in the Age of AI)</w:t>
+        <w:t xml:space="preserve">   - บทเรียนย่อยที่ 1.2 (15 นาที): [post#3548] จริยธรรมกับปัญญาประดิษฐ์ (AI) * (Ethics and Artificial Intelligence)</w:t>
       </w:r>
     </w:p>
     <w:p>
@@ -941,7 +941,7 @@
           <w:color w:val="0369A1"/>
           <w:sz w:val="25"/>
         </w:rPr>
-        <w:t>[EXEC-SUBJECT-02] วิชาที่ 2: การวางแผนกลยุทธ์ตามสถานการณ์และการตัดสินใจเชิงบริหาร (1 ชั่วโมง)</w:t>
+        <w:t>[EXEC-SUBJECT-02] วิชาที่ 2: การพัฒนาทีมและสร้างวัฒนธรรมองค์กรแห่งอนาคต (1 ชั่วโมง)</w:t>
       </w:r>
     </w:p>
     <w:p>
@@ -957,7 +957,7 @@
           <w:color w:val="047857"/>
           <w:sz w:val="20"/>
         </w:rPr>
-        <w:t>• สอดคล้องทักษะ: การตัดสินใจอย่างรอบคอบ</w:t>
+        <w:t>• สอดคล้องทักษะ: การพัฒนาทีม &amp; การบริหารและการจัดการ</w:t>
         <w:br/>
         <w:t>• โครงสร้าง: วิชาหลัก 1 ชั่วโมง (รวม 4 บทเรียนย่อย บทเรียนละ 15 นาที)</w:t>
       </w:r>
@@ -975,7 +975,7 @@
           <w:color w:val="334155"/>
           <w:sz w:val="20"/>
         </w:rPr>
-        <w:t>วัตถุประสงค์: สร้างทักษะการจำลองแบบฉากทัศน์ในอนาคต (Scenario Planning) การตัดสินใจกลยุทธ์ในสภาวะซับซ้อน และการบริหารความเสี่ยงระดับสูง</w:t>
+        <w:t>วัตถุประสงค์: การนำการเปลี่ยนแปลงในระดับโครงสร้าง การบริหารจัดการความขัดแย้ง การสร้างความผูกพันและวัฒนธรรมองค์กรที่ยืดหยุ่น</w:t>
       </w:r>
     </w:p>
     <w:p>
@@ -1007,7 +1007,7 @@
           <w:color w:val="334155"/>
           <w:sz w:val="19"/>
         </w:rPr>
-        <w:t xml:space="preserve">   - บทเรียนย่อยที่ 2.1 (15 นาที): [post#13156] การแก้ปัญหาที่ซับซ้อน: การวางแผนและการวิเคราะห์สถานการณ์จำลอง * (Complex Problem-Solving: Scenario Planning and Analysis)</w:t>
+        <w:t xml:space="preserve">   - บทเรียนย่อยที่ 2.1 (15 นาที): [post#2038] ผลกระทบของการฝึกอบรมต่อการเปลี่ยนแปลงทางดิจิทัล * (The Impact of Training on Digital Change)</w:t>
       </w:r>
     </w:p>
     <w:p>
@@ -1023,7 +1023,7 @@
           <w:color w:val="334155"/>
           <w:sz w:val="19"/>
         </w:rPr>
-        <w:t xml:space="preserve">   - บทเรียนย่อยที่ 2.2 (15 นาที): [post#13194] การแก้ปัญหาที่ซับซ้อน: การคิดเชิงระบบ * (Complex Problem-Solving: Systems Thinking)</w:t>
+        <w:t xml:space="preserve">   - บทเรียนย่อยที่ 2.2 (15 นาที): [post#7780] การบริหารจัดการผู้รับเหมา * (Contractor Management)</w:t>
       </w:r>
     </w:p>
     <w:p>
@@ -1039,7 +1039,7 @@
           <w:color w:val="334155"/>
           <w:sz w:val="19"/>
         </w:rPr>
-        <w:t xml:space="preserve">   - บทเรียนย่อยที่ 2.3 (15 นาที): [post#13196] การแก้ปัญหาที่ซับซ้อน: การวิเคราะห์หาสาเหตุที่แท้จริง * (Complex Problem-Solving: Root Cause Analysis)</w:t>
+        <w:t xml:space="preserve">   - บทเรียนย่อยที่ 2.3 (15 นาที): [post#7503] การแจ้งเบาะแสการกระทำผิด - ภาคธุรกิจ * (Whistleblowing - The Business Version)</w:t>
       </w:r>
     </w:p>
     <w:p>
@@ -1055,7 +1055,7 @@
           <w:color w:val="334155"/>
           <w:sz w:val="19"/>
         </w:rPr>
-        <w:t xml:space="preserve">   - บทเรียนย่อยที่ 2.4 (15 นาที): [post#1284] การรับมือกับความไม่แน่นอน * (Dealing with Uncertainty)</w:t>
+        <w:t xml:space="preserve">   - บทเรียนย่อยที่ 2.4 (15 นาที): [post#7487] การจัดการการปฏิบัติตามข้อกำหนดในห่วงโซ่อุปทาน * (Managing Supply Chain Compliance)</w:t>
       </w:r>
     </w:p>
     <w:p>
@@ -1071,7 +1071,7 @@
           <w:color w:val="0369A1"/>
           <w:sz w:val="25"/>
         </w:rPr>
-        <w:t>[EXEC-SUBJECT-03] วิชาที่ 3: ขุมพลัง Big Data และการบริหารจัดการองค์กรด้วยข้อมูลเชิงกลยุทธ์ (1 ชั่วโมง)</w:t>
+        <w:t>[EXEC-SUBJECT-03] วิชาที่ 3: การบริหารจัดการและตัดสินใจด้วยขุมพลัง Big Data (1 ชั่วโมง)</w:t>
       </w:r>
     </w:p>
     <w:p>
@@ -1087,7 +1087,7 @@
           <w:color w:val="047857"/>
           <w:sz w:val="20"/>
         </w:rPr>
-        <w:t>• สอดคล้องทักษะ: บริหารงานด้วยข้อมูล &amp; การตัดสินใจอย่างรอบคอบ</w:t>
+        <w:t>• สอดคล้องทักษะ: การวิเคราะห์และตัดสินใจด้วยข้อมูล</w:t>
         <w:br/>
         <w:t>• โครงสร้าง: วิชาหลัก 1 ชั่วโมง (รวม 4 บทเรียนย่อย บทเรียนละ 15 นาที)</w:t>
       </w:r>
@@ -1105,7 +1105,7 @@
           <w:color w:val="334155"/>
           <w:sz w:val="20"/>
         </w:rPr>
-        <w:t>วัตถุประสงค์: เสริมสร้างวิสัยทัศน์ผู้บริหารในการใช้ Big Data การวิเคราะห์คาดการณ์ล่วงหน้า และการกำหนดนโยบายโดยใช้วิทยาการข้อมูลเป็นฐาน</w:t>
+        <w:t>วัตถุประสงค์: การใช้ประโยชน์จาก Big Data ในการกำหนดนโยบายกลยุทธ์ การวิเคราะห์แบบคาดการณ์เชิงรุก และการตัดสินใจบนฐานวิทยาการข้อมูล</w:t>
       </w:r>
     </w:p>
     <w:p>
@@ -1185,7 +1185,7 @@
           <w:color w:val="334155"/>
           <w:sz w:val="19"/>
         </w:rPr>
-        <w:t xml:space="preserve">   - บทเรียนย่อยที่ 3.4 (15 นาที): [post#10895] การใช้ข้อมูลในการบริการลูกค้า * (Using Data in Customer Service)</w:t>
+        <w:t xml:space="preserve">   - บทเรียนย่อยที่ 3.4 (15 นาที): [post#7476] ความเป็นเจ้าของข้อมูล: ความสำคัญของความถูกต้องของข้อมูล * (Data Ownership: The Importance of Data Accuracy)</w:t>
       </w:r>
     </w:p>
     <w:p>
@@ -1201,7 +1201,7 @@
           <w:color w:val="0369A1"/>
           <w:sz w:val="25"/>
         </w:rPr>
-        <w:t>[EXEC-SUBJECT-04] วิชาที่ 4: การจัดทำกลยุทธ์ Digital Transformation และการสร้างนวัตกรรม (1 ชั่วโมง)</w:t>
+        <w:t>[EXEC-SUBJECT-04] วิชาที่ 4: การวางแผนกลยุทธ์และการตัดสินใจในสภาวะซับซ้อน (1 ชั่วโมง)</w:t>
       </w:r>
     </w:p>
     <w:p>
@@ -1217,7 +1217,7 @@
           <w:color w:val="047857"/>
           <w:sz w:val="20"/>
         </w:rPr>
-        <w:t>• สอดคล้องทักษะ: การมองหาโอกาสและสร้างความแตกต่าง &amp; การบูรณาการดิจิทัล</w:t>
+        <w:t>• สอดคล้องทักษะ: การบริหารและการจัดการ &amp; การวิเคราะห์และตัดสินใจด้วยข้อมูล</w:t>
         <w:br/>
         <w:t>• โครงสร้าง: วิชาหลัก 1 ชั่วโมง (รวม 4 บทเรียนย่อย บทเรียนละ 15 นาที)</w:t>
       </w:r>
@@ -1235,7 +1235,7 @@
           <w:color w:val="334155"/>
           <w:sz w:val="20"/>
         </w:rPr>
-        <w:t>วัตถุประสงค์: การวางโรดแมปการปรับเปลี่ยนองค์กรดิจิทัล การรื้อปรับกระบวนการทำงานเพื่อสร้างความแตกต่าง และการขับเคลื่อนนวัตกรรมเชิงรุก</w:t>
+        <w:t>วัตถุประสงค์: การจำลองแบบฉากทัศน์ทางเลือก (Scenario Planning) การคิดเชิงระบบ และการตัดสินใจทางกลยุทธ์ภายใต้ความไม่แน่นอน</w:t>
       </w:r>
     </w:p>
     <w:p>
@@ -1267,7 +1267,7 @@
           <w:color w:val="334155"/>
           <w:sz w:val="19"/>
         </w:rPr>
-        <w:t xml:space="preserve">   - บทเรียนย่อยที่ 4.1 (15 นาที): [post#1800] กลยุทธ์การเปลี่ยนผ่านสู่ยุคดิจิทัลคืออะไร * (What is a Digital Transformation Strategy?)</w:t>
+        <w:t xml:space="preserve">   - บทเรียนย่อยที่ 4.1 (15 นาที): [post#13156] การแก้ปัญหาที่ซับซ้อน: การวางแผนและการวิเคราะห์สถานการณ์จำลอง * (Complex Problem-Solving: Scenario Planning and Analysis)</w:t>
       </w:r>
     </w:p>
     <w:p>
@@ -1283,7 +1283,7 @@
           <w:color w:val="334155"/>
           <w:sz w:val="19"/>
         </w:rPr>
-        <w:t xml:space="preserve">   - บทเรียนย่อยที่ 4.2 (15 นาที): [post#2038] ผลกระทบของการฝึกอบรมต่อการเปลี่ยนแปลงทางดิจิทัล * (The Impact of Training on Digital Change)</w:t>
+        <w:t xml:space="preserve">   - บทเรียนย่อยที่ 4.2 (15 นาที): [post#13194] การแก้ปัญหาที่ซับซ้อน: การคิดเชิงระบบ * (Complex Problem-Solving: Systems Thinking)</w:t>
       </w:r>
     </w:p>
     <w:p>
@@ -1299,7 +1299,7 @@
           <w:color w:val="334155"/>
           <w:sz w:val="19"/>
         </w:rPr>
-        <w:t xml:space="preserve">   - บทเรียนย่อยที่ 4.3 (15 นาที): [post#10330] เครื่องมือเทคโนโลยีเพื่อการขาย * (Sales Tech Tools)</w:t>
+        <w:t xml:space="preserve">   - บทเรียนย่อยที่ 4.3 (15 นาที): [post#13196] การแก้ปัญหาที่ซับซ้อน: การวิเคราะห์หาสาเหตุที่แท้จริง * (Complex Problem-Solving: Root Cause Analysis)</w:t>
       </w:r>
     </w:p>
     <w:p>
@@ -1315,7 +1315,7 @@
           <w:color w:val="334155"/>
           <w:sz w:val="19"/>
         </w:rPr>
-        <w:t xml:space="preserve">   - บทเรียนย่อยที่ 4.4 (15 นาที): [post#3027] ทำความเข้าใจสาเหตุที่ปิดการขายไม่ได้ * (Understand Why Deals are Lost)</w:t>
+        <w:t xml:space="preserve">   - บทเรียนย่อยที่ 4.4 (15 นาที): [post#1284] การรับมือกับความไม่แน่นอน * (Dealing with Uncertainty)</w:t>
       </w:r>
     </w:p>
     <w:p>
@@ -1331,7 +1331,7 @@
           <w:color w:val="0369A1"/>
           <w:sz w:val="25"/>
         </w:rPr>
-        <w:t>[EXEC-SUBJECT-05] วิชาที่ 5: การนำการเปลี่ยนแปลงและสร้างวัฒนธรรมองค์กรแห่งอนาคต (1 ชั่วโมง)</w:t>
+        <w:t>[EXEC-SUBJECT-05] วิชาที่ 5: การพัฒนาศักยภาพตนเองและการเรียนรู้เชิงลึกทางเทคโนโลยี (1 ชั่วโมง)</w:t>
       </w:r>
     </w:p>
     <w:p>
@@ -1347,7 +1347,7 @@
           <w:color w:val="047857"/>
           <w:sz w:val="20"/>
         </w:rPr>
-        <w:t>• สอดคล้องทักษะ: การมองหาโอกาสและสร้างความแตกต่าง</w:t>
+        <w:t>• สอดคล้องทักษะ: การพัฒนาตนเอง &amp; เทคโนโลยีและ AI</w:t>
         <w:br/>
         <w:t>• โครงสร้าง: วิชาหลัก 1 ชั่วโมง (รวม 4 บทเรียนย่อย บทเรียนละ 15 นาที)</w:t>
       </w:r>
@@ -1365,7 +1365,7 @@
           <w:color w:val="334155"/>
           <w:sz w:val="20"/>
         </w:rPr>
-        <w:t>วัตถุประสงค์: การสร้างวัฒนธรรมองค์กรที่ยืดหยุ่น (Agile &amp; Adaptive Culture) การนำการเปลี่ยนแปลงในภาวะวิกฤต และการบริหารจัดการผู้มีส่วนได้ส่วนเสีย</w:t>
+        <w:t>วัตถุประสงค์: การพัฒนาทักษะตนเองขั้นสูงของผู้บริหาร การทำความเข้าใจโครงข่าย AI เชิงลึก (Machine Learning) และการนำนวัตกรรมมาขับเคลื่อนองค์กร</w:t>
       </w:r>
     </w:p>
     <w:p>
@@ -1397,7 +1397,7 @@
           <w:color w:val="334155"/>
           <w:sz w:val="19"/>
         </w:rPr>
-        <w:t xml:space="preserve">   - บทเรียนย่อยที่ 5.1 (15 นาที): [post#1841] การหยุดชะงักทางดิจิทัล (Digital Disruption) * (Digital Disruption)</w:t>
+        <w:t xml:space="preserve">   - บทเรียนย่อยที่ 5.1 (15 นาที): [post#3490] Machine Learning (การเรียนรู้ของเครื่อง) คืออะไร * (What is Machine Learning?)</w:t>
       </w:r>
     </w:p>
     <w:p>
@@ -1413,7 +1413,7 @@
           <w:color w:val="334155"/>
           <w:sz w:val="19"/>
         </w:rPr>
-        <w:t xml:space="preserve">   - บทเรียนย่อยที่ 5.2 (15 นาที): [post#14201] การคิดเชิงวิพากษ์ในยุค AI * (Critical Thinking in the Age of AI)</w:t>
+        <w:t xml:space="preserve">   - บทเรียนย่อยที่ 5.2 (15 นาที): [post#3552] การเรียนรู้เชิงลึกแบบเสริมกำลัง * (Deep Reinforcement Learning)</w:t>
       </w:r>
     </w:p>
     <w:p>
@@ -1429,7 +1429,7 @@
           <w:color w:val="334155"/>
           <w:sz w:val="19"/>
         </w:rPr>
-        <w:t xml:space="preserve">   - บทเรียนย่อยที่ 5.3 (15 นาที): [post#1519] ความเท่าเทียมและความหลากหลาย * (Equality and Diversity)</w:t>
+        <w:t xml:space="preserve">   - บทเรียนย่อยที่ 5.3 (15 นาที): [post#14240] การปรับตัวรับความเปลี่ยนแปลงในยุค AI * (Adapting to Change in the Age of AI)</w:t>
       </w:r>
     </w:p>
     <w:p>
@@ -1445,7 +1445,7 @@
           <w:color w:val="334155"/>
           <w:sz w:val="19"/>
         </w:rPr>
-        <w:t xml:space="preserve">   - บทเรียนย่อยที่ 5.4 (15 นาที): [post#13187] การแก้ปัญหาที่ซับซ้อน: เทคนิคการแก้ปัญหา * (Complex Problem-Solving: Problem-Solving Techniques)</w:t>
+        <w:t xml:space="preserve">   - บทเรียนย่อยที่ 5.4 (15 นาที): [post#14201] การคิดเชิงวิพากษ์ในยุค AI * (Critical Thinking in the Age of AI)</w:t>
       </w:r>
     </w:p>
     <w:p>

</xml_diff>